<commit_message>
docs: cambios en README y FUENTES
</commit_message>
<xml_diff>
--- a/informe/Informe_TPGrupal_Mundial_2026.docx
+++ b/informe/Informe_TPGrupal_Mundial_2026.docx
@@ -169,7 +169,7 @@
     <w:p/>
     <w:tbl>
       <w:tblPr>
-        <w:tblStyle w:val="Tablaconcuadrculaclara"/>
+        <w:tblStyle w:val="TableGridLight"/>
         <w:tblpPr w:leftFromText="141" w:rightFromText="141" w:vertAnchor="text" w:horzAnchor="margin" w:tblpXSpec="center" w:tblpY="52"/>
         <w:tblW w:w="0" w:type="auto"/>
         <w:tblLook w:val="04A0" w:firstRow="1" w:lastRow="0" w:firstColumn="1" w:lastColumn="0" w:noHBand="0" w:noVBand="1"/>
@@ -353,30 +353,74 @@
       <w:hyperlink r:id="rId8" w:history="1">
         <w:r>
           <w:rPr>
-            <w:rStyle w:val="Hipervnculo"/>
+            <w:rStyle w:val="Hyperlink"/>
           </w:rPr>
           <w:t>https://github.com/gleo1973/tp-laboratorio-mcag-1c2026</w:t>
         </w:r>
       </w:hyperlink>
+    </w:p>
+    <w:p>
+      <w:pPr>
+        <w:spacing w:line="240" w:lineRule="auto"/>
+        <w:jc w:val="center"/>
+        <w:rPr>
+          <w:lang w:val="en-US"/>
+        </w:rPr>
+      </w:pPr>
+      <w:r>
+        <w:rPr>
+          <w:lang w:val="en-US"/>
+        </w:rPr>
+        <w:t xml:space="preserve">Web url: </w:t>
+      </w:r>
+      <w:hyperlink r:id="rId9" w:history="1">
+        <w:r>
+          <w:rPr>
+            <w:rStyle w:val="Hyperlink"/>
+            <w:lang w:val="en-US"/>
+          </w:rPr>
+          <w:t>https://gleo1973.github.io/tp-laboratorio-mcag-1c2026/</w:t>
+        </w:r>
+      </w:hyperlink>
+    </w:p>
+    <w:p>
+      <w:pPr>
+        <w:spacing w:line="240" w:lineRule="auto"/>
+        <w:jc w:val="center"/>
+        <w:rPr>
+          <w:lang w:val="en-US"/>
+        </w:rPr>
+      </w:pPr>
     </w:p>
     <w:p>
       <w:pPr>
         <w:spacing w:line="240" w:lineRule="auto"/>
         <w:jc w:val="left"/>
+        <w:rPr>
+          <w:lang w:val="en-US"/>
+        </w:rPr>
       </w:pPr>
     </w:p>
     <w:p>
       <w:pPr>
         <w:spacing w:line="240" w:lineRule="auto"/>
         <w:jc w:val="left"/>
-      </w:pPr>
-      <w:r>
+        <w:rPr>
+          <w:lang w:val="en-US"/>
+        </w:rPr>
+      </w:pPr>
+      <w:r>
+        <w:rPr>
+          <w:lang w:val="en-US"/>
+        </w:rPr>
         <w:br w:type="page"/>
       </w:r>
     </w:p>
     <w:sdt>
       <w:sdtPr>
         <w:rPr>
+          <w:rFonts w:ascii="Georgia" w:eastAsia="Georgia" w:hAnsi="Georgia" w:cs="Georgia"/>
+          <w:color w:val="auto"/>
           <w:sz w:val="28"/>
           <w:szCs w:val="28"/>
           <w:lang w:val="es-ES"/>
@@ -389,10 +433,8 @@
       </w:sdtPr>
       <w:sdtEndPr>
         <w:rPr>
-          <w:rFonts w:ascii="Georgia" w:eastAsia="Georgia" w:hAnsi="Georgia" w:cs="Georgia"/>
           <w:b/>
           <w:bCs/>
-          <w:color w:val="auto"/>
           <w:sz w:val="20"/>
           <w:szCs w:val="20"/>
         </w:rPr>
@@ -400,7 +442,7 @@
       <w:sdtContent>
         <w:p>
           <w:pPr>
-            <w:pStyle w:val="TtuloTDC"/>
+            <w:pStyle w:val="TOCHeading"/>
             <w:rPr>
               <w:rFonts w:ascii="Georgia" w:hAnsi="Georgia"/>
               <w:b/>
@@ -408,6 +450,7 @@
               <w:color w:val="auto"/>
               <w:sz w:val="24"/>
               <w:szCs w:val="24"/>
+              <w:lang w:val="en-US"/>
             </w:rPr>
           </w:pPr>
           <w:r>
@@ -418,14 +461,14 @@
               <w:color w:val="auto"/>
               <w:sz w:val="24"/>
               <w:szCs w:val="24"/>
-              <w:lang w:val="es-ES"/>
+              <w:lang w:val="en-US"/>
             </w:rPr>
             <w:t>Índice</w:t>
           </w:r>
         </w:p>
         <w:p>
           <w:pPr>
-            <w:pStyle w:val="TDC1"/>
+            <w:pStyle w:val="TOC1"/>
             <w:tabs>
               <w:tab w:val="left" w:pos="480"/>
               <w:tab w:val="right" w:leader="dot" w:pos="9350"/>
@@ -461,7 +504,7 @@
           <w:hyperlink w:anchor="_Toc231472765" w:history="1">
             <w:r>
               <w:rPr>
-                <w:rStyle w:val="Hipervnculo"/>
+                <w:rStyle w:val="Hyperlink"/>
                 <w:noProof/>
                 <w:sz w:val="20"/>
                 <w:szCs w:val="20"/>
@@ -479,7 +522,7 @@
             </w:r>
             <w:r>
               <w:rPr>
-                <w:rStyle w:val="Hipervnculo"/>
+                <w:rStyle w:val="Hyperlink"/>
                 <w:noProof/>
                 <w:sz w:val="20"/>
                 <w:szCs w:val="20"/>
@@ -552,7 +595,7 @@
         </w:p>
         <w:p>
           <w:pPr>
-            <w:pStyle w:val="TDC1"/>
+            <w:pStyle w:val="TOC1"/>
             <w:tabs>
               <w:tab w:val="left" w:pos="480"/>
               <w:tab w:val="right" w:leader="dot" w:pos="9350"/>
@@ -567,7 +610,7 @@
           <w:hyperlink w:anchor="_Toc231472766" w:history="1">
             <w:r>
               <w:rPr>
-                <w:rStyle w:val="Hipervnculo"/>
+                <w:rStyle w:val="Hyperlink"/>
                 <w:noProof/>
                 <w:sz w:val="20"/>
                 <w:szCs w:val="20"/>
@@ -585,7 +628,7 @@
             </w:r>
             <w:r>
               <w:rPr>
-                <w:rStyle w:val="Hipervnculo"/>
+                <w:rStyle w:val="Hyperlink"/>
                 <w:noProof/>
                 <w:sz w:val="20"/>
                 <w:szCs w:val="20"/>
@@ -658,7 +701,7 @@
         </w:p>
         <w:p>
           <w:pPr>
-            <w:pStyle w:val="TDC1"/>
+            <w:pStyle w:val="TOC1"/>
             <w:tabs>
               <w:tab w:val="left" w:pos="480"/>
               <w:tab w:val="right" w:leader="dot" w:pos="9350"/>
@@ -673,7 +716,7 @@
           <w:hyperlink w:anchor="_Toc231472767" w:history="1">
             <w:r>
               <w:rPr>
-                <w:rStyle w:val="Hipervnculo"/>
+                <w:rStyle w:val="Hyperlink"/>
                 <w:noProof/>
                 <w:sz w:val="20"/>
                 <w:szCs w:val="20"/>
@@ -691,7 +734,7 @@
             </w:r>
             <w:r>
               <w:rPr>
-                <w:rStyle w:val="Hipervnculo"/>
+                <w:rStyle w:val="Hyperlink"/>
                 <w:noProof/>
                 <w:sz w:val="20"/>
                 <w:szCs w:val="20"/>
@@ -764,7 +807,7 @@
         </w:p>
         <w:p>
           <w:pPr>
-            <w:pStyle w:val="TDC2"/>
+            <w:pStyle w:val="TOC2"/>
             <w:tabs>
               <w:tab w:val="left" w:pos="960"/>
               <w:tab w:val="right" w:leader="dot" w:pos="9350"/>
@@ -779,7 +822,7 @@
           <w:hyperlink w:anchor="_Toc231472768" w:history="1">
             <w:r>
               <w:rPr>
-                <w:rStyle w:val="Hipervnculo"/>
+                <w:rStyle w:val="Hyperlink"/>
                 <w:noProof/>
                 <w:sz w:val="20"/>
                 <w:szCs w:val="20"/>
@@ -797,7 +840,7 @@
             </w:r>
             <w:r>
               <w:rPr>
-                <w:rStyle w:val="Hipervnculo"/>
+                <w:rStyle w:val="Hyperlink"/>
                 <w:noProof/>
                 <w:sz w:val="20"/>
                 <w:szCs w:val="20"/>
@@ -870,7 +913,7 @@
         </w:p>
         <w:p>
           <w:pPr>
-            <w:pStyle w:val="TDC1"/>
+            <w:pStyle w:val="TOC1"/>
             <w:tabs>
               <w:tab w:val="left" w:pos="480"/>
               <w:tab w:val="right" w:leader="dot" w:pos="9350"/>
@@ -885,7 +928,7 @@
           <w:hyperlink w:anchor="_Toc231472769" w:history="1">
             <w:r>
               <w:rPr>
-                <w:rStyle w:val="Hipervnculo"/>
+                <w:rStyle w:val="Hyperlink"/>
                 <w:noProof/>
                 <w:sz w:val="20"/>
                 <w:szCs w:val="20"/>
@@ -903,7 +946,7 @@
             </w:r>
             <w:r>
               <w:rPr>
-                <w:rStyle w:val="Hipervnculo"/>
+                <w:rStyle w:val="Hyperlink"/>
                 <w:noProof/>
                 <w:sz w:val="20"/>
                 <w:szCs w:val="20"/>
@@ -976,7 +1019,7 @@
         </w:p>
         <w:p>
           <w:pPr>
-            <w:pStyle w:val="TDC2"/>
+            <w:pStyle w:val="TOC2"/>
             <w:tabs>
               <w:tab w:val="left" w:pos="960"/>
               <w:tab w:val="right" w:leader="dot" w:pos="9350"/>
@@ -991,7 +1034,7 @@
           <w:hyperlink w:anchor="_Toc231472770" w:history="1">
             <w:r>
               <w:rPr>
-                <w:rStyle w:val="Hipervnculo"/>
+                <w:rStyle w:val="Hyperlink"/>
                 <w:noProof/>
                 <w:sz w:val="20"/>
                 <w:szCs w:val="20"/>
@@ -1009,7 +1052,7 @@
             </w:r>
             <w:r>
               <w:rPr>
-                <w:rStyle w:val="Hipervnculo"/>
+                <w:rStyle w:val="Hyperlink"/>
                 <w:noProof/>
                 <w:sz w:val="20"/>
                 <w:szCs w:val="20"/>
@@ -1082,7 +1125,7 @@
         </w:p>
         <w:p>
           <w:pPr>
-            <w:pStyle w:val="TDC2"/>
+            <w:pStyle w:val="TOC2"/>
             <w:tabs>
               <w:tab w:val="left" w:pos="960"/>
               <w:tab w:val="right" w:leader="dot" w:pos="9350"/>
@@ -1097,7 +1140,7 @@
           <w:hyperlink w:anchor="_Toc231472771" w:history="1">
             <w:r>
               <w:rPr>
-                <w:rStyle w:val="Hipervnculo"/>
+                <w:rStyle w:val="Hyperlink"/>
                 <w:noProof/>
                 <w:sz w:val="20"/>
                 <w:szCs w:val="20"/>
@@ -1115,7 +1158,7 @@
             </w:r>
             <w:r>
               <w:rPr>
-                <w:rStyle w:val="Hipervnculo"/>
+                <w:rStyle w:val="Hyperlink"/>
                 <w:noProof/>
                 <w:sz w:val="20"/>
                 <w:szCs w:val="20"/>
@@ -1188,7 +1231,7 @@
         </w:p>
         <w:p>
           <w:pPr>
-            <w:pStyle w:val="TDC2"/>
+            <w:pStyle w:val="TOC2"/>
             <w:tabs>
               <w:tab w:val="left" w:pos="960"/>
               <w:tab w:val="right" w:leader="dot" w:pos="9350"/>
@@ -1203,7 +1246,7 @@
           <w:hyperlink w:anchor="_Toc231472772" w:history="1">
             <w:r>
               <w:rPr>
-                <w:rStyle w:val="Hipervnculo"/>
+                <w:rStyle w:val="Hyperlink"/>
                 <w:noProof/>
                 <w:sz w:val="20"/>
                 <w:szCs w:val="20"/>
@@ -1221,7 +1264,7 @@
             </w:r>
             <w:r>
               <w:rPr>
-                <w:rStyle w:val="Hipervnculo"/>
+                <w:rStyle w:val="Hyperlink"/>
                 <w:noProof/>
                 <w:sz w:val="20"/>
                 <w:szCs w:val="20"/>
@@ -1294,7 +1337,7 @@
         </w:p>
         <w:p>
           <w:pPr>
-            <w:pStyle w:val="TDC2"/>
+            <w:pStyle w:val="TOC2"/>
             <w:tabs>
               <w:tab w:val="left" w:pos="960"/>
               <w:tab w:val="right" w:leader="dot" w:pos="9350"/>
@@ -1309,7 +1352,7 @@
           <w:hyperlink w:anchor="_Toc231472773" w:history="1">
             <w:r>
               <w:rPr>
-                <w:rStyle w:val="Hipervnculo"/>
+                <w:rStyle w:val="Hyperlink"/>
                 <w:noProof/>
                 <w:sz w:val="20"/>
                 <w:szCs w:val="20"/>
@@ -1327,7 +1370,7 @@
             </w:r>
             <w:r>
               <w:rPr>
-                <w:rStyle w:val="Hipervnculo"/>
+                <w:rStyle w:val="Hyperlink"/>
                 <w:noProof/>
                 <w:sz w:val="20"/>
                 <w:szCs w:val="20"/>
@@ -1400,7 +1443,7 @@
         </w:p>
         <w:p>
           <w:pPr>
-            <w:pStyle w:val="TDC1"/>
+            <w:pStyle w:val="TOC1"/>
             <w:tabs>
               <w:tab w:val="left" w:pos="480"/>
               <w:tab w:val="right" w:leader="dot" w:pos="9350"/>
@@ -1415,7 +1458,7 @@
           <w:hyperlink w:anchor="_Toc231472774" w:history="1">
             <w:r>
               <w:rPr>
-                <w:rStyle w:val="Hipervnculo"/>
+                <w:rStyle w:val="Hyperlink"/>
                 <w:noProof/>
                 <w:sz w:val="20"/>
                 <w:szCs w:val="20"/>
@@ -1433,7 +1476,7 @@
             </w:r>
             <w:r>
               <w:rPr>
-                <w:rStyle w:val="Hipervnculo"/>
+                <w:rStyle w:val="Hyperlink"/>
                 <w:noProof/>
                 <w:sz w:val="20"/>
                 <w:szCs w:val="20"/>
@@ -1506,7 +1549,7 @@
         </w:p>
         <w:p>
           <w:pPr>
-            <w:pStyle w:val="TDC1"/>
+            <w:pStyle w:val="TOC1"/>
             <w:tabs>
               <w:tab w:val="left" w:pos="480"/>
               <w:tab w:val="right" w:leader="dot" w:pos="9350"/>
@@ -1521,7 +1564,7 @@
           <w:hyperlink w:anchor="_Toc231472775" w:history="1">
             <w:r>
               <w:rPr>
-                <w:rStyle w:val="Hipervnculo"/>
+                <w:rStyle w:val="Hyperlink"/>
                 <w:noProof/>
                 <w:sz w:val="20"/>
                 <w:szCs w:val="20"/>
@@ -1539,7 +1582,7 @@
             </w:r>
             <w:r>
               <w:rPr>
-                <w:rStyle w:val="Hipervnculo"/>
+                <w:rStyle w:val="Hyperlink"/>
                 <w:noProof/>
                 <w:sz w:val="20"/>
                 <w:szCs w:val="20"/>
@@ -1612,7 +1655,7 @@
         </w:p>
         <w:p>
           <w:pPr>
-            <w:pStyle w:val="TDC1"/>
+            <w:pStyle w:val="TOC1"/>
             <w:tabs>
               <w:tab w:val="right" w:leader="dot" w:pos="9350"/>
             </w:tabs>
@@ -1626,7 +1669,7 @@
           <w:hyperlink w:anchor="_Toc231472776" w:history="1">
             <w:r>
               <w:rPr>
-                <w:rStyle w:val="Hipervnculo"/>
+                <w:rStyle w:val="Hyperlink"/>
                 <w:noProof/>
                 <w:sz w:val="20"/>
                 <w:szCs w:val="20"/>
@@ -1699,7 +1742,7 @@
         </w:p>
         <w:p>
           <w:pPr>
-            <w:pStyle w:val="TDC1"/>
+            <w:pStyle w:val="TOC1"/>
             <w:tabs>
               <w:tab w:val="right" w:leader="dot" w:pos="9350"/>
             </w:tabs>
@@ -1713,7 +1756,7 @@
           <w:hyperlink w:anchor="_Toc231472777" w:history="1">
             <w:r>
               <w:rPr>
-                <w:rStyle w:val="Hipervnculo"/>
+                <w:rStyle w:val="Hyperlink"/>
                 <w:noProof/>
                 <w:sz w:val="20"/>
                 <w:szCs w:val="20"/>
@@ -1806,7 +1849,7 @@
     </w:sdt>
     <w:p>
       <w:pPr>
-        <w:pStyle w:val="Tabladeilustraciones"/>
+        <w:pStyle w:val="TableofFigures"/>
         <w:tabs>
           <w:tab w:val="right" w:leader="dot" w:pos="9350"/>
         </w:tabs>
@@ -1829,7 +1872,7 @@
     </w:p>
     <w:p>
       <w:pPr>
-        <w:pStyle w:val="Tabladeilustraciones"/>
+        <w:pStyle w:val="TableofFigures"/>
         <w:tabs>
           <w:tab w:val="right" w:leader="dot" w:pos="9350"/>
         </w:tabs>
@@ -1863,7 +1906,7 @@
       <w:hyperlink w:anchor="_Toc231472809" w:history="1">
         <w:r>
           <w:rPr>
-            <w:rStyle w:val="Hipervnculo"/>
+            <w:rStyle w:val="Hyperlink"/>
             <w:noProof/>
             <w:sz w:val="20"/>
             <w:szCs w:val="20"/>
@@ -1936,7 +1979,7 @@
     </w:p>
     <w:p>
       <w:pPr>
-        <w:pStyle w:val="Tabladeilustraciones"/>
+        <w:pStyle w:val="TableofFigures"/>
         <w:tabs>
           <w:tab w:val="right" w:leader="dot" w:pos="9350"/>
         </w:tabs>
@@ -1949,7 +1992,7 @@
       <w:hyperlink w:anchor="_Toc231472810" w:history="1">
         <w:r>
           <w:rPr>
-            <w:rStyle w:val="Hipervnculo"/>
+            <w:rStyle w:val="Hyperlink"/>
             <w:noProof/>
             <w:sz w:val="20"/>
             <w:szCs w:val="20"/>
@@ -2022,7 +2065,7 @@
     </w:p>
     <w:p>
       <w:pPr>
-        <w:pStyle w:val="Tabladeilustraciones"/>
+        <w:pStyle w:val="TableofFigures"/>
         <w:tabs>
           <w:tab w:val="right" w:leader="dot" w:pos="9350"/>
         </w:tabs>
@@ -2035,7 +2078,7 @@
       <w:hyperlink w:anchor="_Toc231472811" w:history="1">
         <w:r>
           <w:rPr>
-            <w:rStyle w:val="Hipervnculo"/>
+            <w:rStyle w:val="Hyperlink"/>
             <w:noProof/>
             <w:sz w:val="20"/>
             <w:szCs w:val="20"/>
@@ -2169,7 +2212,7 @@
     </w:p>
     <w:p>
       <w:pPr>
-        <w:pStyle w:val="Tabladeilustraciones"/>
+        <w:pStyle w:val="TableofFigures"/>
         <w:tabs>
           <w:tab w:val="right" w:leader="dot" w:pos="9350"/>
         </w:tabs>
@@ -2184,7 +2227,7 @@
       <w:hyperlink w:anchor="_Toc231472828" w:history="1">
         <w:r>
           <w:rPr>
-            <w:rStyle w:val="Hipervnculo"/>
+            <w:rStyle w:val="Hyperlink"/>
             <w:noProof/>
             <w:sz w:val="20"/>
             <w:szCs w:val="20"/>
@@ -2257,7 +2300,7 @@
     </w:p>
     <w:p>
       <w:pPr>
-        <w:pStyle w:val="Tabladeilustraciones"/>
+        <w:pStyle w:val="TableofFigures"/>
         <w:tabs>
           <w:tab w:val="right" w:leader="dot" w:pos="9350"/>
         </w:tabs>
@@ -2272,7 +2315,7 @@
       <w:hyperlink w:anchor="_Toc231472829" w:history="1">
         <w:r>
           <w:rPr>
-            <w:rStyle w:val="Hipervnculo"/>
+            <w:rStyle w:val="Hyperlink"/>
             <w:noProof/>
             <w:sz w:val="20"/>
             <w:szCs w:val="20"/>
@@ -2345,7 +2388,7 @@
     </w:p>
     <w:p>
       <w:pPr>
-        <w:pStyle w:val="Tabladeilustraciones"/>
+        <w:pStyle w:val="TableofFigures"/>
         <w:tabs>
           <w:tab w:val="right" w:leader="dot" w:pos="9350"/>
         </w:tabs>
@@ -2360,7 +2403,7 @@
       <w:hyperlink w:anchor="_Toc231472830" w:history="1">
         <w:r>
           <w:rPr>
-            <w:rStyle w:val="Hipervnculo"/>
+            <w:rStyle w:val="Hyperlink"/>
             <w:noProof/>
             <w:sz w:val="20"/>
             <w:szCs w:val="20"/>
@@ -2433,7 +2476,7 @@
     </w:p>
     <w:p>
       <w:pPr>
-        <w:pStyle w:val="Tabladeilustraciones"/>
+        <w:pStyle w:val="TableofFigures"/>
         <w:tabs>
           <w:tab w:val="right" w:leader="dot" w:pos="9350"/>
         </w:tabs>
@@ -2448,7 +2491,7 @@
       <w:hyperlink w:anchor="_Toc231472831" w:history="1">
         <w:r>
           <w:rPr>
-            <w:rStyle w:val="Hipervnculo"/>
+            <w:rStyle w:val="Hyperlink"/>
             <w:noProof/>
             <w:sz w:val="20"/>
             <w:szCs w:val="20"/>
@@ -2521,7 +2564,7 @@
     </w:p>
     <w:p>
       <w:pPr>
-        <w:pStyle w:val="Tabladeilustraciones"/>
+        <w:pStyle w:val="TableofFigures"/>
         <w:tabs>
           <w:tab w:val="right" w:leader="dot" w:pos="9350"/>
         </w:tabs>
@@ -2536,7 +2579,7 @@
       <w:hyperlink w:anchor="_Toc231472832" w:history="1">
         <w:r>
           <w:rPr>
-            <w:rStyle w:val="Hipervnculo"/>
+            <w:rStyle w:val="Hyperlink"/>
             <w:noProof/>
             <w:sz w:val="20"/>
             <w:szCs w:val="20"/>
@@ -2609,7 +2652,7 @@
     </w:p>
     <w:p>
       <w:pPr>
-        <w:pStyle w:val="Tabladeilustraciones"/>
+        <w:pStyle w:val="TableofFigures"/>
         <w:tabs>
           <w:tab w:val="right" w:leader="dot" w:pos="9350"/>
         </w:tabs>
@@ -2624,7 +2667,7 @@
       <w:hyperlink w:anchor="_Toc231472833" w:history="1">
         <w:r>
           <w:rPr>
-            <w:rStyle w:val="Hipervnculo"/>
+            <w:rStyle w:val="Hyperlink"/>
             <w:noProof/>
             <w:sz w:val="20"/>
             <w:szCs w:val="20"/>
@@ -2697,7 +2740,7 @@
     </w:p>
     <w:p>
       <w:pPr>
-        <w:pStyle w:val="Tabladeilustraciones"/>
+        <w:pStyle w:val="TableofFigures"/>
         <w:tabs>
           <w:tab w:val="right" w:leader="dot" w:pos="9350"/>
         </w:tabs>
@@ -2712,7 +2755,7 @@
       <w:hyperlink w:anchor="_Toc231472834" w:history="1">
         <w:r>
           <w:rPr>
-            <w:rStyle w:val="Hipervnculo"/>
+            <w:rStyle w:val="Hyperlink"/>
             <w:noProof/>
             <w:sz w:val="20"/>
             <w:szCs w:val="20"/>
@@ -2785,7 +2828,7 @@
     </w:p>
     <w:p>
       <w:pPr>
-        <w:pStyle w:val="Tabladeilustraciones"/>
+        <w:pStyle w:val="TableofFigures"/>
         <w:tabs>
           <w:tab w:val="right" w:leader="dot" w:pos="9350"/>
         </w:tabs>
@@ -2800,7 +2843,7 @@
       <w:hyperlink w:anchor="_Toc231472835" w:history="1">
         <w:r>
           <w:rPr>
-            <w:rStyle w:val="Hipervnculo"/>
+            <w:rStyle w:val="Hyperlink"/>
             <w:noProof/>
             <w:sz w:val="20"/>
             <w:szCs w:val="20"/>
@@ -2873,7 +2916,7 @@
     </w:p>
     <w:p>
       <w:pPr>
-        <w:pStyle w:val="Tabladeilustraciones"/>
+        <w:pStyle w:val="TableofFigures"/>
         <w:tabs>
           <w:tab w:val="right" w:leader="dot" w:pos="9350"/>
         </w:tabs>
@@ -2888,7 +2931,7 @@
       <w:hyperlink w:anchor="_Toc231472836" w:history="1">
         <w:r>
           <w:rPr>
-            <w:rStyle w:val="Hipervnculo"/>
+            <w:rStyle w:val="Hyperlink"/>
             <w:noProof/>
             <w:sz w:val="20"/>
             <w:szCs w:val="20"/>
@@ -2983,7 +3026,7 @@
     </w:p>
     <w:p>
       <w:pPr>
-        <w:pStyle w:val="Ttulo1"/>
+        <w:pStyle w:val="Heading1"/>
       </w:pPr>
       <w:bookmarkStart w:id="0" w:name="_Toc231472765"/>
       <w:r>
@@ -3065,7 +3108,7 @@
     </w:p>
     <w:p>
       <w:pPr>
-        <w:pStyle w:val="Ttulo1"/>
+        <w:pStyle w:val="Heading1"/>
       </w:pPr>
       <w:bookmarkStart w:id="1" w:name="_Toc231472766"/>
       <w:r>
@@ -3261,7 +3304,7 @@
     </w:p>
     <w:p>
       <w:pPr>
-        <w:pStyle w:val="Ttulo1"/>
+        <w:pStyle w:val="Heading1"/>
       </w:pPr>
       <w:bookmarkStart w:id="2" w:name="_Toc231472767"/>
       <w:r>
@@ -3274,7 +3317,7 @@
     </w:p>
     <w:p>
       <w:pPr>
-        <w:pStyle w:val="Ttulo2"/>
+        <w:pStyle w:val="Heading2"/>
       </w:pPr>
       <w:bookmarkStart w:id="3" w:name="_Toc231472768"/>
       <w:r>
@@ -3304,7 +3347,7 @@
     </w:p>
     <w:tbl>
       <w:tblPr>
-        <w:tblStyle w:val="Tablaconcuadrcula1clara"/>
+        <w:tblStyle w:val="GridTable1Light"/>
         <w:tblW w:w="9026" w:type="dxa"/>
         <w:jc w:val="center"/>
         <w:tblLook w:val="0420" w:firstRow="1" w:lastRow="0" w:firstColumn="0" w:lastColumn="0" w:noHBand="0" w:noVBand="1"/>
@@ -3481,31 +3524,21 @@
     </w:tbl>
     <w:p>
       <w:pPr>
-        <w:pStyle w:val="Descripcin"/>
+        <w:pStyle w:val="Caption"/>
         <w:jc w:val="center"/>
       </w:pPr>
       <w:bookmarkStart w:id="4" w:name="_Toc231472809"/>
       <w:r>
         <w:t xml:space="preserve">Tabla </w:t>
       </w:r>
-      <w:r>
-        <w:fldChar w:fldCharType="begin"/>
-      </w:r>
-      <w:r>
-        <w:instrText xml:space="preserve"> SEQ Tabla \* ARABIC </w:instrText>
-      </w:r>
-      <w:r>
-        <w:fldChar w:fldCharType="separate"/>
-      </w:r>
-      <w:r>
-        <w:rPr>
-          <w:noProof/>
-        </w:rPr>
-        <w:t>1</w:t>
-      </w:r>
-      <w:r>
-        <w:fldChar w:fldCharType="end"/>
-      </w:r>
+      <w:fldSimple w:instr=" SEQ Tabla \* ARABIC ">
+        <w:r>
+          <w:rPr>
+            <w:noProof/>
+          </w:rPr>
+          <w:t>1</w:t>
+        </w:r>
+      </w:fldSimple>
       <w:r>
         <w:t>: Datasets utilizados</w:t>
       </w:r>
@@ -3621,7 +3654,7 @@
     </w:p>
     <w:p>
       <w:pPr>
-        <w:pStyle w:val="Prrafodelista"/>
+        <w:pStyle w:val="ListParagraph"/>
         <w:numPr>
           <w:ilvl w:val="0"/>
           <w:numId w:val="2"/>
@@ -3642,7 +3675,7 @@
     </w:p>
     <w:p>
       <w:pPr>
-        <w:pStyle w:val="Prrafodelista"/>
+        <w:pStyle w:val="ListParagraph"/>
         <w:numPr>
           <w:ilvl w:val="0"/>
           <w:numId w:val="2"/>
@@ -3661,7 +3694,7 @@
     </w:p>
     <w:p>
       <w:pPr>
-        <w:pStyle w:val="Prrafodelista"/>
+        <w:pStyle w:val="ListParagraph"/>
         <w:numPr>
           <w:ilvl w:val="0"/>
           <w:numId w:val="2"/>
@@ -3709,10 +3742,7 @@
     </w:p>
     <w:p>
       <w:r>
-        <w:t xml:space="preserve">A continuación se realizó </w:t>
-      </w:r>
-      <w:r>
-        <w:t xml:space="preserve">un cruce de tipo </w:t>
+        <w:t xml:space="preserve">A continuación se realizó un cruce de tipo </w:t>
       </w:r>
       <w:r>
         <w:rPr>
@@ -3722,10 +3752,7 @@
         <w:t>left join</w:t>
       </w:r>
       <w:r>
-        <w:t xml:space="preserve"> entre ambas tablas</w:t>
-      </w:r>
-      <w:r>
-        <w:t xml:space="preserve"> y se revisó si había valores faltantes. El único dato faltante en nuestras variables de interés era el caso de </w:t>
+        <w:t xml:space="preserve"> entre ambas tablas y se revisó si había valores faltantes. El único dato faltante en nuestras variables de interés era el caso de </w:t>
       </w:r>
       <w:r>
         <w:t>Curaçao</w:t>
@@ -3767,7 +3794,7 @@
       </w:r>
       <w:r>
         <w:rPr>
-          <w:rStyle w:val="Refdenotaalpie"/>
+          <w:rStyle w:val="FootnoteReference"/>
           <w:lang w:val="en-US"/>
         </w:rPr>
         <w:footnoteReference w:id="1"/>
@@ -3877,7 +3904,7 @@
     </w:p>
     <w:p>
       <w:pPr>
-        <w:pStyle w:val="Ttulo1"/>
+        <w:pStyle w:val="Heading1"/>
       </w:pPr>
       <w:bookmarkStart w:id="5" w:name="_Toc231472769"/>
       <w:r>
@@ -3888,7 +3915,7 @@
     </w:p>
     <w:p>
       <w:pPr>
-        <w:pStyle w:val="Ttulo2"/>
+        <w:pStyle w:val="Heading2"/>
       </w:pPr>
       <w:bookmarkStart w:id="6" w:name="_Toc231472770"/>
       <w:r>
@@ -3956,7 +3983,7 @@
                     </pic:cNvPicPr>
                   </pic:nvPicPr>
                   <pic:blipFill>
-                    <a:blip r:embed="rId9"/>
+                    <a:blip r:embed="rId10"/>
                     <a:srcRect/>
                     <a:stretch>
                       <a:fillRect/>
@@ -3980,7 +4007,7 @@
     </w:p>
     <w:p>
       <w:pPr>
-        <w:pStyle w:val="Descripcin"/>
+        <w:pStyle w:val="Caption"/>
         <w:jc w:val="center"/>
       </w:pPr>
       <w:bookmarkStart w:id="7" w:name="_Ref231390466"/>
@@ -3988,24 +4015,14 @@
       <w:r>
         <w:t xml:space="preserve">Figura </w:t>
       </w:r>
-      <w:r>
-        <w:fldChar w:fldCharType="begin"/>
-      </w:r>
-      <w:r>
-        <w:instrText xml:space="preserve"> SEQ Figura \* ARABIC </w:instrText>
-      </w:r>
-      <w:r>
-        <w:fldChar w:fldCharType="separate"/>
-      </w:r>
-      <w:r>
-        <w:rPr>
-          <w:noProof/>
-        </w:rPr>
-        <w:t>1</w:t>
-      </w:r>
-      <w:r>
-        <w:fldChar w:fldCharType="end"/>
-      </w:r>
+      <w:fldSimple w:instr=" SEQ Figura \* ARABIC ">
+        <w:r>
+          <w:rPr>
+            <w:noProof/>
+          </w:rPr>
+          <w:t>1</w:t>
+        </w:r>
+      </w:fldSimple>
       <w:bookmarkEnd w:id="7"/>
       <w:r>
         <w:t xml:space="preserve">: </w:t>
@@ -4024,7 +4041,7 @@
     </w:p>
     <w:p>
       <w:pPr>
-        <w:pStyle w:val="Ttulo2"/>
+        <w:pStyle w:val="Heading2"/>
       </w:pPr>
       <w:bookmarkStart w:id="9" w:name="_Toc231472771"/>
       <w:r>
@@ -4165,7 +4182,7 @@
                     </pic:cNvPicPr>
                   </pic:nvPicPr>
                   <pic:blipFill>
-                    <a:blip r:embed="rId10"/>
+                    <a:blip r:embed="rId11"/>
                     <a:srcRect/>
                     <a:stretch>
                       <a:fillRect/>
@@ -4189,7 +4206,7 @@
     </w:p>
     <w:p>
       <w:pPr>
-        <w:pStyle w:val="Descripcin"/>
+        <w:pStyle w:val="Caption"/>
         <w:jc w:val="center"/>
       </w:pPr>
       <w:bookmarkStart w:id="10" w:name="_Ref231391086"/>
@@ -4197,24 +4214,14 @@
       <w:r>
         <w:t xml:space="preserve">Figura </w:t>
       </w:r>
-      <w:r>
-        <w:fldChar w:fldCharType="begin"/>
-      </w:r>
-      <w:r>
-        <w:instrText xml:space="preserve"> SEQ Figura \* ARABIC </w:instrText>
-      </w:r>
-      <w:r>
-        <w:fldChar w:fldCharType="separate"/>
-      </w:r>
-      <w:r>
-        <w:rPr>
-          <w:noProof/>
-        </w:rPr>
-        <w:t>2</w:t>
-      </w:r>
-      <w:r>
-        <w:fldChar w:fldCharType="end"/>
-      </w:r>
+      <w:fldSimple w:instr=" SEQ Figura \* ARABIC ">
+        <w:r>
+          <w:rPr>
+            <w:noProof/>
+          </w:rPr>
+          <w:t>2</w:t>
+        </w:r>
+      </w:fldSimple>
       <w:bookmarkEnd w:id="10"/>
       <w:r>
         <w:t>:</w:t>
@@ -4258,7 +4265,7 @@
           <w:noProof/>
         </w:rPr>
         <w:drawing>
-          <wp:inline distT="0" distB="0" distL="0" distR="0" wp14:anchorId="119D407A" wp14:editId="4E68B360">
+          <wp:inline distT="0" distB="0" distL="0" distR="0" wp14:anchorId="119D407A" wp14:editId="5D3CF874">
             <wp:extent cx="5943600" cy="1981200"/>
             <wp:effectExtent l="0" t="0" r="0" b="0"/>
             <wp:docPr id="1761773335" name="Imagen 2"/>
@@ -4270,169 +4277,6 @@
                 <pic:pic xmlns:pic="http://schemas.openxmlformats.org/drawingml/2006/picture">
                   <pic:nvPicPr>
                     <pic:cNvPr id="1761773335" name="Imagen 1761773335"/>
-                    <pic:cNvPicPr/>
-                  </pic:nvPicPr>
-                  <pic:blipFill>
-                    <a:blip r:embed="rId11" cstate="print">
-                      <a:extLst>
-                        <a:ext uri="{28A0092B-C50C-407E-A947-70E740481C1C}">
-                          <a14:useLocalDpi xmlns:a14="http://schemas.microsoft.com/office/drawing/2010/main" val="0"/>
-                        </a:ext>
-                      </a:extLst>
-                    </a:blip>
-                    <a:stretch>
-                      <a:fillRect/>
-                    </a:stretch>
-                  </pic:blipFill>
-                  <pic:spPr>
-                    <a:xfrm>
-                      <a:off x="0" y="0"/>
-                      <a:ext cx="5943600" cy="1981200"/>
-                    </a:xfrm>
-                    <a:prstGeom prst="rect">
-                      <a:avLst/>
-                    </a:prstGeom>
-                  </pic:spPr>
-                </pic:pic>
-              </a:graphicData>
-            </a:graphic>
-          </wp:inline>
-        </w:drawing>
-      </w:r>
-    </w:p>
-    <w:p>
-      <w:pPr>
-        <w:pStyle w:val="Descripcin"/>
-        <w:jc w:val="center"/>
-      </w:pPr>
-      <w:bookmarkStart w:id="12" w:name="_Ref231391408"/>
-      <w:bookmarkStart w:id="13" w:name="_Toc231472830"/>
-      <w:r>
-        <w:t xml:space="preserve">Figura </w:t>
-      </w:r>
-      <w:r>
-        <w:fldChar w:fldCharType="begin"/>
-      </w:r>
-      <w:r>
-        <w:instrText xml:space="preserve"> SEQ Figura \* ARABIC </w:instrText>
-      </w:r>
-      <w:r>
-        <w:fldChar w:fldCharType="separate"/>
-      </w:r>
-      <w:r>
-        <w:rPr>
-          <w:noProof/>
-        </w:rPr>
-        <w:t>3</w:t>
-      </w:r>
-      <w:r>
-        <w:fldChar w:fldCharType="end"/>
-      </w:r>
-      <w:bookmarkEnd w:id="12"/>
-      <w:r>
-        <w:t xml:space="preserve">: </w:t>
-      </w:r>
-      <w:r>
-        <w:t xml:space="preserve">Distribución del puntaje FIFA por </w:t>
-      </w:r>
-      <w:r>
-        <w:t>idioma</w:t>
-      </w:r>
-      <w:r>
-        <w:t xml:space="preserve"> </w:t>
-      </w:r>
-      <w:r>
-        <w:t xml:space="preserve">mayoritario </w:t>
-      </w:r>
-      <w:r>
-        <w:t>de</w:t>
-      </w:r>
-      <w:r>
-        <w:t>l país de</w:t>
-      </w:r>
-      <w:r>
-        <w:t xml:space="preserve"> origen de la selección</w:t>
-      </w:r>
-      <w:r>
-        <w:t xml:space="preserve"> (para idiomas que son hablados en 3 países o más)</w:t>
-      </w:r>
-      <w:r>
-        <w:rPr>
-          <w:rStyle w:val="Refdenotaalpie"/>
-        </w:rPr>
-        <w:footnoteReference w:id="2"/>
-      </w:r>
-      <w:r>
-        <w:t>.</w:t>
-      </w:r>
-      <w:bookmarkEnd w:id="13"/>
-    </w:p>
-    <w:p>
-      <w:r>
-        <w:t xml:space="preserve">Viendo el boxplot por idioma, </w:t>
-      </w:r>
-      <w:r>
-        <w:t>vemos que los países que hablan español tienen rendimiento más alto. Esto claramente refuerza los resultados que vimos en el gráfico anterior ya que  est</w:t>
-      </w:r>
-      <w:r>
-        <w:t>a</w:t>
-      </w:r>
-      <w:r>
-        <w:t xml:space="preserve">s </w:t>
-      </w:r>
-      <w:r>
-        <w:lastRenderedPageBreak/>
-        <w:t>variables</w:t>
-      </w:r>
-      <w:r>
-        <w:t xml:space="preserve"> están estrechamente </w:t>
-      </w:r>
-      <w:r>
-        <w:t>relacionad</w:t>
-      </w:r>
-      <w:r>
-        <w:t>a</w:t>
-      </w:r>
-      <w:r>
-        <w:t>s</w:t>
-      </w:r>
-      <w:r>
-        <w:t>.</w:t>
-      </w:r>
-      <w:r>
-        <w:t xml:space="preserve"> Estas regularidades apuntan a factores culturales y de tradición futbolística no capturados por las variables económicas.</w:t>
-      </w:r>
-    </w:p>
-    <w:p>
-      <w:pPr>
-        <w:rPr>
-          <w:u w:val="single"/>
-        </w:rPr>
-      </w:pPr>
-    </w:p>
-    <w:p>
-      <w:pPr>
-        <w:keepNext/>
-        <w:spacing w:before="80" w:after="100"/>
-      </w:pPr>
-      <w:commentRangeStart w:id="14"/>
-      <w:r>
-        <w:rPr>
-          <w:noProof/>
-        </w:rPr>
-        <w:drawing>
-          <wp:inline distT="0" distB="0" distL="0" distR="0" wp14:anchorId="2C112144" wp14:editId="67F573CF">
-            <wp:extent cx="5943600" cy="1981200"/>
-            <wp:effectExtent l="0" t="0" r="0" b="0"/>
-            <wp:docPr id="330224463" name="Imagen 1"/>
-            <wp:cNvGraphicFramePr>
-              <a:graphicFrameLocks xmlns:a="http://schemas.openxmlformats.org/drawingml/2006/main" noChangeAspect="1"/>
-            </wp:cNvGraphicFramePr>
-            <a:graphic xmlns:a="http://schemas.openxmlformats.org/drawingml/2006/main">
-              <a:graphicData uri="http://schemas.openxmlformats.org/drawingml/2006/picture">
-                <pic:pic xmlns:pic="http://schemas.openxmlformats.org/drawingml/2006/picture">
-                  <pic:nvPicPr>
-                    <pic:cNvPr id="330224463" name="Imagen 330224463"/>
                     <pic:cNvPicPr/>
                   </pic:nvPicPr>
                   <pic:blipFill>
@@ -4462,10 +4306,163 @@
           </wp:inline>
         </w:drawing>
       </w:r>
+    </w:p>
+    <w:p>
+      <w:pPr>
+        <w:pStyle w:val="Caption"/>
+        <w:jc w:val="center"/>
+      </w:pPr>
+      <w:bookmarkStart w:id="12" w:name="_Ref231391408"/>
+      <w:bookmarkStart w:id="13" w:name="_Toc231472830"/>
+      <w:r>
+        <w:t xml:space="preserve">Figura </w:t>
+      </w:r>
+      <w:fldSimple w:instr=" SEQ Figura \* ARABIC ">
+        <w:r>
+          <w:rPr>
+            <w:noProof/>
+          </w:rPr>
+          <w:t>3</w:t>
+        </w:r>
+      </w:fldSimple>
+      <w:bookmarkEnd w:id="12"/>
+      <w:r>
+        <w:t xml:space="preserve">: </w:t>
+      </w:r>
+      <w:r>
+        <w:t xml:space="preserve">Distribución del puntaje FIFA por </w:t>
+      </w:r>
+      <w:r>
+        <w:t>idioma</w:t>
+      </w:r>
+      <w:r>
+        <w:t xml:space="preserve"> </w:t>
+      </w:r>
+      <w:r>
+        <w:t xml:space="preserve">mayoritario </w:t>
+      </w:r>
+      <w:r>
+        <w:t>de</w:t>
+      </w:r>
+      <w:r>
+        <w:t>l país de</w:t>
+      </w:r>
+      <w:r>
+        <w:t xml:space="preserve"> origen de la selección</w:t>
+      </w:r>
+      <w:r>
+        <w:t xml:space="preserve"> (para idiomas que son hablados en 3 países o más)</w:t>
+      </w:r>
+      <w:r>
+        <w:rPr>
+          <w:rStyle w:val="FootnoteReference"/>
+        </w:rPr>
+        <w:footnoteReference w:id="2"/>
+      </w:r>
+      <w:r>
+        <w:t>.</w:t>
+      </w:r>
+      <w:bookmarkEnd w:id="13"/>
+    </w:p>
+    <w:p>
+      <w:r>
+        <w:t xml:space="preserve">Viendo el boxplot por idioma, </w:t>
+      </w:r>
+      <w:r>
+        <w:t>vemos que los países que hablan español tienen rendimiento más alto. Esto claramente refuerza los resultados que vimos en el gráfico anterior ya que  est</w:t>
+      </w:r>
+      <w:r>
+        <w:t>a</w:t>
+      </w:r>
+      <w:r>
+        <w:t xml:space="preserve">s </w:t>
+      </w:r>
+      <w:r>
+        <w:lastRenderedPageBreak/>
+        <w:t>variables</w:t>
+      </w:r>
+      <w:r>
+        <w:t xml:space="preserve"> están estrechamente </w:t>
+      </w:r>
+      <w:r>
+        <w:t>relacionad</w:t>
+      </w:r>
+      <w:r>
+        <w:t>a</w:t>
+      </w:r>
+      <w:r>
+        <w:t>s</w:t>
+      </w:r>
+      <w:r>
+        <w:t>.</w:t>
+      </w:r>
+      <w:r>
+        <w:t xml:space="preserve"> Estas regularidades apuntan a factores culturales y de tradición futbolística no capturados por las variables económicas.</w:t>
+      </w:r>
+    </w:p>
+    <w:p>
+      <w:pPr>
+        <w:rPr>
+          <w:u w:val="single"/>
+        </w:rPr>
+      </w:pPr>
+    </w:p>
+    <w:p>
+      <w:pPr>
+        <w:keepNext/>
+        <w:spacing w:before="80" w:after="100"/>
+      </w:pPr>
+      <w:commentRangeStart w:id="14"/>
+      <w:r>
+        <w:rPr>
+          <w:noProof/>
+        </w:rPr>
+        <w:drawing>
+          <wp:inline distT="0" distB="0" distL="0" distR="0" wp14:anchorId="2C112144" wp14:editId="018EC58A">
+            <wp:extent cx="5943600" cy="1981200"/>
+            <wp:effectExtent l="0" t="0" r="0" b="0"/>
+            <wp:docPr id="330224463" name="Imagen 1"/>
+            <wp:cNvGraphicFramePr>
+              <a:graphicFrameLocks xmlns:a="http://schemas.openxmlformats.org/drawingml/2006/main" noChangeAspect="1"/>
+            </wp:cNvGraphicFramePr>
+            <a:graphic xmlns:a="http://schemas.openxmlformats.org/drawingml/2006/main">
+              <a:graphicData uri="http://schemas.openxmlformats.org/drawingml/2006/picture">
+                <pic:pic xmlns:pic="http://schemas.openxmlformats.org/drawingml/2006/picture">
+                  <pic:nvPicPr>
+                    <pic:cNvPr id="330224463" name="Imagen 330224463"/>
+                    <pic:cNvPicPr/>
+                  </pic:nvPicPr>
+                  <pic:blipFill>
+                    <a:blip r:embed="rId13" cstate="print">
+                      <a:extLst>
+                        <a:ext uri="{28A0092B-C50C-407E-A947-70E740481C1C}">
+                          <a14:useLocalDpi xmlns:a14="http://schemas.microsoft.com/office/drawing/2010/main" val="0"/>
+                        </a:ext>
+                      </a:extLst>
+                    </a:blip>
+                    <a:stretch>
+                      <a:fillRect/>
+                    </a:stretch>
+                  </pic:blipFill>
+                  <pic:spPr>
+                    <a:xfrm>
+                      <a:off x="0" y="0"/>
+                      <a:ext cx="5943600" cy="1981200"/>
+                    </a:xfrm>
+                    <a:prstGeom prst="rect">
+                      <a:avLst/>
+                    </a:prstGeom>
+                  </pic:spPr>
+                </pic:pic>
+              </a:graphicData>
+            </a:graphic>
+          </wp:inline>
+        </w:drawing>
+      </w:r>
       <w:commentRangeEnd w:id="14"/>
       <w:r>
         <w:rPr>
-          <w:rStyle w:val="Refdecomentario"/>
+          <w:rStyle w:val="CommentReference"/>
           <w:sz w:val="22"/>
           <w:szCs w:val="22"/>
         </w:rPr>
@@ -4474,7 +4471,7 @@
     </w:p>
     <w:p>
       <w:pPr>
-        <w:pStyle w:val="Descripcin"/>
+        <w:pStyle w:val="Caption"/>
         <w:jc w:val="center"/>
       </w:pPr>
       <w:bookmarkStart w:id="15" w:name="_Ref231391423"/>
@@ -4482,24 +4479,14 @@
       <w:r>
         <w:t xml:space="preserve">Figura </w:t>
       </w:r>
-      <w:r>
-        <w:fldChar w:fldCharType="begin"/>
-      </w:r>
-      <w:r>
-        <w:instrText xml:space="preserve"> SEQ Figura \* ARABIC </w:instrText>
-      </w:r>
-      <w:r>
-        <w:fldChar w:fldCharType="separate"/>
-      </w:r>
-      <w:r>
-        <w:rPr>
-          <w:noProof/>
-        </w:rPr>
-        <w:t>4</w:t>
-      </w:r>
-      <w:r>
-        <w:fldChar w:fldCharType="end"/>
-      </w:r>
+      <w:fldSimple w:instr=" SEQ Figura \* ARABIC ">
+        <w:r>
+          <w:rPr>
+            <w:noProof/>
+          </w:rPr>
+          <w:t>4</w:t>
+        </w:r>
+      </w:fldSimple>
       <w:bookmarkEnd w:id="15"/>
       <w:r>
         <w:t>:</w:t>
@@ -4554,7 +4541,7 @@
                     <pic:cNvPicPr/>
                   </pic:nvPicPr>
                   <pic:blipFill>
-                    <a:blip r:embed="rId17">
+                    <a:blip r:embed="rId18">
                       <a:extLst>
                         <a:ext uri="{28A0092B-C50C-407E-A947-70E740481C1C}">
                           <a14:useLocalDpi xmlns:a14="http://schemas.microsoft.com/office/drawing/2010/main" val="0"/>
@@ -4583,31 +4570,21 @@
     </w:p>
     <w:p>
       <w:pPr>
-        <w:pStyle w:val="Descripcin"/>
+        <w:pStyle w:val="Caption"/>
         <w:jc w:val="center"/>
       </w:pPr>
       <w:bookmarkStart w:id="17" w:name="_Toc231472832"/>
       <w:r>
         <w:t xml:space="preserve">Figura </w:t>
       </w:r>
-      <w:r>
-        <w:fldChar w:fldCharType="begin"/>
-      </w:r>
-      <w:r>
-        <w:instrText xml:space="preserve"> SEQ Figura \* ARABIC </w:instrText>
-      </w:r>
-      <w:r>
-        <w:fldChar w:fldCharType="separate"/>
-      </w:r>
-      <w:r>
-        <w:rPr>
-          <w:noProof/>
-        </w:rPr>
-        <w:t>5</w:t>
-      </w:r>
-      <w:r>
-        <w:fldChar w:fldCharType="end"/>
-      </w:r>
+      <w:fldSimple w:instr=" SEQ Figura \* ARABIC ">
+        <w:r>
+          <w:rPr>
+            <w:noProof/>
+          </w:rPr>
+          <w:t>5</w:t>
+        </w:r>
+      </w:fldSimple>
       <w:r>
         <w:t>: Distribución de religiones entre los países participantes del torneo.</w:t>
       </w:r>
@@ -4650,7 +4627,7 @@
     <w:p/>
     <w:p>
       <w:pPr>
-        <w:pStyle w:val="Ttulo2"/>
+        <w:pStyle w:val="Heading2"/>
       </w:pPr>
       <w:bookmarkStart w:id="18" w:name="_Toc231472772"/>
       <w:r>
@@ -4730,7 +4707,7 @@
                     </pic:cNvPicPr>
                   </pic:nvPicPr>
                   <pic:blipFill>
-                    <a:blip r:embed="rId18"/>
+                    <a:blip r:embed="rId19"/>
                     <a:srcRect/>
                     <a:stretch>
                       <a:fillRect/>
@@ -4754,7 +4731,7 @@
     </w:p>
     <w:p>
       <w:pPr>
-        <w:pStyle w:val="Descripcin"/>
+        <w:pStyle w:val="Caption"/>
         <w:jc w:val="center"/>
       </w:pPr>
       <w:bookmarkStart w:id="19" w:name="_Ref231392902"/>
@@ -4762,24 +4739,14 @@
       <w:r>
         <w:t xml:space="preserve">Figura </w:t>
       </w:r>
-      <w:r>
-        <w:fldChar w:fldCharType="begin"/>
-      </w:r>
-      <w:r>
-        <w:instrText xml:space="preserve"> SEQ Figura \* ARABIC </w:instrText>
-      </w:r>
-      <w:r>
-        <w:fldChar w:fldCharType="separate"/>
-      </w:r>
-      <w:r>
-        <w:rPr>
-          <w:noProof/>
-        </w:rPr>
-        <w:t>6</w:t>
-      </w:r>
-      <w:r>
-        <w:fldChar w:fldCharType="end"/>
-      </w:r>
+      <w:fldSimple w:instr=" SEQ Figura \* ARABIC ">
+        <w:r>
+          <w:rPr>
+            <w:noProof/>
+          </w:rPr>
+          <w:t>6</w:t>
+        </w:r>
+      </w:fldSimple>
       <w:bookmarkEnd w:id="19"/>
       <w:r>
         <w:t xml:space="preserve">: </w:t>
@@ -4889,7 +4856,7 @@
     <w:p/>
     <w:tbl>
       <w:tblPr>
-        <w:tblStyle w:val="Tablaconcuadrcula1clara"/>
+        <w:tblStyle w:val="GridTable1Light"/>
         <w:tblW w:w="7800" w:type="dxa"/>
         <w:jc w:val="center"/>
         <w:tblLook w:val="04A0" w:firstRow="1" w:lastRow="0" w:firstColumn="1" w:lastColumn="0" w:noHBand="0" w:noVBand="1"/>
@@ -5527,31 +5494,21 @@
     </w:tbl>
     <w:p>
       <w:pPr>
-        <w:pStyle w:val="Descripcin"/>
+        <w:pStyle w:val="Caption"/>
         <w:jc w:val="center"/>
       </w:pPr>
       <w:bookmarkStart w:id="21" w:name="_Toc231472810"/>
       <w:r>
         <w:t xml:space="preserve">Tabla </w:t>
       </w:r>
-      <w:r>
-        <w:fldChar w:fldCharType="begin"/>
-      </w:r>
-      <w:r>
-        <w:instrText xml:space="preserve"> SEQ Tabla \* ARABIC </w:instrText>
-      </w:r>
-      <w:r>
-        <w:fldChar w:fldCharType="separate"/>
-      </w:r>
-      <w:r>
-        <w:rPr>
-          <w:noProof/>
-        </w:rPr>
-        <w:t>2</w:t>
-      </w:r>
-      <w:r>
-        <w:fldChar w:fldCharType="end"/>
-      </w:r>
+      <w:fldSimple w:instr=" SEQ Tabla \* ARABIC ">
+        <w:r>
+          <w:rPr>
+            <w:noProof/>
+          </w:rPr>
+          <w:t>2</w:t>
+        </w:r>
+      </w:fldSimple>
       <w:r>
         <w:t xml:space="preserve">: Coeficiente de determinación </w:t>
       </w:r>
@@ -5587,7 +5544,7 @@
                     <pic:cNvPicPr/>
                   </pic:nvPicPr>
                   <pic:blipFill>
-                    <a:blip r:embed="rId19">
+                    <a:blip r:embed="rId20">
                       <a:extLst>
                         <a:ext uri="{28A0092B-C50C-407E-A947-70E740481C1C}">
                           <a14:useLocalDpi xmlns:a14="http://schemas.microsoft.com/office/drawing/2010/main" val="0"/>
@@ -5616,7 +5573,7 @@
       <w:commentRangeEnd w:id="22"/>
       <w:r>
         <w:rPr>
-          <w:rStyle w:val="Refdecomentario"/>
+          <w:rStyle w:val="CommentReference"/>
           <w:sz w:val="22"/>
           <w:szCs w:val="22"/>
         </w:rPr>
@@ -5625,31 +5582,21 @@
     </w:p>
     <w:p>
       <w:pPr>
-        <w:pStyle w:val="Descripcin"/>
+        <w:pStyle w:val="Caption"/>
         <w:jc w:val="center"/>
       </w:pPr>
       <w:bookmarkStart w:id="23" w:name="_Toc231472834"/>
       <w:r>
         <w:t xml:space="preserve">Figura </w:t>
       </w:r>
-      <w:r>
-        <w:fldChar w:fldCharType="begin"/>
-      </w:r>
-      <w:r>
-        <w:instrText xml:space="preserve"> SEQ Figura \* ARABIC </w:instrText>
-      </w:r>
-      <w:r>
-        <w:fldChar w:fldCharType="separate"/>
-      </w:r>
-      <w:r>
-        <w:rPr>
-          <w:noProof/>
-        </w:rPr>
-        <w:t>7</w:t>
-      </w:r>
-      <w:r>
-        <w:fldChar w:fldCharType="end"/>
-      </w:r>
+      <w:fldSimple w:instr=" SEQ Figura \* ARABIC ">
+        <w:r>
+          <w:rPr>
+            <w:noProof/>
+          </w:rPr>
+          <w:t>7</w:t>
+        </w:r>
+      </w:fldSimple>
       <w:r>
         <w:t>: Ajuste de modelos</w:t>
       </w:r>
@@ -5872,7 +5819,16 @@
             <w:rPr>
               <w:rFonts w:ascii="Cambria Math" w:hAnsi="Cambria Math"/>
             </w:rPr>
-            <m:t>2ax+b</m:t>
+            <m:t>2</m:t>
+          </m:r>
+          <m:r>
+            <m:rPr>
+              <m:sty m:val="bi"/>
+            </m:rPr>
+            <w:rPr>
+              <w:rFonts w:ascii="Cambria Math" w:hAnsi="Cambria Math"/>
+            </w:rPr>
+            <m:t>ax+b</m:t>
           </m:r>
         </m:oMath>
       </m:oMathPara>
@@ -5981,7 +5937,7 @@
                     <pic:cNvPicPr/>
                   </pic:nvPicPr>
                   <pic:blipFill>
-                    <a:blip r:embed="rId20" cstate="print">
+                    <a:blip r:embed="rId21" cstate="print">
                       <a:extLst>
                         <a:ext uri="{28A0092B-C50C-407E-A947-70E740481C1C}">
                           <a14:useLocalDpi xmlns:a14="http://schemas.microsoft.com/office/drawing/2010/main" val="0"/>
@@ -6010,44 +5966,34 @@
     </w:p>
     <w:p>
       <w:pPr>
-        <w:pStyle w:val="Descripcin"/>
+        <w:pStyle w:val="Caption"/>
         <w:jc w:val="center"/>
       </w:pPr>
-      <w:bookmarkStart w:id="24" w:name="_Ref231466924"/>
-      <w:bookmarkStart w:id="25" w:name="_Ref231466931"/>
+      <w:bookmarkStart w:id="24" w:name="_Ref231466931"/>
+      <w:bookmarkStart w:id="25" w:name="_Ref231466924"/>
       <w:bookmarkStart w:id="26" w:name="_Toc231472835"/>
       <w:r>
         <w:t xml:space="preserve">Figura </w:t>
       </w:r>
-      <w:r>
-        <w:fldChar w:fldCharType="begin"/>
-      </w:r>
-      <w:r>
-        <w:instrText xml:space="preserve"> SEQ Figura \* ARABIC </w:instrText>
-      </w:r>
-      <w:r>
-        <w:fldChar w:fldCharType="separate"/>
-      </w:r>
-      <w:r>
-        <w:rPr>
-          <w:noProof/>
-        </w:rPr>
-        <w:t>8</w:t>
-      </w:r>
-      <w:r>
-        <w:fldChar w:fldCharType="end"/>
+      <w:fldSimple w:instr=" SEQ Figura \* ARABIC ">
+        <w:r>
+          <w:rPr>
+            <w:noProof/>
+          </w:rPr>
+          <w:t>8</w:t>
+        </w:r>
+      </w:fldSimple>
+      <w:bookmarkEnd w:id="24"/>
+      <w:r>
+        <w:t>: Modelo cuadrático</w:t>
+      </w:r>
+      <w:r>
+        <w:t>:</w:t>
+      </w:r>
+      <w:r>
+        <w:t xml:space="preserve"> función y primera y segunda derivada.</w:t>
       </w:r>
       <w:bookmarkEnd w:id="25"/>
-      <w:r>
-        <w:t>: Modelo cuadrático</w:t>
-      </w:r>
-      <w:r>
-        <w:t>:</w:t>
-      </w:r>
-      <w:r>
-        <w:t xml:space="preserve"> función y primera y segunda derivada.</w:t>
-      </w:r>
-      <w:bookmarkEnd w:id="24"/>
       <w:bookmarkEnd w:id="26"/>
     </w:p>
     <w:p/>
@@ -6113,19 +6059,7 @@
     </w:p>
     <w:p>
       <w:r>
-        <w:t xml:space="preserve">El signo negativo del término cuadrático </w:t>
-      </w:r>
-      <w:r>
-        <w:t xml:space="preserve">de la función </w:t>
-      </w:r>
-      <w:r>
-        <w:t>es el hallazgo decisivo: la parábola se abre hacia abajo, de modo que el rendimiento de la inversión es decreciente.</w:t>
-      </w:r>
-      <w:r>
-        <w:t xml:space="preserve"> </w:t>
-      </w:r>
-      <w:r>
-        <w:t xml:space="preserve">La segunda derivada, </w:t>
+        <w:t xml:space="preserve">El signo negativo del término cuadrático de la función es el hallazgo decisivo: la parábola se abre hacia abajo, de modo que el rendimiento de la inversión es decreciente. La segunda derivada, </w:t>
       </w:r>
       <m:oMath>
         <m:r>
@@ -6215,7 +6149,7 @@
     <w:p/>
     <w:p>
       <w:pPr>
-        <w:pStyle w:val="Ttulo2"/>
+        <w:pStyle w:val="Heading2"/>
       </w:pPr>
       <w:bookmarkStart w:id="27" w:name="_Toc231472773"/>
       <w:r>
@@ -6264,7 +6198,7 @@
     <w:p/>
     <w:tbl>
       <w:tblPr>
-        <w:tblStyle w:val="Tablaconcuadrculaclara"/>
+        <w:tblStyle w:val="TableGridLight"/>
         <w:tblW w:w="9360" w:type="dxa"/>
         <w:tblLook w:val="04A0" w:firstRow="1" w:lastRow="0" w:firstColumn="1" w:lastColumn="0" w:noHBand="0" w:noVBand="1"/>
       </w:tblPr>
@@ -6698,31 +6632,21 @@
     </w:tbl>
     <w:p>
       <w:pPr>
-        <w:pStyle w:val="Descripcin"/>
+        <w:pStyle w:val="Caption"/>
         <w:jc w:val="center"/>
       </w:pPr>
       <w:bookmarkStart w:id="28" w:name="_Toc231472811"/>
       <w:r>
         <w:t xml:space="preserve">Tabla </w:t>
       </w:r>
-      <w:r>
-        <w:fldChar w:fldCharType="begin"/>
-      </w:r>
-      <w:r>
-        <w:instrText xml:space="preserve"> SEQ Tabla \* ARABIC </w:instrText>
-      </w:r>
-      <w:r>
-        <w:fldChar w:fldCharType="separate"/>
-      </w:r>
-      <w:r>
-        <w:rPr>
-          <w:noProof/>
-        </w:rPr>
-        <w:t>3</w:t>
-      </w:r>
-      <w:r>
-        <w:fldChar w:fldCharType="end"/>
-      </w:r>
+      <w:fldSimple w:instr=" SEQ Tabla \* ARABIC ">
+        <w:r>
+          <w:rPr>
+            <w:noProof/>
+          </w:rPr>
+          <w:t>3</w:t>
+        </w:r>
+      </w:fldSimple>
       <w:r>
         <w:t xml:space="preserve">: </w:t>
       </w:r>
@@ -6767,7 +6691,7 @@
                     </pic:cNvPicPr>
                   </pic:nvPicPr>
                   <pic:blipFill>
-                    <a:blip r:embed="rId21"/>
+                    <a:blip r:embed="rId22"/>
                     <a:srcRect/>
                     <a:stretch>
                       <a:fillRect/>
@@ -6791,31 +6715,21 @@
     </w:p>
     <w:p>
       <w:pPr>
-        <w:pStyle w:val="Descripcin"/>
+        <w:pStyle w:val="Caption"/>
         <w:jc w:val="center"/>
       </w:pPr>
       <w:bookmarkStart w:id="29" w:name="_Toc231472836"/>
       <w:r>
         <w:t xml:space="preserve">Figura </w:t>
       </w:r>
-      <w:r>
-        <w:fldChar w:fldCharType="begin"/>
-      </w:r>
-      <w:r>
-        <w:instrText xml:space="preserve"> SEQ Figura \* ARABIC </w:instrText>
-      </w:r>
-      <w:r>
-        <w:fldChar w:fldCharType="separate"/>
-      </w:r>
-      <w:r>
-        <w:rPr>
-          <w:noProof/>
-        </w:rPr>
-        <w:t>9</w:t>
-      </w:r>
-      <w:r>
-        <w:fldChar w:fldCharType="end"/>
-      </w:r>
+      <w:fldSimple w:instr=" SEQ Figura \* ARABIC ">
+        <w:r>
+          <w:rPr>
+            <w:noProof/>
+          </w:rPr>
+          <w:t>9</w:t>
+        </w:r>
+      </w:fldSimple>
       <w:r>
         <w:t xml:space="preserve">: </w:t>
       </w:r>
@@ -6869,13 +6783,7 @@
     </w:p>
     <w:p>
       <w:r>
-        <w:t>E</w:t>
-      </w:r>
-      <w:r>
-        <w:t>l modelo, por tanto, ajusta razonablemente bien a las potencias consolidadas pero pierde poder explicativo en el extremo de baja inversión</w:t>
-      </w:r>
-      <w:r>
-        <w:t xml:space="preserve">, </w:t>
+        <w:t xml:space="preserve">El modelo, por tanto, ajusta razonablemente bien a las potencias consolidadas pero pierde poder explicativo en el extremo de baja inversión, </w:t>
       </w:r>
       <w:r>
         <w:t>donde la dispersión es mayor y la relación inversión–rendimiento se vuelve mucho más ruidosa.</w:t>
@@ -6884,7 +6792,7 @@
     <w:p/>
     <w:p>
       <w:pPr>
-        <w:pStyle w:val="Ttulo1"/>
+        <w:pStyle w:val="Heading1"/>
       </w:pPr>
       <w:bookmarkStart w:id="30" w:name="_Toc231472774"/>
       <w:r>
@@ -6980,7 +6888,7 @@
     </w:p>
     <w:p>
       <w:pPr>
-        <w:pStyle w:val="Ttulo1"/>
+        <w:pStyle w:val="Heading1"/>
       </w:pPr>
       <w:bookmarkStart w:id="31" w:name="_Toc231472775"/>
       <w:r>
@@ -6996,45 +6904,12 @@
         <w:t xml:space="preserve">La elaboración del trabajo contó con asistencia de inteligencia artificial </w:t>
       </w:r>
       <w:r>
-        <w:t>(</w:t>
-      </w:r>
-      <w:r>
-        <w:t xml:space="preserve">Claude </w:t>
-      </w:r>
-      <w:r>
-        <w:t xml:space="preserve">de </w:t>
-      </w:r>
-      <w:r>
-        <w:t xml:space="preserve">Anthropic) </w:t>
-      </w:r>
-      <w:r>
-        <w:t xml:space="preserve">enriquecida con los requisitos del trabajo y el notebook generado por el equipo. </w:t>
-      </w:r>
-    </w:p>
-    <w:p>
-      <w:r>
-        <w:t xml:space="preserve">En el notebook, la IA fue empleada </w:t>
-      </w:r>
-      <w:r>
-        <w:t>en tareas acotadas y explícitamente señaladas</w:t>
-      </w:r>
-      <w:r>
-        <w:t xml:space="preserve">, principalmente </w:t>
-      </w:r>
-      <w:r>
-        <w:t xml:space="preserve">para sugerir y comparar </w:t>
-      </w:r>
-      <w:r>
-        <w:t>los cuatro modelos funci</w:t>
-      </w:r>
-      <w:r>
-        <w:t xml:space="preserve">onales, calcular las derivadas analíticas con SymPy e interpretar su significado económico en términos de concavidad y rendimientos marginales. En todos los casos la herramienta operó como apoyo: la formulación de la pregunta de investigación, la selección de variables, la interpretación de los resultados y la redacción de las conclusiones fueron </w:t>
-      </w:r>
-      <w:r>
-        <w:t>realizadas por</w:t>
-      </w:r>
-      <w:r>
-        <w:t xml:space="preserve"> el grupo.</w:t>
+        <w:t xml:space="preserve">(Claude de Anthropic) enriquecida con los requisitos del trabajo y el notebook generado por el equipo. </w:t>
+      </w:r>
+    </w:p>
+    <w:p>
+      <w:r>
+        <w:t>En el notebook, la IA fue empleada en tareas acotadas y explícitamente señaladas, principalmente para sugerir y comparar los cuatro modelos funcionales, calcular las derivadas analíticas con SymPy e interpretar su significado económico en términos de concavidad y rendimientos marginales. En todos los casos la herramienta operó como apoyo: la formulación de la pregunta de investigación, la selección de variables, la interpretación de los resultados y la redacción de las conclusiones fueron realizadas por el grupo.</w:t>
       </w:r>
     </w:p>
     <w:p>
@@ -7076,7 +6951,7 @@
     </w:p>
     <w:p>
       <w:pPr>
-        <w:pStyle w:val="Ttulo1"/>
+        <w:pStyle w:val="Heading1"/>
         <w:numPr>
           <w:ilvl w:val="0"/>
           <w:numId w:val="0"/>
@@ -7401,7 +7276,7 @@
     </w:p>
     <w:p>
       <w:pPr>
-        <w:pStyle w:val="Ttulo1"/>
+        <w:pStyle w:val="Heading1"/>
         <w:numPr>
           <w:ilvl w:val="0"/>
           <w:numId w:val="0"/>
@@ -7631,8 +7506,8 @@
     </w:p>
     <w:p/>
     <w:sectPr>
-      <w:headerReference w:type="default" r:id="rId22"/>
-      <w:footerReference w:type="default" r:id="rId23"/>
+      <w:headerReference w:type="default" r:id="rId23"/>
+      <w:footerReference w:type="default" r:id="rId24"/>
       <w:pgSz w:w="12240" w:h="15840"/>
       <w:pgMar w:top="1440" w:right="1440" w:bottom="1440" w:left="1440" w:header="708" w:footer="708" w:gutter="0"/>
       <w:cols w:space="720"/>
@@ -7647,11 +7522,11 @@
   <w:comment w:id="14" w:author="Carla Garibotti" w:date="2026-06-04T11:35:00Z" w:initials="CG">
     <w:p>
       <w:pPr>
-        <w:pStyle w:val="Textocomentario"/>
+        <w:pStyle w:val="CommentText"/>
       </w:pPr>
       <w:r>
         <w:rPr>
-          <w:rStyle w:val="Refdecomentario"/>
+          <w:rStyle w:val="CommentReference"/>
         </w:rPr>
         <w:annotationRef/>
       </w:r>
@@ -7663,11 +7538,11 @@
   <w:comment w:id="22" w:author="Carla Garibotti" w:date="2026-06-04T11:29:00Z" w:initials="CG">
     <w:p>
       <w:pPr>
-        <w:pStyle w:val="Textocomentario"/>
+        <w:pStyle w:val="CommentText"/>
       </w:pPr>
       <w:r>
         <w:rPr>
-          <w:rStyle w:val="Refdecomentario"/>
+          <w:rStyle w:val="CommentReference"/>
         </w:rPr>
         <w:annotationRef/>
       </w:r>
@@ -7858,11 +7733,11 @@
   <w:footnote w:id="1">
     <w:p>
       <w:pPr>
-        <w:pStyle w:val="Textonotapie"/>
+        <w:pStyle w:val="FootnoteText"/>
       </w:pPr>
       <w:r>
         <w:rPr>
-          <w:rStyle w:val="Refdenotaalpie"/>
+          <w:rStyle w:val="FootnoteReference"/>
         </w:rPr>
         <w:footnoteRef/>
       </w:r>
@@ -7874,11 +7749,11 @@
   <w:footnote w:id="2">
     <w:p>
       <w:pPr>
-        <w:pStyle w:val="Textonotapie"/>
+        <w:pStyle w:val="FootnoteText"/>
       </w:pPr>
       <w:r>
         <w:rPr>
-          <w:rStyle w:val="Refdenotaalpie"/>
+          <w:rStyle w:val="FootnoteReference"/>
         </w:rPr>
         <w:footnoteRef/>
       </w:r>
@@ -7913,15 +7788,7 @@
         <w:sz w:val="16"/>
         <w:szCs w:val="16"/>
       </w:rPr>
-      <w:t xml:space="preserve"> </w:t>
-    </w:r>
-    <w:r>
-      <w:rPr>
-        <w:color w:val="595959"/>
-        <w:sz w:val="16"/>
-        <w:szCs w:val="16"/>
-      </w:rPr>
-      <w:t>· Laboratorio de Métodos Cuantitativos · FCE UBA</w:t>
+      <w:t xml:space="preserve"> · Laboratorio de Métodos Cuantitativos · FCE UBA</w:t>
     </w:r>
   </w:p>
 </w:hdr>
@@ -9019,7 +8886,7 @@
     <w:lvl w:ilvl="0">
       <w:start w:val="1"/>
       <w:numFmt w:val="decimal"/>
-      <w:pStyle w:val="Ttulo1"/>
+      <w:pStyle w:val="Heading1"/>
       <w:lvlText w:val="%1"/>
       <w:lvlJc w:val="left"/>
       <w:pPr>
@@ -9029,7 +8896,7 @@
     <w:lvl w:ilvl="1">
       <w:start w:val="1"/>
       <w:numFmt w:val="decimal"/>
-      <w:pStyle w:val="Ttulo2"/>
+      <w:pStyle w:val="Heading2"/>
       <w:lvlText w:val="%1.%2"/>
       <w:lvlJc w:val="left"/>
       <w:pPr>
@@ -9039,7 +8906,7 @@
     <w:lvl w:ilvl="2">
       <w:start w:val="1"/>
       <w:numFmt w:val="decimal"/>
-      <w:pStyle w:val="Ttulo3"/>
+      <w:pStyle w:val="Heading3"/>
       <w:lvlText w:val="%1.%2.%3"/>
       <w:lvlJc w:val="left"/>
       <w:pPr>
@@ -9049,7 +8916,7 @@
     <w:lvl w:ilvl="3">
       <w:start w:val="1"/>
       <w:numFmt w:val="decimal"/>
-      <w:pStyle w:val="Ttulo4"/>
+      <w:pStyle w:val="Heading4"/>
       <w:lvlText w:val="%1.%2.%3.%4"/>
       <w:lvlJc w:val="left"/>
       <w:pPr>
@@ -9059,7 +8926,7 @@
     <w:lvl w:ilvl="4">
       <w:start w:val="1"/>
       <w:numFmt w:val="decimal"/>
-      <w:pStyle w:val="Ttulo5"/>
+      <w:pStyle w:val="Heading5"/>
       <w:lvlText w:val="%1.%2.%3.%4.%5"/>
       <w:lvlJc w:val="left"/>
       <w:pPr>
@@ -9069,7 +8936,7 @@
     <w:lvl w:ilvl="5">
       <w:start w:val="1"/>
       <w:numFmt w:val="decimal"/>
-      <w:pStyle w:val="Ttulo6"/>
+      <w:pStyle w:val="Heading6"/>
       <w:lvlText w:val="%1.%2.%3.%4.%5.%6"/>
       <w:lvlJc w:val="left"/>
       <w:pPr>
@@ -9079,7 +8946,7 @@
     <w:lvl w:ilvl="6">
       <w:start w:val="1"/>
       <w:numFmt w:val="decimal"/>
-      <w:pStyle w:val="Ttulo7"/>
+      <w:pStyle w:val="Heading7"/>
       <w:lvlText w:val="%1.%2.%3.%4.%5.%6.%7"/>
       <w:lvlJc w:val="left"/>
       <w:pPr>
@@ -9089,7 +8956,7 @@
     <w:lvl w:ilvl="7">
       <w:start w:val="1"/>
       <w:numFmt w:val="decimal"/>
-      <w:pStyle w:val="Ttulo8"/>
+      <w:pStyle w:val="Heading8"/>
       <w:lvlText w:val="%1.%2.%3.%4.%5.%6.%7.%8"/>
       <w:lvlJc w:val="left"/>
       <w:pPr>
@@ -9099,7 +8966,7 @@
     <w:lvl w:ilvl="8">
       <w:start w:val="1"/>
       <w:numFmt w:val="decimal"/>
-      <w:pStyle w:val="Ttulo9"/>
+      <w:pStyle w:val="Heading9"/>
       <w:lvlText w:val="%1.%2.%3.%4.%5.%6.%7.%8.%9"/>
       <w:lvlJc w:val="left"/>
       <w:pPr>
@@ -9551,7 +9418,7 @@
       <w:jc w:val="both"/>
     </w:pPr>
   </w:style>
-  <w:style w:type="paragraph" w:styleId="Ttulo1">
+  <w:style w:type="paragraph" w:styleId="Heading1">
     <w:name w:val="heading 1"/>
     <w:autoRedefine/>
     <w:uiPriority w:val="9"/>
@@ -9572,7 +9439,7 @@
       <w:szCs w:val="28"/>
     </w:rPr>
   </w:style>
-  <w:style w:type="paragraph" w:styleId="Ttulo2">
+  <w:style w:type="paragraph" w:styleId="Heading2">
     <w:name w:val="heading 2"/>
     <w:autoRedefine/>
     <w:uiPriority w:val="9"/>
@@ -9594,7 +9461,7 @@
       <w:szCs w:val="26"/>
     </w:rPr>
   </w:style>
-  <w:style w:type="paragraph" w:styleId="Ttulo3">
+  <w:style w:type="paragraph" w:styleId="Heading3">
     <w:name w:val="heading 3"/>
     <w:uiPriority w:val="9"/>
     <w:semiHidden/>
@@ -9613,7 +9480,7 @@
       <w:szCs w:val="24"/>
     </w:rPr>
   </w:style>
-  <w:style w:type="paragraph" w:styleId="Ttulo4">
+  <w:style w:type="paragraph" w:styleId="Heading4">
     <w:name w:val="heading 4"/>
     <w:uiPriority w:val="9"/>
     <w:semiHidden/>
@@ -9632,7 +9499,7 @@
       <w:color w:val="2E74B5"/>
     </w:rPr>
   </w:style>
-  <w:style w:type="paragraph" w:styleId="Ttulo5">
+  <w:style w:type="paragraph" w:styleId="Heading5">
     <w:name w:val="heading 5"/>
     <w:uiPriority w:val="9"/>
     <w:semiHidden/>
@@ -9649,7 +9516,7 @@
       <w:color w:val="2E74B5"/>
     </w:rPr>
   </w:style>
-  <w:style w:type="paragraph" w:styleId="Ttulo6">
+  <w:style w:type="paragraph" w:styleId="Heading6">
     <w:name w:val="heading 6"/>
     <w:uiPriority w:val="9"/>
     <w:semiHidden/>
@@ -9666,11 +9533,11 @@
       <w:color w:val="1F4D78"/>
     </w:rPr>
   </w:style>
-  <w:style w:type="paragraph" w:styleId="Ttulo7">
+  <w:style w:type="paragraph" w:styleId="Heading7">
     <w:name w:val="heading 7"/>
     <w:basedOn w:val="Normal"/>
     <w:next w:val="Normal"/>
-    <w:link w:val="Ttulo7Car"/>
+    <w:link w:val="Heading7Char"/>
     <w:uiPriority w:val="9"/>
     <w:semiHidden/>
     <w:unhideWhenUsed/>
@@ -9693,11 +9560,11 @@
       <w:color w:val="0A2F40" w:themeColor="accent1" w:themeShade="7F"/>
     </w:rPr>
   </w:style>
-  <w:style w:type="paragraph" w:styleId="Ttulo8">
+  <w:style w:type="paragraph" w:styleId="Heading8">
     <w:name w:val="heading 8"/>
     <w:basedOn w:val="Normal"/>
     <w:next w:val="Normal"/>
-    <w:link w:val="Ttulo8Car"/>
+    <w:link w:val="Heading8Char"/>
     <w:uiPriority w:val="9"/>
     <w:semiHidden/>
     <w:unhideWhenUsed/>
@@ -9720,11 +9587,11 @@
       <w:szCs w:val="21"/>
     </w:rPr>
   </w:style>
-  <w:style w:type="paragraph" w:styleId="Ttulo9">
+  <w:style w:type="paragraph" w:styleId="Heading9">
     <w:name w:val="heading 9"/>
     <w:basedOn w:val="Normal"/>
     <w:next w:val="Normal"/>
-    <w:link w:val="Ttulo9Car"/>
+    <w:link w:val="Heading9Char"/>
     <w:uiPriority w:val="9"/>
     <w:semiHidden/>
     <w:unhideWhenUsed/>
@@ -9749,12 +9616,13 @@
       <w:szCs w:val="21"/>
     </w:rPr>
   </w:style>
-  <w:style w:type="character" w:default="1" w:styleId="Fuentedeprrafopredeter">
+  <w:style w:type="character" w:default="1" w:styleId="DefaultParagraphFont">
     <w:name w:val="Default Paragraph Font"/>
     <w:uiPriority w:val="1"/>
+    <w:semiHidden/>
     <w:unhideWhenUsed/>
   </w:style>
-  <w:style w:type="table" w:default="1" w:styleId="Tablanormal">
+  <w:style w:type="table" w:default="1" w:styleId="TableNormal">
     <w:name w:val="Normal Table"/>
     <w:uiPriority w:val="99"/>
     <w:semiHidden/>
@@ -9769,13 +9637,13 @@
       </w:tblCellMar>
     </w:tblPr>
   </w:style>
-  <w:style w:type="numbering" w:default="1" w:styleId="Sinlista">
+  <w:style w:type="numbering" w:default="1" w:styleId="NoList">
     <w:name w:val="No List"/>
     <w:uiPriority w:val="99"/>
     <w:semiHidden/>
     <w:unhideWhenUsed/>
   </w:style>
-  <w:style w:type="paragraph" w:styleId="Ttulo">
+  <w:style w:type="paragraph" w:styleId="Title">
     <w:name w:val="Title"/>
     <w:uiPriority w:val="10"/>
     <w:qFormat/>
@@ -9792,11 +9660,11 @@
       <w:bCs/>
     </w:rPr>
   </w:style>
-  <w:style w:type="paragraph" w:styleId="Prrafodelista">
+  <w:style w:type="paragraph" w:styleId="ListParagraph">
     <w:name w:val="List Paragraph"/>
     <w:qFormat/>
   </w:style>
-  <w:style w:type="character" w:styleId="Hipervnculo">
+  <w:style w:type="character" w:styleId="Hyperlink">
     <w:name w:val="Hyperlink"/>
     <w:uiPriority w:val="99"/>
     <w:unhideWhenUsed/>
@@ -9805,7 +9673,7 @@
       <w:u w:val="single"/>
     </w:rPr>
   </w:style>
-  <w:style w:type="character" w:styleId="Refdenotaalpie">
+  <w:style w:type="character" w:styleId="FootnoteReference">
     <w:name w:val="footnote reference"/>
     <w:uiPriority w:val="99"/>
     <w:semiHidden/>
@@ -9814,9 +9682,9 @@
       <w:vertAlign w:val="superscript"/>
     </w:rPr>
   </w:style>
-  <w:style w:type="paragraph" w:styleId="Textonotapie">
+  <w:style w:type="paragraph" w:styleId="FootnoteText">
     <w:name w:val="footnote text"/>
-    <w:link w:val="TextonotapieCar"/>
+    <w:link w:val="FootnoteTextChar"/>
     <w:uiPriority w:val="99"/>
     <w:semiHidden/>
     <w:unhideWhenUsed/>
@@ -9825,9 +9693,9 @@
       <w:szCs w:val="20"/>
     </w:rPr>
   </w:style>
-  <w:style w:type="character" w:customStyle="1" w:styleId="TextonotapieCar">
-    <w:name w:val="Texto nota pie Car"/>
-    <w:link w:val="Textonotapie"/>
+  <w:style w:type="character" w:customStyle="1" w:styleId="FootnoteTextChar">
+    <w:name w:val="Footnote Text Char"/>
+    <w:link w:val="FootnoteText"/>
     <w:uiPriority w:val="99"/>
     <w:semiHidden/>
     <w:unhideWhenUsed/>
@@ -9836,7 +9704,7 @@
       <w:szCs w:val="20"/>
     </w:rPr>
   </w:style>
-  <w:style w:type="character" w:styleId="Refdenotaalfinal">
+  <w:style w:type="character" w:styleId="EndnoteReference">
     <w:name w:val="endnote reference"/>
     <w:uiPriority w:val="99"/>
     <w:semiHidden/>
@@ -9845,9 +9713,9 @@
       <w:vertAlign w:val="superscript"/>
     </w:rPr>
   </w:style>
-  <w:style w:type="paragraph" w:styleId="Textonotaalfinal">
+  <w:style w:type="paragraph" w:styleId="EndnoteText">
     <w:name w:val="endnote text"/>
-    <w:link w:val="TextonotaalfinalCar"/>
+    <w:link w:val="EndnoteTextChar"/>
     <w:uiPriority w:val="99"/>
     <w:semiHidden/>
     <w:unhideWhenUsed/>
@@ -9856,9 +9724,9 @@
       <w:szCs w:val="20"/>
     </w:rPr>
   </w:style>
-  <w:style w:type="character" w:customStyle="1" w:styleId="TextonotaalfinalCar">
-    <w:name w:val="Texto nota al final Car"/>
-    <w:link w:val="Textonotaalfinal"/>
+  <w:style w:type="character" w:customStyle="1" w:styleId="EndnoteTextChar">
+    <w:name w:val="Endnote Text Char"/>
+    <w:link w:val="EndnoteText"/>
     <w:uiPriority w:val="99"/>
     <w:semiHidden/>
     <w:unhideWhenUsed/>
@@ -9867,9 +9735,9 @@
       <w:szCs w:val="20"/>
     </w:rPr>
   </w:style>
-  <w:style w:type="character" w:styleId="Refdecomentario">
+  <w:style w:type="character" w:styleId="CommentReference">
     <w:name w:val="annotation reference"/>
-    <w:basedOn w:val="Fuentedeprrafopredeter"/>
+    <w:basedOn w:val="DefaultParagraphFont"/>
     <w:uiPriority w:val="99"/>
     <w:semiHidden/>
     <w:unhideWhenUsed/>
@@ -9879,10 +9747,10 @@
       <w:szCs w:val="16"/>
     </w:rPr>
   </w:style>
-  <w:style w:type="paragraph" w:styleId="Textocomentario">
+  <w:style w:type="paragraph" w:styleId="CommentText">
     <w:name w:val="annotation text"/>
     <w:basedOn w:val="Normal"/>
-    <w:link w:val="TextocomentarioCar"/>
+    <w:link w:val="CommentTextChar"/>
     <w:uiPriority w:val="99"/>
     <w:unhideWhenUsed/>
     <w:rsid w:val="00304914"/>
@@ -9898,10 +9766,10 @@
       <w:lang w:val="en-US" w:eastAsia="en-US"/>
     </w:rPr>
   </w:style>
-  <w:style w:type="character" w:customStyle="1" w:styleId="TextocomentarioCar">
-    <w:name w:val="Texto comentario Car"/>
-    <w:basedOn w:val="Fuentedeprrafopredeter"/>
-    <w:link w:val="Textocomentario"/>
+  <w:style w:type="character" w:customStyle="1" w:styleId="CommentTextChar">
+    <w:name w:val="Comment Text Char"/>
+    <w:basedOn w:val="DefaultParagraphFont"/>
+    <w:link w:val="CommentText"/>
     <w:uiPriority w:val="99"/>
     <w:rsid w:val="00304914"/>
     <w:rPr>
@@ -9912,9 +9780,9 @@
       <w:lang w:val="en-US" w:eastAsia="en-US"/>
     </w:rPr>
   </w:style>
-  <w:style w:type="table" w:styleId="Tablaconcuadrcula1clara">
+  <w:style w:type="table" w:styleId="GridTable1Light">
     <w:name w:val="Grid Table 1 Light"/>
-    <w:basedOn w:val="Tablanormal"/>
+    <w:basedOn w:val="TableNormal"/>
     <w:uiPriority w:val="46"/>
     <w:rsid w:val="00841880"/>
     <w:tblPr>
@@ -9966,7 +9834,7 @@
       </w:rPr>
     </w:tblStylePr>
   </w:style>
-  <w:style w:type="paragraph" w:styleId="Descripcin">
+  <w:style w:type="paragraph" w:styleId="Caption">
     <w:name w:val="caption"/>
     <w:basedOn w:val="Normal"/>
     <w:next w:val="Normal"/>
@@ -9985,10 +9853,10 @@
       <w:szCs w:val="18"/>
     </w:rPr>
   </w:style>
-  <w:style w:type="character" w:customStyle="1" w:styleId="Ttulo7Car">
-    <w:name w:val="Título 7 Car"/>
-    <w:basedOn w:val="Fuentedeprrafopredeter"/>
-    <w:link w:val="Ttulo7"/>
+  <w:style w:type="character" w:customStyle="1" w:styleId="Heading7Char">
+    <w:name w:val="Heading 7 Char"/>
+    <w:basedOn w:val="DefaultParagraphFont"/>
+    <w:link w:val="Heading7"/>
     <w:uiPriority w:val="9"/>
     <w:semiHidden/>
     <w:rsid w:val="000D24AA"/>
@@ -9999,10 +9867,10 @@
       <w:color w:val="0A2F40" w:themeColor="accent1" w:themeShade="7F"/>
     </w:rPr>
   </w:style>
-  <w:style w:type="character" w:customStyle="1" w:styleId="Ttulo8Car">
-    <w:name w:val="Título 8 Car"/>
-    <w:basedOn w:val="Fuentedeprrafopredeter"/>
-    <w:link w:val="Ttulo8"/>
+  <w:style w:type="character" w:customStyle="1" w:styleId="Heading8Char">
+    <w:name w:val="Heading 8 Char"/>
+    <w:basedOn w:val="DefaultParagraphFont"/>
+    <w:link w:val="Heading8"/>
     <w:uiPriority w:val="9"/>
     <w:semiHidden/>
     <w:rsid w:val="000D24AA"/>
@@ -10013,10 +9881,10 @@
       <w:szCs w:val="21"/>
     </w:rPr>
   </w:style>
-  <w:style w:type="character" w:customStyle="1" w:styleId="Ttulo9Car">
-    <w:name w:val="Título 9 Car"/>
-    <w:basedOn w:val="Fuentedeprrafopredeter"/>
-    <w:link w:val="Ttulo9"/>
+  <w:style w:type="character" w:customStyle="1" w:styleId="Heading9Char">
+    <w:name w:val="Heading 9 Char"/>
+    <w:basedOn w:val="DefaultParagraphFont"/>
+    <w:link w:val="Heading9"/>
     <w:uiPriority w:val="9"/>
     <w:semiHidden/>
     <w:rsid w:val="000D24AA"/>
@@ -10029,9 +9897,9 @@
       <w:szCs w:val="21"/>
     </w:rPr>
   </w:style>
-  <w:style w:type="character" w:styleId="Textodelmarcadordeposicin">
+  <w:style w:type="character" w:styleId="PlaceholderText">
     <w:name w:val="Placeholder Text"/>
-    <w:basedOn w:val="Fuentedeprrafopredeter"/>
+    <w:basedOn w:val="DefaultParagraphFont"/>
     <w:uiPriority w:val="99"/>
     <w:semiHidden/>
     <w:rsid w:val="00F42088"/>
@@ -10039,11 +9907,11 @@
       <w:color w:val="666666"/>
     </w:rPr>
   </w:style>
-  <w:style w:type="paragraph" w:styleId="Asuntodelcomentario">
+  <w:style w:type="paragraph" w:styleId="CommentSubject">
     <w:name w:val="annotation subject"/>
-    <w:basedOn w:val="Textocomentario"/>
-    <w:next w:val="Textocomentario"/>
-    <w:link w:val="AsuntodelcomentarioCar"/>
+    <w:basedOn w:val="CommentText"/>
+    <w:next w:val="CommentText"/>
+    <w:link w:val="CommentSubjectChar"/>
     <w:uiPriority w:val="99"/>
     <w:semiHidden/>
     <w:unhideWhenUsed/>
@@ -10059,10 +9927,10 @@
       <w:lang w:val="es-AR" w:eastAsia="es-AR"/>
     </w:rPr>
   </w:style>
-  <w:style w:type="character" w:customStyle="1" w:styleId="AsuntodelcomentarioCar">
-    <w:name w:val="Asunto del comentario Car"/>
-    <w:basedOn w:val="TextocomentarioCar"/>
-    <w:link w:val="Asuntodelcomentario"/>
+  <w:style w:type="character" w:customStyle="1" w:styleId="CommentSubjectChar">
+    <w:name w:val="Comment Subject Char"/>
+    <w:basedOn w:val="CommentTextChar"/>
+    <w:link w:val="CommentSubject"/>
     <w:uiPriority w:val="99"/>
     <w:semiHidden/>
     <w:rsid w:val="008C4106"/>
@@ -10076,9 +9944,9 @@
       <w:lang w:val="en-US" w:eastAsia="en-US"/>
     </w:rPr>
   </w:style>
-  <w:style w:type="table" w:styleId="Tablaconcuadrculaclara">
+  <w:style w:type="table" w:styleId="TableGridLight">
     <w:name w:val="Grid Table Light"/>
-    <w:basedOn w:val="Tablanormal"/>
+    <w:basedOn w:val="TableNormal"/>
     <w:uiPriority w:val="40"/>
     <w:rsid w:val="00D92212"/>
     <w:tblPr>
@@ -10092,10 +9960,10 @@
       </w:tblBorders>
     </w:tblPr>
   </w:style>
-  <w:style w:type="paragraph" w:styleId="Encabezado">
+  <w:style w:type="paragraph" w:styleId="Header">
     <w:name w:val="header"/>
     <w:basedOn w:val="Normal"/>
-    <w:link w:val="EncabezadoCar"/>
+    <w:link w:val="HeaderChar"/>
     <w:uiPriority w:val="99"/>
     <w:unhideWhenUsed/>
     <w:rsid w:val="00D92212"/>
@@ -10107,17 +9975,17 @@
       <w:spacing w:line="240" w:lineRule="auto"/>
     </w:pPr>
   </w:style>
-  <w:style w:type="character" w:customStyle="1" w:styleId="EncabezadoCar">
-    <w:name w:val="Encabezado Car"/>
-    <w:basedOn w:val="Fuentedeprrafopredeter"/>
-    <w:link w:val="Encabezado"/>
+  <w:style w:type="character" w:customStyle="1" w:styleId="HeaderChar">
+    <w:name w:val="Header Char"/>
+    <w:basedOn w:val="DefaultParagraphFont"/>
+    <w:link w:val="Header"/>
     <w:uiPriority w:val="99"/>
     <w:rsid w:val="00D92212"/>
   </w:style>
-  <w:style w:type="paragraph" w:styleId="Piedepgina">
+  <w:style w:type="paragraph" w:styleId="Footer">
     <w:name w:val="footer"/>
     <w:basedOn w:val="Normal"/>
-    <w:link w:val="PiedepginaCar"/>
+    <w:link w:val="FooterChar"/>
     <w:uiPriority w:val="99"/>
     <w:unhideWhenUsed/>
     <w:rsid w:val="00D92212"/>
@@ -10129,16 +9997,16 @@
       <w:spacing w:line="240" w:lineRule="auto"/>
     </w:pPr>
   </w:style>
-  <w:style w:type="character" w:customStyle="1" w:styleId="PiedepginaCar">
-    <w:name w:val="Pie de página Car"/>
-    <w:basedOn w:val="Fuentedeprrafopredeter"/>
-    <w:link w:val="Piedepgina"/>
+  <w:style w:type="character" w:customStyle="1" w:styleId="FooterChar">
+    <w:name w:val="Footer Char"/>
+    <w:basedOn w:val="DefaultParagraphFont"/>
+    <w:link w:val="Footer"/>
     <w:uiPriority w:val="99"/>
     <w:rsid w:val="00D92212"/>
   </w:style>
-  <w:style w:type="paragraph" w:styleId="TtuloTDC">
+  <w:style w:type="paragraph" w:styleId="TOCHeading">
     <w:name w:val="TOC Heading"/>
-    <w:basedOn w:val="Ttulo1"/>
+    <w:basedOn w:val="Heading1"/>
     <w:next w:val="Normal"/>
     <w:uiPriority w:val="39"/>
     <w:unhideWhenUsed/>
@@ -10162,7 +10030,7 @@
       <w:szCs w:val="32"/>
     </w:rPr>
   </w:style>
-  <w:style w:type="paragraph" w:styleId="TDC1">
+  <w:style w:type="paragraph" w:styleId="TOC1">
     <w:name w:val="toc 1"/>
     <w:basedOn w:val="Normal"/>
     <w:next w:val="Normal"/>
@@ -10174,7 +10042,7 @@
       <w:spacing w:after="100"/>
     </w:pPr>
   </w:style>
-  <w:style w:type="paragraph" w:styleId="TDC2">
+  <w:style w:type="paragraph" w:styleId="TOC2">
     <w:name w:val="toc 2"/>
     <w:basedOn w:val="Normal"/>
     <w:next w:val="Normal"/>
@@ -10187,7 +10055,7 @@
       <w:ind w:left="220"/>
     </w:pPr>
   </w:style>
-  <w:style w:type="paragraph" w:styleId="Tabladeilustraciones">
+  <w:style w:type="paragraph" w:styleId="TableofFigures">
     <w:name w:val="table of figures"/>
     <w:basedOn w:val="Normal"/>
     <w:next w:val="Normal"/>
@@ -10195,9 +10063,9 @@
     <w:unhideWhenUsed/>
     <w:rsid w:val="00F61612"/>
   </w:style>
-  <w:style w:type="character" w:styleId="Mencinsinresolver">
+  <w:style w:type="character" w:styleId="UnresolvedMention">
     <w:name w:val="Unresolved Mention"/>
-    <w:basedOn w:val="Fuentedeprrafopredeter"/>
+    <w:basedOn w:val="DefaultParagraphFont"/>
     <w:uiPriority w:val="99"/>
     <w:semiHidden/>
     <w:unhideWhenUsed/>

</xml_diff>

<commit_message>
doc: modificacion de un grafico del informe
</commit_message>
<xml_diff>
--- a/informe/Informe_TPGrupal_Mundial_2026.docx
+++ b/informe/Informe_TPGrupal_Mundial_2026.docx
@@ -224,8 +224,13 @@
           </w:tcPr>
           <w:p>
             <w:r>
-              <w:t>Leonardo Gomez</w:t>
-            </w:r>
+              <w:t xml:space="preserve">Leonardo </w:t>
+            </w:r>
+            <w:proofErr w:type="spellStart"/>
+            <w:r>
+              <w:t>Gomez</w:t>
+            </w:r>
+            <w:proofErr w:type="spellEnd"/>
           </w:p>
         </w:tc>
         <w:tc>
@@ -278,9 +283,11 @@
             <w:hideMark/>
           </w:tcPr>
           <w:p>
+            <w:proofErr w:type="spellStart"/>
             <w:r>
               <w:t>cargaribotti</w:t>
             </w:r>
+            <w:proofErr w:type="spellEnd"/>
           </w:p>
         </w:tc>
       </w:tr>
@@ -313,9 +320,11 @@
             <w:hideMark/>
           </w:tcPr>
           <w:p>
+            <w:proofErr w:type="spellStart"/>
             <w:r>
               <w:t>FMorichetti</w:t>
             </w:r>
+            <w:proofErr w:type="spellEnd"/>
           </w:p>
         </w:tc>
       </w:tr>
@@ -347,8 +356,13 @@
         <w:spacing w:line="240" w:lineRule="auto"/>
         <w:jc w:val="center"/>
       </w:pPr>
-      <w:r>
-        <w:t xml:space="preserve">Link al repositorio: </w:t>
+      <w:proofErr w:type="gramStart"/>
+      <w:r>
+        <w:t>Link</w:t>
+      </w:r>
+      <w:proofErr w:type="gramEnd"/>
+      <w:r>
+        <w:t xml:space="preserve"> al repositorio: </w:t>
       </w:r>
       <w:hyperlink r:id="rId8" w:history="1">
         <w:r>
@@ -373,15 +387,28 @@
         </w:rPr>
         <w:t xml:space="preserve">Web url: </w:t>
       </w:r>
-      <w:hyperlink r:id="rId9" w:history="1">
-        <w:r>
-          <w:rPr>
-            <w:rStyle w:val="Hyperlink"/>
-            <w:lang w:val="en-US"/>
-          </w:rPr>
-          <w:t>https://gleo1973.github.io/tp-laboratorio-mcag-1c2026/</w:t>
-        </w:r>
-      </w:hyperlink>
+      <w:r>
+        <w:fldChar w:fldCharType="begin"/>
+      </w:r>
+      <w:r>
+        <w:rPr>
+          <w:lang w:val="en-GB"/>
+        </w:rPr>
+        <w:instrText>HYPERLINK "https://gleo1973.github.io/tp-laboratorio-mcag-1c2026/"</w:instrText>
+      </w:r>
+      <w:r>
+        <w:fldChar w:fldCharType="separate"/>
+      </w:r>
+      <w:r>
+        <w:rPr>
+          <w:rStyle w:val="Hyperlink"/>
+          <w:lang w:val="en-US"/>
+        </w:rPr>
+        <w:t>https://gleo1973.github.io/tp-laboratorio-mcag-1c2026/</w:t>
+      </w:r>
+      <w:r>
+        <w:fldChar w:fldCharType="end"/>
+      </w:r>
     </w:p>
     <w:p>
       <w:pPr>
@@ -453,6 +480,7 @@
               <w:lang w:val="en-US"/>
             </w:rPr>
           </w:pPr>
+          <w:proofErr w:type="spellStart"/>
           <w:r>
             <w:rPr>
               <w:rFonts w:ascii="Georgia" w:hAnsi="Georgia"/>
@@ -465,6 +493,7 @@
             </w:rPr>
             <w:t>Índice</w:t>
           </w:r>
+          <w:proofErr w:type="spellEnd"/>
         </w:p>
         <w:p>
           <w:pPr>
@@ -2172,11 +2201,7 @@
         <w:spacing w:after="240" w:line="240" w:lineRule="auto"/>
         <w:jc w:val="left"/>
         <w:rPr>
-          <w:b/>
-          <w:bCs/>
           <w:noProof/>
-          <w:sz w:val="24"/>
-          <w:szCs w:val="24"/>
         </w:rPr>
       </w:pPr>
       <w:r>
@@ -2216,7 +2241,6 @@
         <w:tabs>
           <w:tab w:val="right" w:leader="dot" w:pos="9350"/>
         </w:tabs>
-        <w:jc w:val="left"/>
         <w:rPr>
           <w:rFonts w:asciiTheme="minorHAnsi" w:eastAsiaTheme="minorEastAsia" w:hAnsiTheme="minorHAnsi" w:cstheme="minorBidi"/>
           <w:noProof/>
@@ -2224,7 +2248,7 @@
           <w14:ligatures w14:val="standardContextual"/>
         </w:rPr>
       </w:pPr>
-      <w:hyperlink w:anchor="_Toc231472828" w:history="1">
+      <w:hyperlink w:anchor="_Toc231503934" w:history="1">
         <w:r>
           <w:rPr>
             <w:rStyle w:val="Hyperlink"/>
@@ -2259,95 +2283,7 @@
             <w:sz w:val="20"/>
             <w:szCs w:val="20"/>
           </w:rPr>
-          <w:instrText xml:space="preserve"> PAGEREF _Toc231472828 \h </w:instrText>
-        </w:r>
-        <w:r>
-          <w:rPr>
-            <w:noProof/>
-            <w:webHidden/>
-            <w:sz w:val="20"/>
-            <w:szCs w:val="20"/>
-          </w:rPr>
-        </w:r>
-        <w:r>
-          <w:rPr>
-            <w:noProof/>
-            <w:webHidden/>
-            <w:sz w:val="20"/>
-            <w:szCs w:val="20"/>
-          </w:rPr>
-          <w:fldChar w:fldCharType="separate"/>
-        </w:r>
-        <w:r>
-          <w:rPr>
-            <w:noProof/>
-            <w:webHidden/>
-            <w:sz w:val="20"/>
-            <w:szCs w:val="20"/>
-          </w:rPr>
-          <w:t>6</w:t>
-        </w:r>
-        <w:r>
-          <w:rPr>
-            <w:noProof/>
-            <w:webHidden/>
-            <w:sz w:val="20"/>
-            <w:szCs w:val="20"/>
-          </w:rPr>
-          <w:fldChar w:fldCharType="end"/>
-        </w:r>
-      </w:hyperlink>
-    </w:p>
-    <w:p>
-      <w:pPr>
-        <w:pStyle w:val="TableofFigures"/>
-        <w:tabs>
-          <w:tab w:val="right" w:leader="dot" w:pos="9350"/>
-        </w:tabs>
-        <w:jc w:val="left"/>
-        <w:rPr>
-          <w:rFonts w:asciiTheme="minorHAnsi" w:eastAsiaTheme="minorEastAsia" w:hAnsiTheme="minorHAnsi" w:cstheme="minorBidi"/>
-          <w:noProof/>
-          <w:kern w:val="2"/>
-          <w14:ligatures w14:val="standardContextual"/>
-        </w:rPr>
-      </w:pPr>
-      <w:hyperlink w:anchor="_Toc231472829" w:history="1">
-        <w:r>
-          <w:rPr>
-            <w:rStyle w:val="Hyperlink"/>
-            <w:noProof/>
-            <w:sz w:val="20"/>
-            <w:szCs w:val="20"/>
-          </w:rPr>
-          <w:t>Figura 2:Distribución del puntaje FIFA por continente de origen de la selección.</w:t>
-        </w:r>
-        <w:r>
-          <w:rPr>
-            <w:noProof/>
-            <w:webHidden/>
-            <w:sz w:val="20"/>
-            <w:szCs w:val="20"/>
-          </w:rPr>
-          <w:tab/>
-        </w:r>
-        <w:r>
-          <w:rPr>
-            <w:noProof/>
-            <w:webHidden/>
-            <w:sz w:val="20"/>
-            <w:szCs w:val="20"/>
-          </w:rPr>
-          <w:fldChar w:fldCharType="begin"/>
-        </w:r>
-        <w:r>
-          <w:rPr>
-            <w:noProof/>
-            <w:webHidden/>
-            <w:sz w:val="20"/>
-            <w:szCs w:val="20"/>
-          </w:rPr>
-          <w:instrText xml:space="preserve"> PAGEREF _Toc231472829 \h </w:instrText>
+          <w:instrText xml:space="preserve"> PAGEREF _Toc231503934 \h </w:instrText>
         </w:r>
         <w:r>
           <w:rPr>
@@ -2392,7 +2328,6 @@
         <w:tabs>
           <w:tab w:val="right" w:leader="dot" w:pos="9350"/>
         </w:tabs>
-        <w:jc w:val="left"/>
         <w:rPr>
           <w:rFonts w:asciiTheme="minorHAnsi" w:eastAsiaTheme="minorEastAsia" w:hAnsiTheme="minorHAnsi" w:cstheme="minorBidi"/>
           <w:noProof/>
@@ -2400,7 +2335,7 @@
           <w14:ligatures w14:val="standardContextual"/>
         </w:rPr>
       </w:pPr>
-      <w:hyperlink w:anchor="_Toc231472830" w:history="1">
+      <w:hyperlink w:anchor="_Toc231503935" w:history="1">
         <w:r>
           <w:rPr>
             <w:rStyle w:val="Hyperlink"/>
@@ -2408,7 +2343,7 @@
             <w:sz w:val="20"/>
             <w:szCs w:val="20"/>
           </w:rPr>
-          <w:t>Figura 3: Distribución del puntaje FIFA por idioma mayoritario del país de origen de la selección (para idiomas que son hablados en 3 países o más).</w:t>
+          <w:t>Figura 2: Distribución del puntaje FIFA por continente de origen de la selección.</w:t>
         </w:r>
         <w:r>
           <w:rPr>
@@ -2435,95 +2370,7 @@
             <w:sz w:val="20"/>
             <w:szCs w:val="20"/>
           </w:rPr>
-          <w:instrText xml:space="preserve"> PAGEREF _Toc231472830 \h </w:instrText>
-        </w:r>
-        <w:r>
-          <w:rPr>
-            <w:noProof/>
-            <w:webHidden/>
-            <w:sz w:val="20"/>
-            <w:szCs w:val="20"/>
-          </w:rPr>
-        </w:r>
-        <w:r>
-          <w:rPr>
-            <w:noProof/>
-            <w:webHidden/>
-            <w:sz w:val="20"/>
-            <w:szCs w:val="20"/>
-          </w:rPr>
-          <w:fldChar w:fldCharType="separate"/>
-        </w:r>
-        <w:r>
-          <w:rPr>
-            <w:noProof/>
-            <w:webHidden/>
-            <w:sz w:val="20"/>
-            <w:szCs w:val="20"/>
-          </w:rPr>
-          <w:t>7</w:t>
-        </w:r>
-        <w:r>
-          <w:rPr>
-            <w:noProof/>
-            <w:webHidden/>
-            <w:sz w:val="20"/>
-            <w:szCs w:val="20"/>
-          </w:rPr>
-          <w:fldChar w:fldCharType="end"/>
-        </w:r>
-      </w:hyperlink>
-    </w:p>
-    <w:p>
-      <w:pPr>
-        <w:pStyle w:val="TableofFigures"/>
-        <w:tabs>
-          <w:tab w:val="right" w:leader="dot" w:pos="9350"/>
-        </w:tabs>
-        <w:jc w:val="left"/>
-        <w:rPr>
-          <w:rFonts w:asciiTheme="minorHAnsi" w:eastAsiaTheme="minorEastAsia" w:hAnsiTheme="minorHAnsi" w:cstheme="minorBidi"/>
-          <w:noProof/>
-          <w:kern w:val="2"/>
-          <w14:ligatures w14:val="standardContextual"/>
-        </w:rPr>
-      </w:pPr>
-      <w:hyperlink w:anchor="_Toc231472831" w:history="1">
-        <w:r>
-          <w:rPr>
-            <w:rStyle w:val="Hyperlink"/>
-            <w:noProof/>
-            <w:sz w:val="20"/>
-            <w:szCs w:val="20"/>
-          </w:rPr>
-          <w:t>Figura 4:Distribución del puntaje FIFA por religión principal del país de origen de la selección.</w:t>
-        </w:r>
-        <w:r>
-          <w:rPr>
-            <w:noProof/>
-            <w:webHidden/>
-            <w:sz w:val="20"/>
-            <w:szCs w:val="20"/>
-          </w:rPr>
-          <w:tab/>
-        </w:r>
-        <w:r>
-          <w:rPr>
-            <w:noProof/>
-            <w:webHidden/>
-            <w:sz w:val="20"/>
-            <w:szCs w:val="20"/>
-          </w:rPr>
-          <w:fldChar w:fldCharType="begin"/>
-        </w:r>
-        <w:r>
-          <w:rPr>
-            <w:noProof/>
-            <w:webHidden/>
-            <w:sz w:val="20"/>
-            <w:szCs w:val="20"/>
-          </w:rPr>
-          <w:instrText xml:space="preserve"> PAGEREF _Toc231472831 \h </w:instrText>
+          <w:instrText xml:space="preserve"> PAGEREF _Toc231503935 \h </w:instrText>
         </w:r>
         <w:r>
           <w:rPr>
@@ -2568,7 +2415,6 @@
         <w:tabs>
           <w:tab w:val="right" w:leader="dot" w:pos="9350"/>
         </w:tabs>
-        <w:jc w:val="left"/>
         <w:rPr>
           <w:rFonts w:asciiTheme="minorHAnsi" w:eastAsiaTheme="minorEastAsia" w:hAnsiTheme="minorHAnsi" w:cstheme="minorBidi"/>
           <w:noProof/>
@@ -2576,7 +2422,7 @@
           <w14:ligatures w14:val="standardContextual"/>
         </w:rPr>
       </w:pPr>
-      <w:hyperlink w:anchor="_Toc231472832" w:history="1">
+      <w:hyperlink w:anchor="_Toc231503936" w:history="1">
         <w:r>
           <w:rPr>
             <w:rStyle w:val="Hyperlink"/>
@@ -2584,7 +2430,7 @@
             <w:sz w:val="20"/>
             <w:szCs w:val="20"/>
           </w:rPr>
-          <w:t>Figura 5: Distribución de religiones entre los países participantes del torneo.</w:t>
+          <w:t>Figura 3: Distribución del puntaje FIFA por idioma mayoritario del país de origen de la selección (para idiomas que son hablados en 3 países o más).</w:t>
         </w:r>
         <w:r>
           <w:rPr>
@@ -2611,7 +2457,7 @@
             <w:sz w:val="20"/>
             <w:szCs w:val="20"/>
           </w:rPr>
-          <w:instrText xml:space="preserve"> PAGEREF _Toc231472832 \h </w:instrText>
+          <w:instrText xml:space="preserve"> PAGEREF _Toc231503936 \h </w:instrText>
         </w:r>
         <w:r>
           <w:rPr>
@@ -2656,7 +2502,6 @@
         <w:tabs>
           <w:tab w:val="right" w:leader="dot" w:pos="9350"/>
         </w:tabs>
-        <w:jc w:val="left"/>
         <w:rPr>
           <w:rFonts w:asciiTheme="minorHAnsi" w:eastAsiaTheme="minorEastAsia" w:hAnsiTheme="minorHAnsi" w:cstheme="minorBidi"/>
           <w:noProof/>
@@ -2664,7 +2509,7 @@
           <w14:ligatures w14:val="standardContextual"/>
         </w:rPr>
       </w:pPr>
-      <w:hyperlink w:anchor="_Toc231472833" w:history="1">
+      <w:hyperlink w:anchor="_Toc231503937" w:history="1">
         <w:r>
           <w:rPr>
             <w:rStyle w:val="Hyperlink"/>
@@ -2672,7 +2517,7 @@
             <w:sz w:val="20"/>
             <w:szCs w:val="20"/>
           </w:rPr>
-          <w:t>Figura 6: Relación entre el valor del plantel (miles de millones de euros) y el puntaje FIFA, según continente.</w:t>
+          <w:t>Figura 4: Distribución del puntaje FIFA por religión principal del país de origen de la selección y distribución de religiones entre los países participantes del torneo.</w:t>
         </w:r>
         <w:r>
           <w:rPr>
@@ -2699,7 +2544,7 @@
             <w:sz w:val="20"/>
             <w:szCs w:val="20"/>
           </w:rPr>
-          <w:instrText xml:space="preserve"> PAGEREF _Toc231472833 \h </w:instrText>
+          <w:instrText xml:space="preserve"> PAGEREF _Toc231503937 \h </w:instrText>
         </w:r>
         <w:r>
           <w:rPr>
@@ -2744,7 +2589,6 @@
         <w:tabs>
           <w:tab w:val="right" w:leader="dot" w:pos="9350"/>
         </w:tabs>
-        <w:jc w:val="left"/>
         <w:rPr>
           <w:rFonts w:asciiTheme="minorHAnsi" w:eastAsiaTheme="minorEastAsia" w:hAnsiTheme="minorHAnsi" w:cstheme="minorBidi"/>
           <w:noProof/>
@@ -2752,7 +2596,7 @@
           <w14:ligatures w14:val="standardContextual"/>
         </w:rPr>
       </w:pPr>
-      <w:hyperlink w:anchor="_Toc231472834" w:history="1">
+      <w:hyperlink w:anchor="_Toc231503938" w:history="1">
         <w:r>
           <w:rPr>
             <w:rStyle w:val="Hyperlink"/>
@@ -2760,7 +2604,7 @@
             <w:sz w:val="20"/>
             <w:szCs w:val="20"/>
           </w:rPr>
-          <w:t>Figura 7: Ajuste de modelos</w:t>
+          <w:t>Figura 6: Relación entre el valor del plantel (miles de millones de euros) y el puntaje FIFA, según continente.</w:t>
         </w:r>
         <w:r>
           <w:rPr>
@@ -2787,7 +2631,7 @@
             <w:sz w:val="20"/>
             <w:szCs w:val="20"/>
           </w:rPr>
-          <w:instrText xml:space="preserve"> PAGEREF _Toc231472834 \h </w:instrText>
+          <w:instrText xml:space="preserve"> PAGEREF _Toc231503938 \h </w:instrText>
         </w:r>
         <w:r>
           <w:rPr>
@@ -2832,7 +2676,6 @@
         <w:tabs>
           <w:tab w:val="right" w:leader="dot" w:pos="9350"/>
         </w:tabs>
-        <w:jc w:val="left"/>
         <w:rPr>
           <w:rFonts w:asciiTheme="minorHAnsi" w:eastAsiaTheme="minorEastAsia" w:hAnsiTheme="minorHAnsi" w:cstheme="minorBidi"/>
           <w:noProof/>
@@ -2840,7 +2683,94 @@
           <w14:ligatures w14:val="standardContextual"/>
         </w:rPr>
       </w:pPr>
-      <w:hyperlink w:anchor="_Toc231472835" w:history="1">
+      <w:hyperlink w:anchor="_Toc231503939" w:history="1">
+        <w:r>
+          <w:rPr>
+            <w:rStyle w:val="Hyperlink"/>
+            <w:noProof/>
+            <w:sz w:val="20"/>
+            <w:szCs w:val="20"/>
+          </w:rPr>
+          <w:t>Figura 7: Ajuste de modelos</w:t>
+        </w:r>
+        <w:r>
+          <w:rPr>
+            <w:noProof/>
+            <w:webHidden/>
+            <w:sz w:val="20"/>
+            <w:szCs w:val="20"/>
+          </w:rPr>
+          <w:tab/>
+        </w:r>
+        <w:r>
+          <w:rPr>
+            <w:noProof/>
+            <w:webHidden/>
+            <w:sz w:val="20"/>
+            <w:szCs w:val="20"/>
+          </w:rPr>
+          <w:fldChar w:fldCharType="begin"/>
+        </w:r>
+        <w:r>
+          <w:rPr>
+            <w:noProof/>
+            <w:webHidden/>
+            <w:sz w:val="20"/>
+            <w:szCs w:val="20"/>
+          </w:rPr>
+          <w:instrText xml:space="preserve"> PAGEREF _Toc231503939 \h </w:instrText>
+        </w:r>
+        <w:r>
+          <w:rPr>
+            <w:noProof/>
+            <w:webHidden/>
+            <w:sz w:val="20"/>
+            <w:szCs w:val="20"/>
+          </w:rPr>
+        </w:r>
+        <w:r>
+          <w:rPr>
+            <w:noProof/>
+            <w:webHidden/>
+            <w:sz w:val="20"/>
+            <w:szCs w:val="20"/>
+          </w:rPr>
+          <w:fldChar w:fldCharType="separate"/>
+        </w:r>
+        <w:r>
+          <w:rPr>
+            <w:noProof/>
+            <w:webHidden/>
+            <w:sz w:val="20"/>
+            <w:szCs w:val="20"/>
+          </w:rPr>
+          <w:t>11</w:t>
+        </w:r>
+        <w:r>
+          <w:rPr>
+            <w:noProof/>
+            <w:webHidden/>
+            <w:sz w:val="20"/>
+            <w:szCs w:val="20"/>
+          </w:rPr>
+          <w:fldChar w:fldCharType="end"/>
+        </w:r>
+      </w:hyperlink>
+    </w:p>
+    <w:p>
+      <w:pPr>
+        <w:pStyle w:val="TableofFigures"/>
+        <w:tabs>
+          <w:tab w:val="right" w:leader="dot" w:pos="9350"/>
+        </w:tabs>
+        <w:rPr>
+          <w:rFonts w:asciiTheme="minorHAnsi" w:eastAsiaTheme="minorEastAsia" w:hAnsiTheme="minorHAnsi" w:cstheme="minorBidi"/>
+          <w:noProof/>
+          <w:kern w:val="2"/>
+          <w14:ligatures w14:val="standardContextual"/>
+        </w:rPr>
+      </w:pPr>
+      <w:hyperlink w:anchor="_Toc231503940" w:history="1">
         <w:r>
           <w:rPr>
             <w:rStyle w:val="Hyperlink"/>
@@ -2875,7 +2805,7 @@
             <w:sz w:val="20"/>
             <w:szCs w:val="20"/>
           </w:rPr>
-          <w:instrText xml:space="preserve"> PAGEREF _Toc231472835 \h </w:instrText>
+          <w:instrText xml:space="preserve"> PAGEREF _Toc231503940 \h </w:instrText>
         </w:r>
         <w:r>
           <w:rPr>
@@ -2901,7 +2831,7 @@
             <w:sz w:val="20"/>
             <w:szCs w:val="20"/>
           </w:rPr>
-          <w:t>10</w:t>
+          <w:t>11</w:t>
         </w:r>
         <w:r>
           <w:rPr>
@@ -2920,7 +2850,6 @@
         <w:tabs>
           <w:tab w:val="right" w:leader="dot" w:pos="9350"/>
         </w:tabs>
-        <w:jc w:val="left"/>
         <w:rPr>
           <w:rFonts w:asciiTheme="minorHAnsi" w:eastAsiaTheme="minorEastAsia" w:hAnsiTheme="minorHAnsi" w:cstheme="minorBidi"/>
           <w:noProof/>
@@ -2928,7 +2857,7 @@
           <w14:ligatures w14:val="standardContextual"/>
         </w:rPr>
       </w:pPr>
-      <w:hyperlink w:anchor="_Toc231472836" w:history="1">
+      <w:hyperlink w:anchor="_Toc231503941" w:history="1">
         <w:r>
           <w:rPr>
             <w:rStyle w:val="Hyperlink"/>
@@ -2963,7 +2892,7 @@
             <w:sz w:val="20"/>
             <w:szCs w:val="20"/>
           </w:rPr>
-          <w:instrText xml:space="preserve"> PAGEREF _Toc231472836 \h </w:instrText>
+          <w:instrText xml:space="preserve"> PAGEREF _Toc231503941 \h </w:instrText>
         </w:r>
         <w:r>
           <w:rPr>
@@ -2989,7 +2918,7 @@
             <w:sz w:val="20"/>
             <w:szCs w:val="20"/>
           </w:rPr>
-          <w:t>12</w:t>
+          <w:t>13</w:t>
         </w:r>
         <w:r>
           <w:rPr>
@@ -3081,7 +3010,15 @@
         <w:t>el plantel. El análisis de correlación revela que los indicadores macro —producto bruto interno, PBI per cápita, población</w:t>
       </w:r>
       <w:r>
-        <w:t xml:space="preserve">, etc </w:t>
+        <w:t xml:space="preserve">, </w:t>
+      </w:r>
+      <w:proofErr w:type="spellStart"/>
+      <w:r>
+        <w:t>etc</w:t>
+      </w:r>
+      <w:proofErr w:type="spellEnd"/>
+      <w:r>
+        <w:t xml:space="preserve"> </w:t>
       </w:r>
       <w:r>
         <w:t xml:space="preserve">— no presentan asociación relevante con el puntaje FIFA, mientras que el valor de mercado del plantel exhibe una correlación fuerte (r = 0,77). </w:t>
@@ -3268,7 +3205,15 @@
         <w:t>será evaluada</w:t>
       </w:r>
       <w:r>
-        <w:t xml:space="preserve"> la naturaleza de la misma y sus consecuencias. </w:t>
+        <w:t xml:space="preserve"> la naturaleza de </w:t>
+      </w:r>
+      <w:proofErr w:type="gramStart"/>
+      <w:r>
+        <w:t>la misma</w:t>
+      </w:r>
+      <w:proofErr w:type="gramEnd"/>
+      <w:r>
+        <w:t xml:space="preserve"> y sus consecuencias. </w:t>
       </w:r>
     </w:p>
     <w:p>
@@ -3280,24 +3225,59 @@
           <w:i/>
           <w:iCs/>
         </w:rPr>
-        <w:t>FIFA World Cup Team Dataset</w:t>
-      </w:r>
-      <w:r>
-        <w:t xml:space="preserve"> (Kaggle), reúne el historial competitivo, el valor de mercado y la posición en el ranking de las cuarenta y ocho selecciones participantes</w:t>
-      </w:r>
-      <w:r>
-        <w:t xml:space="preserve"> de la Copa del Mundo 2026</w:t>
-      </w:r>
-      <w:r>
-        <w:t xml:space="preserve">. La segunda, </w:t>
-      </w:r>
+        <w:t xml:space="preserve">FIFA World Cup Team </w:t>
+      </w:r>
+      <w:proofErr w:type="spellStart"/>
       <w:r>
         <w:rPr>
           <w:i/>
           <w:iCs/>
         </w:rPr>
-        <w:t>Countries Database</w:t>
-      </w:r>
+        <w:t>Dataset</w:t>
+      </w:r>
+      <w:proofErr w:type="spellEnd"/>
+      <w:r>
+        <w:t xml:space="preserve"> (</w:t>
+      </w:r>
+      <w:proofErr w:type="spellStart"/>
+      <w:r>
+        <w:t>Kaggle</w:t>
+      </w:r>
+      <w:proofErr w:type="spellEnd"/>
+      <w:r>
+        <w:t>), reúne el historial competitivo, el valor de mercado y la posición en el ranking de las cuarenta y ocho selecciones participantes</w:t>
+      </w:r>
+      <w:r>
+        <w:t xml:space="preserve"> de la Copa del Mundo 2026</w:t>
+      </w:r>
+      <w:r>
+        <w:t xml:space="preserve">. La segunda, </w:t>
+      </w:r>
+      <w:proofErr w:type="spellStart"/>
+      <w:r>
+        <w:rPr>
+          <w:i/>
+          <w:iCs/>
+        </w:rPr>
+        <w:t>Countries</w:t>
+      </w:r>
+      <w:proofErr w:type="spellEnd"/>
+      <w:r>
+        <w:rPr>
+          <w:i/>
+          <w:iCs/>
+        </w:rPr>
+        <w:t xml:space="preserve"> </w:t>
+      </w:r>
+      <w:proofErr w:type="spellStart"/>
+      <w:r>
+        <w:rPr>
+          <w:i/>
+          <w:iCs/>
+        </w:rPr>
+        <w:t>Database</w:t>
+      </w:r>
+      <w:proofErr w:type="spellEnd"/>
       <w:r>
         <w:t xml:space="preserve"> (simplemaps.com), aporta indicadores demográficos y económicos de doscientos cincuenta y tres países. La unidad de análisis es la selección nacional, y la variable de interés es el puntaje FIFA previo al torneo.</w:t>
       </w:r>
@@ -3334,6 +3314,7 @@
       <w:r>
         <w:t xml:space="preserve">Se integraron dos conjuntos de datos mediante operaciones de </w:t>
       </w:r>
+      <w:proofErr w:type="spellStart"/>
       <w:r>
         <w:rPr>
           <w:i/>
@@ -3341,6 +3322,7 @@
         </w:rPr>
         <w:t>merge</w:t>
       </w:r>
+      <w:proofErr w:type="spellEnd"/>
       <w:r>
         <w:t>:</w:t>
       </w:r>
@@ -3371,6 +3353,7 @@
             <w:pPr>
               <w:jc w:val="center"/>
             </w:pPr>
+            <w:proofErr w:type="spellStart"/>
             <w:r>
               <w:rPr>
                 <w:color w:val="FFFFFF"/>
@@ -3379,6 +3362,7 @@
               </w:rPr>
               <w:t>Dataset</w:t>
             </w:r>
+            <w:proofErr w:type="spellEnd"/>
           </w:p>
         </w:tc>
         <w:tc>
@@ -3445,12 +3429,21 @@
             <w:tcW w:w="3000" w:type="dxa"/>
           </w:tcPr>
           <w:p>
-            <w:r>
-              <w:rPr>
-                <w:sz w:val="20"/>
-                <w:szCs w:val="20"/>
-              </w:rPr>
-              <w:t xml:space="preserve">Kaggle </w:t>
+            <w:proofErr w:type="spellStart"/>
+            <w:r>
+              <w:rPr>
+                <w:sz w:val="20"/>
+                <w:szCs w:val="20"/>
+              </w:rPr>
+              <w:t>Kaggle</w:t>
+            </w:r>
+            <w:proofErr w:type="spellEnd"/>
+            <w:r>
+              <w:rPr>
+                <w:sz w:val="20"/>
+                <w:szCs w:val="20"/>
+              </w:rPr>
+              <w:t xml:space="preserve"> </w:t>
             </w:r>
           </w:p>
         </w:tc>
@@ -3494,12 +3487,21 @@
             <w:tcW w:w="3000" w:type="dxa"/>
           </w:tcPr>
           <w:p>
-            <w:r>
-              <w:rPr>
-                <w:sz w:val="20"/>
-                <w:szCs w:val="20"/>
-              </w:rPr>
-              <w:t>SimpleMaps (simplemaps.com)</w:t>
+            <w:proofErr w:type="spellStart"/>
+            <w:r>
+              <w:rPr>
+                <w:sz w:val="20"/>
+                <w:szCs w:val="20"/>
+              </w:rPr>
+              <w:t>SimpleMaps</w:t>
+            </w:r>
+            <w:proofErr w:type="spellEnd"/>
+            <w:r>
+              <w:rPr>
+                <w:sz w:val="20"/>
+                <w:szCs w:val="20"/>
+              </w:rPr>
+              <w:t xml:space="preserve"> (simplemaps.com)</w:t>
             </w:r>
           </w:p>
         </w:tc>
@@ -3540,7 +3542,15 @@
         </w:r>
       </w:fldSimple>
       <w:r>
-        <w:t>: Datasets utilizados</w:t>
+        <w:t xml:space="preserve">: </w:t>
+      </w:r>
+      <w:proofErr w:type="spellStart"/>
+      <w:r>
+        <w:t>Datasets</w:t>
+      </w:r>
+      <w:proofErr w:type="spellEnd"/>
+      <w:r>
+        <w:t xml:space="preserve"> utilizados</w:t>
       </w:r>
       <w:bookmarkEnd w:id="4"/>
     </w:p>
@@ -3548,9 +3558,11 @@
       <w:r>
         <w:t xml:space="preserve">El </w:t>
       </w:r>
+      <w:proofErr w:type="spellStart"/>
       <w:r>
         <w:t>dataset</w:t>
       </w:r>
+      <w:proofErr w:type="spellEnd"/>
       <w:r>
         <w:t xml:space="preserve"> deportivo </w:t>
       </w:r>
@@ -3637,7 +3649,15 @@
     </w:p>
     <w:p>
       <w:r>
-        <w:t xml:space="preserve">Antes de comenzar a explorar los datos, aplicamos diversas transformaciones. En primer término se </w:t>
+        <w:t xml:space="preserve">Antes de comenzar a explorar los datos, aplicamos diversas transformaciones. En primer </w:t>
+      </w:r>
+      <w:proofErr w:type="gramStart"/>
+      <w:r>
+        <w:t>término</w:t>
+      </w:r>
+      <w:proofErr w:type="gramEnd"/>
+      <w:r>
+        <w:t xml:space="preserve"> se </w:t>
       </w:r>
       <w:r>
         <w:t>normalizaron los nombres de los países</w:t>
@@ -3661,7 +3681,17 @@
         </w:numPr>
       </w:pPr>
       <w:r>
-        <w:t xml:space="preserve">se corrigió un error de codificación («Cura?o» </w:t>
+        <w:t>se corrigió un error de codificación («</w:t>
+      </w:r>
+      <w:proofErr w:type="spellStart"/>
+      <w:proofErr w:type="gramStart"/>
+      <w:r>
+        <w:t>Cura?o</w:t>
+      </w:r>
+      <w:proofErr w:type="spellEnd"/>
+      <w:proofErr w:type="gramEnd"/>
+      <w:r>
+        <w:t xml:space="preserve">» </w:t>
       </w:r>
       <w:r>
         <w:rPr>
@@ -3670,7 +3700,15 @@
         <w:t>→</w:t>
       </w:r>
       <w:r>
-        <w:t xml:space="preserve"> «Curaçao»), </w:t>
+        <w:t xml:space="preserve"> «</w:t>
+      </w:r>
+      <w:proofErr w:type="spellStart"/>
+      <w:r>
+        <w:t>Curaçao</w:t>
+      </w:r>
+      <w:proofErr w:type="spellEnd"/>
+      <w:r>
+        <w:t xml:space="preserve">»), </w:t>
       </w:r>
     </w:p>
     <w:p>
@@ -3742,21 +3780,49 @@
     </w:p>
     <w:p>
       <w:r>
-        <w:t xml:space="preserve">A continuación se realizó un cruce de tipo </w:t>
-      </w:r>
+        <w:t xml:space="preserve">A </w:t>
+      </w:r>
+      <w:proofErr w:type="gramStart"/>
+      <w:r>
+        <w:t>continuación</w:t>
+      </w:r>
+      <w:proofErr w:type="gramEnd"/>
+      <w:r>
+        <w:t xml:space="preserve"> se realizó un cruce de tipo </w:t>
+      </w:r>
+      <w:proofErr w:type="spellStart"/>
       <w:r>
         <w:rPr>
           <w:i/>
           <w:iCs/>
         </w:rPr>
-        <w:t>left join</w:t>
-      </w:r>
+        <w:t>left</w:t>
+      </w:r>
+      <w:proofErr w:type="spellEnd"/>
+      <w:r>
+        <w:rPr>
+          <w:i/>
+          <w:iCs/>
+        </w:rPr>
+        <w:t xml:space="preserve"> </w:t>
+      </w:r>
+      <w:proofErr w:type="spellStart"/>
+      <w:r>
+        <w:rPr>
+          <w:i/>
+          <w:iCs/>
+        </w:rPr>
+        <w:t>join</w:t>
+      </w:r>
+      <w:proofErr w:type="spellEnd"/>
       <w:r>
         <w:t xml:space="preserve"> entre ambas tablas y se revisó si había valores faltantes. El único dato faltante en nuestras variables de interés era el caso de </w:t>
       </w:r>
+      <w:proofErr w:type="spellStart"/>
       <w:r>
         <w:t>Curaçao</w:t>
       </w:r>
+      <w:proofErr w:type="spellEnd"/>
       <w:r>
         <w:t>, donde</w:t>
       </w:r>
@@ -3778,8 +3844,13 @@
         <w:t xml:space="preserve"> y grabaron en</w:t>
       </w:r>
       <w:r>
-        <w:t xml:space="preserve"> un nuevo dataframe</w:t>
-      </w:r>
+        <w:t xml:space="preserve"> un nuevo </w:t>
+      </w:r>
+      <w:proofErr w:type="spellStart"/>
+      <w:r>
+        <w:t>dataframe</w:t>
+      </w:r>
+      <w:proofErr w:type="spellEnd"/>
       <w:r>
         <w:t xml:space="preserve"> las variables relevantes</w:t>
       </w:r>
@@ -3790,7 +3861,23 @@
         <w:t>(</w:t>
       </w:r>
       <w:r>
-        <w:t>“team", "continent_x"</w:t>
+        <w:t>“</w:t>
+      </w:r>
+      <w:proofErr w:type="spellStart"/>
+      <w:r>
+        <w:t>team</w:t>
+      </w:r>
+      <w:proofErr w:type="spellEnd"/>
+      <w:r>
+        <w:t>", "</w:t>
+      </w:r>
+      <w:proofErr w:type="spellStart"/>
+      <w:r>
+        <w:t>continent_x</w:t>
+      </w:r>
+      <w:proofErr w:type="spellEnd"/>
+      <w:r>
+        <w:t>"</w:t>
       </w:r>
       <w:r>
         <w:rPr>
@@ -3803,7 +3890,93 @@
         <w:t xml:space="preserve">, </w:t>
       </w:r>
       <w:r>
-        <w:t xml:space="preserve">"squad_total_market_value_eur", "fifa_points_pre_tournament", "squad_avg_age", "population",  "density", "area",  "gdp",  "median_age", "language", "religion"). </w:t>
+        <w:t>"</w:t>
+      </w:r>
+      <w:proofErr w:type="spellStart"/>
+      <w:r>
+        <w:t>squad_total_market_value_eur</w:t>
+      </w:r>
+      <w:proofErr w:type="spellEnd"/>
+      <w:r>
+        <w:t>", "</w:t>
+      </w:r>
+      <w:proofErr w:type="spellStart"/>
+      <w:r>
+        <w:t>fifa_points_pre_tournament</w:t>
+      </w:r>
+      <w:proofErr w:type="spellEnd"/>
+      <w:r>
+        <w:t>", "</w:t>
+      </w:r>
+      <w:proofErr w:type="spellStart"/>
+      <w:r>
+        <w:t>squad_avg_age</w:t>
+      </w:r>
+      <w:proofErr w:type="spellEnd"/>
+      <w:r>
+        <w:t>", "</w:t>
+      </w:r>
+      <w:proofErr w:type="spellStart"/>
+      <w:r>
+        <w:t>population</w:t>
+      </w:r>
+      <w:proofErr w:type="spellEnd"/>
+      <w:proofErr w:type="gramStart"/>
+      <w:r>
+        <w:t>",  "</w:t>
+      </w:r>
+      <w:proofErr w:type="spellStart"/>
+      <w:proofErr w:type="gramEnd"/>
+      <w:r>
+        <w:t>density</w:t>
+      </w:r>
+      <w:proofErr w:type="spellEnd"/>
+      <w:r>
+        <w:t>", "</w:t>
+      </w:r>
+      <w:proofErr w:type="spellStart"/>
+      <w:r>
+        <w:t>area</w:t>
+      </w:r>
+      <w:proofErr w:type="spellEnd"/>
+      <w:proofErr w:type="gramStart"/>
+      <w:r>
+        <w:t>",  "</w:t>
+      </w:r>
+      <w:proofErr w:type="spellStart"/>
+      <w:proofErr w:type="gramEnd"/>
+      <w:r>
+        <w:t>gdp</w:t>
+      </w:r>
+      <w:proofErr w:type="spellEnd"/>
+      <w:proofErr w:type="gramStart"/>
+      <w:r>
+        <w:t>",  "</w:t>
+      </w:r>
+      <w:proofErr w:type="spellStart"/>
+      <w:proofErr w:type="gramEnd"/>
+      <w:r>
+        <w:t>median_age</w:t>
+      </w:r>
+      <w:proofErr w:type="spellEnd"/>
+      <w:r>
+        <w:t>", "</w:t>
+      </w:r>
+      <w:proofErr w:type="spellStart"/>
+      <w:r>
+        <w:t>language</w:t>
+      </w:r>
+      <w:proofErr w:type="spellEnd"/>
+      <w:r>
+        <w:t>", "</w:t>
+      </w:r>
+      <w:proofErr w:type="spellStart"/>
+      <w:r>
+        <w:t>religion</w:t>
+      </w:r>
+      <w:proofErr w:type="spellEnd"/>
+      <w:r>
+        <w:t xml:space="preserve">"). </w:t>
       </w:r>
     </w:p>
     <w:p>
@@ -3844,6 +4017,7 @@
       <w:r>
         <w:t xml:space="preserve">La estrategia metodológica combinó tres etapas. Primero, un análisis exploratorio mediante estadísticos de resumen agrupados con </w:t>
       </w:r>
+      <w:proofErr w:type="spellStart"/>
       <w:r>
         <w:rPr>
           <w:i/>
@@ -3851,14 +4025,20 @@
         </w:rPr>
         <w:t>groupby</w:t>
       </w:r>
+      <w:proofErr w:type="spellEnd"/>
       <w:r>
         <w:t xml:space="preserve"> —puntaje FIFA por continente, religión e idioma— y una matriz de correlación de Pearson sobre las variables numéricas. Segundo, ante la evidencia de una única asociación fuerte, se modeló su forma funcional comparando cuatro especificaciones (lineal, logarítmica, potencial y cuadrática) por su coeficiente de determinación. Tercero, sobre el modelo seleccionado se aplicaron herramientas del cálculo diferencial —primera y segunda derivada, punto crítico y análisis de residuos— para interpretar económicamente el resultado. El trabajo se desarrolló en</w:t>
       </w:r>
       <w:r>
         <w:t xml:space="preserve"> un </w:t>
       </w:r>
-      <w:r>
-        <w:t>Jupyter Notebook</w:t>
+      <w:proofErr w:type="spellStart"/>
+      <w:r>
+        <w:t>Jupyter</w:t>
+      </w:r>
+      <w:proofErr w:type="spellEnd"/>
+      <w:r>
+        <w:t xml:space="preserve"> Notebook</w:t>
       </w:r>
       <w:r>
         <w:t>, con el idioma</w:t>
@@ -3870,7 +4050,31 @@
         <w:t xml:space="preserve">, utilizando las librerías </w:t>
       </w:r>
       <w:r>
-        <w:t>pandas, NumPy, Matplotlib, Seaborn, SciPy y SymPy.</w:t>
+        <w:t xml:space="preserve">pandas, </w:t>
+      </w:r>
+      <w:proofErr w:type="spellStart"/>
+      <w:r>
+        <w:t>NumPy</w:t>
+      </w:r>
+      <w:proofErr w:type="spellEnd"/>
+      <w:r>
+        <w:t xml:space="preserve">, </w:t>
+      </w:r>
+      <w:proofErr w:type="spellStart"/>
+      <w:r>
+        <w:t>Matplotlib</w:t>
+      </w:r>
+      <w:proofErr w:type="spellEnd"/>
+      <w:r>
+        <w:t xml:space="preserve">, Seaborn, </w:t>
+      </w:r>
+      <w:proofErr w:type="spellStart"/>
+      <w:r>
+        <w:t>SciPy</w:t>
+      </w:r>
+      <w:proofErr w:type="spellEnd"/>
+      <w:r>
+        <w:t xml:space="preserve"> y SymPy.</w:t>
       </w:r>
     </w:p>
     <w:p>
@@ -3970,6 +4174,221 @@
             <wp:extent cx="5817996" cy="3329875"/>
             <wp:effectExtent l="0" t="0" r="0" b="4445"/>
             <wp:docPr id="1" name="Picture 1"/>
+            <wp:cNvGraphicFramePr>
+              <a:graphicFrameLocks xmlns:a="http://schemas.openxmlformats.org/drawingml/2006/main" noChangeAspect="1"/>
+            </wp:cNvGraphicFramePr>
+            <a:graphic xmlns:a="http://schemas.openxmlformats.org/drawingml/2006/main">
+              <a:graphicData uri="http://schemas.openxmlformats.org/drawingml/2006/picture">
+                <pic:pic xmlns:pic="http://schemas.openxmlformats.org/drawingml/2006/picture">
+                  <pic:nvPicPr>
+                    <pic:cNvPr id="0" name=""/>
+                    <pic:cNvPicPr>
+                      <a:picLocks noChangeAspect="1" noChangeArrowheads="1"/>
+                    </pic:cNvPicPr>
+                  </pic:nvPicPr>
+                  <pic:blipFill>
+                    <a:blip r:embed="rId9"/>
+                    <a:srcRect/>
+                    <a:stretch>
+                      <a:fillRect/>
+                    </a:stretch>
+                  </pic:blipFill>
+                  <pic:spPr bwMode="auto">
+                    <a:xfrm>
+                      <a:off x="0" y="0"/>
+                      <a:ext cx="5854087" cy="3350532"/>
+                    </a:xfrm>
+                    <a:prstGeom prst="rect">
+                      <a:avLst/>
+                    </a:prstGeom>
+                  </pic:spPr>
+                </pic:pic>
+              </a:graphicData>
+            </a:graphic>
+          </wp:inline>
+        </w:drawing>
+      </w:r>
+    </w:p>
+    <w:p>
+      <w:pPr>
+        <w:pStyle w:val="Caption"/>
+        <w:jc w:val="center"/>
+      </w:pPr>
+      <w:bookmarkStart w:id="7" w:name="_Ref231390466"/>
+      <w:bookmarkStart w:id="8" w:name="_Toc231503934"/>
+      <w:r>
+        <w:t xml:space="preserve">Figura </w:t>
+      </w:r>
+      <w:fldSimple w:instr=" SEQ Figura \* ARABIC ">
+        <w:r>
+          <w:rPr>
+            <w:noProof/>
+          </w:rPr>
+          <w:t>1</w:t>
+        </w:r>
+      </w:fldSimple>
+      <w:bookmarkEnd w:id="7"/>
+      <w:r>
+        <w:t xml:space="preserve">: </w:t>
+      </w:r>
+      <w:r>
+        <w:t>Matriz de correlación entre el puntaje FIFA, el valor del plantel y los indicadores demográficos y económicos del país de origen.</w:t>
+      </w:r>
+      <w:bookmarkEnd w:id="8"/>
+    </w:p>
+    <w:p>
+      <w:pPr>
+        <w:rPr>
+          <w:u w:val="single"/>
+        </w:rPr>
+      </w:pPr>
+    </w:p>
+    <w:p>
+      <w:pPr>
+        <w:pStyle w:val="Heading2"/>
+      </w:pPr>
+      <w:bookmarkStart w:id="9" w:name="_Toc231472771"/>
+      <w:r>
+        <w:t xml:space="preserve">Variables </w:t>
+      </w:r>
+      <w:r>
+        <w:t>categóricas</w:t>
+      </w:r>
+      <w:bookmarkEnd w:id="9"/>
+    </w:p>
+    <w:p>
+      <w:pPr>
+        <w:rPr>
+          <w:u w:val="single"/>
+        </w:rPr>
+      </w:pPr>
+      <w:r>
+        <w:t xml:space="preserve">A </w:t>
+      </w:r>
+      <w:proofErr w:type="gramStart"/>
+      <w:r>
+        <w:t>continuación</w:t>
+      </w:r>
+      <w:proofErr w:type="gramEnd"/>
+      <w:r>
+        <w:t xml:space="preserve"> se evaluaron las variables categóricas </w:t>
+      </w:r>
+      <w:r>
+        <w:t>utilizando</w:t>
+      </w:r>
+      <w:r>
+        <w:t xml:space="preserve"> gráficos de </w:t>
+      </w:r>
+      <w:proofErr w:type="spellStart"/>
+      <w:r>
+        <w:t>boxplot</w:t>
+      </w:r>
+      <w:proofErr w:type="spellEnd"/>
+      <w:r>
+        <w:t>: por continente (</w:t>
+      </w:r>
+      <w:r>
+        <w:fldChar w:fldCharType="begin"/>
+      </w:r>
+      <w:r>
+        <w:instrText xml:space="preserve"> REF _Ref231391086 \h </w:instrText>
+      </w:r>
+      <w:r>
+        <w:fldChar w:fldCharType="separate"/>
+      </w:r>
+      <w:r>
+        <w:t xml:space="preserve">Figura </w:t>
+      </w:r>
+      <w:r>
+        <w:rPr>
+          <w:noProof/>
+        </w:rPr>
+        <w:t>2</w:t>
+      </w:r>
+      <w:r>
+        <w:fldChar w:fldCharType="end"/>
+      </w:r>
+      <w:r>
+        <w:t xml:space="preserve">), </w:t>
+      </w:r>
+      <w:r>
+        <w:t>idioma</w:t>
+      </w:r>
+      <w:r>
+        <w:t xml:space="preserve"> (</w:t>
+      </w:r>
+      <w:r>
+        <w:fldChar w:fldCharType="begin"/>
+      </w:r>
+      <w:r>
+        <w:instrText xml:space="preserve"> REF _Ref231391408 \h </w:instrText>
+      </w:r>
+      <w:r>
+        <w:fldChar w:fldCharType="separate"/>
+      </w:r>
+      <w:r>
+        <w:t xml:space="preserve">Figura </w:t>
+      </w:r>
+      <w:r>
+        <w:rPr>
+          <w:noProof/>
+        </w:rPr>
+        <w:t>3</w:t>
+      </w:r>
+      <w:r>
+        <w:fldChar w:fldCharType="end"/>
+      </w:r>
+      <w:r>
+        <w:t xml:space="preserve">) </w:t>
+      </w:r>
+      <w:r>
+        <w:t xml:space="preserve">y religión </w:t>
+      </w:r>
+      <w:r>
+        <w:t>(</w:t>
+      </w:r>
+      <w:r>
+        <w:fldChar w:fldCharType="begin"/>
+      </w:r>
+      <w:r>
+        <w:instrText xml:space="preserve"> REF _Ref231391423 \h </w:instrText>
+      </w:r>
+      <w:r>
+        <w:fldChar w:fldCharType="separate"/>
+      </w:r>
+      <w:r>
+        <w:t xml:space="preserve">Figura </w:t>
+      </w:r>
+      <w:r>
+        <w:rPr>
+          <w:noProof/>
+        </w:rPr>
+        <w:t>4</w:t>
+      </w:r>
+      <w:r>
+        <w:fldChar w:fldCharType="end"/>
+      </w:r>
+      <w:r>
+        <w:t xml:space="preserve">). </w:t>
+      </w:r>
+    </w:p>
+    <w:p/>
+    <w:p>
+      <w:pPr>
+        <w:keepNext/>
+        <w:spacing w:before="80" w:after="30"/>
+        <w:jc w:val="center"/>
+      </w:pPr>
+      <w:r>
+        <w:rPr>
+          <w:noProof/>
+        </w:rPr>
+        <w:lastRenderedPageBreak/>
+        <w:drawing>
+          <wp:inline distT="0" distB="0" distL="0" distR="0" wp14:anchorId="5716749C" wp14:editId="390F0C66">
+            <wp:extent cx="6065476" cy="2260879"/>
+            <wp:effectExtent l="0" t="0" r="0" b="6350"/>
+            <wp:docPr id="1699641359" name="Picture 1699641359"/>
             <wp:cNvGraphicFramePr>
               <a:graphicFrameLocks xmlns:a="http://schemas.openxmlformats.org/drawingml/2006/main" noChangeAspect="1"/>
             </wp:cNvGraphicFramePr>
@@ -3992,205 +4411,6 @@
                   <pic:spPr bwMode="auto">
                     <a:xfrm>
                       <a:off x="0" y="0"/>
-                      <a:ext cx="5854087" cy="3350532"/>
-                    </a:xfrm>
-                    <a:prstGeom prst="rect">
-                      <a:avLst/>
-                    </a:prstGeom>
-                  </pic:spPr>
-                </pic:pic>
-              </a:graphicData>
-            </a:graphic>
-          </wp:inline>
-        </w:drawing>
-      </w:r>
-    </w:p>
-    <w:p>
-      <w:pPr>
-        <w:pStyle w:val="Caption"/>
-        <w:jc w:val="center"/>
-      </w:pPr>
-      <w:bookmarkStart w:id="7" w:name="_Ref231390466"/>
-      <w:bookmarkStart w:id="8" w:name="_Toc231472828"/>
-      <w:r>
-        <w:t xml:space="preserve">Figura </w:t>
-      </w:r>
-      <w:fldSimple w:instr=" SEQ Figura \* ARABIC ">
-        <w:r>
-          <w:rPr>
-            <w:noProof/>
-          </w:rPr>
-          <w:t>1</w:t>
-        </w:r>
-      </w:fldSimple>
-      <w:bookmarkEnd w:id="7"/>
-      <w:r>
-        <w:t xml:space="preserve">: </w:t>
-      </w:r>
-      <w:r>
-        <w:t>Matriz de correlación entre el puntaje FIFA, el valor del plantel y los indicadores demográficos y económicos del país de origen.</w:t>
-      </w:r>
-      <w:bookmarkEnd w:id="8"/>
-    </w:p>
-    <w:p>
-      <w:pPr>
-        <w:rPr>
-          <w:u w:val="single"/>
-        </w:rPr>
-      </w:pPr>
-    </w:p>
-    <w:p>
-      <w:pPr>
-        <w:pStyle w:val="Heading2"/>
-      </w:pPr>
-      <w:bookmarkStart w:id="9" w:name="_Toc231472771"/>
-      <w:r>
-        <w:t xml:space="preserve">Variables </w:t>
-      </w:r>
-      <w:r>
-        <w:t>categóricas</w:t>
-      </w:r>
-      <w:bookmarkEnd w:id="9"/>
-    </w:p>
-    <w:p>
-      <w:pPr>
-        <w:rPr>
-          <w:u w:val="single"/>
-        </w:rPr>
-      </w:pPr>
-      <w:r>
-        <w:t xml:space="preserve">A continuación se evaluaron las variables categóricas </w:t>
-      </w:r>
-      <w:r>
-        <w:t>utilizando</w:t>
-      </w:r>
-      <w:r>
-        <w:t xml:space="preserve"> gráficos de boxplot: por continente (</w:t>
-      </w:r>
-      <w:r>
-        <w:fldChar w:fldCharType="begin"/>
-      </w:r>
-      <w:r>
-        <w:instrText xml:space="preserve"> REF _Ref231391086 \h </w:instrText>
-      </w:r>
-      <w:r>
-        <w:fldChar w:fldCharType="separate"/>
-      </w:r>
-      <w:r>
-        <w:t xml:space="preserve">Figura </w:t>
-      </w:r>
-      <w:r>
-        <w:rPr>
-          <w:noProof/>
-        </w:rPr>
-        <w:t>2</w:t>
-      </w:r>
-      <w:r>
-        <w:fldChar w:fldCharType="end"/>
-      </w:r>
-      <w:r>
-        <w:t xml:space="preserve">), </w:t>
-      </w:r>
-      <w:r>
-        <w:t>idioma</w:t>
-      </w:r>
-      <w:r>
-        <w:t xml:space="preserve"> (</w:t>
-      </w:r>
-      <w:r>
-        <w:fldChar w:fldCharType="begin"/>
-      </w:r>
-      <w:r>
-        <w:instrText xml:space="preserve"> REF _Ref231391408 \h </w:instrText>
-      </w:r>
-      <w:r>
-        <w:fldChar w:fldCharType="separate"/>
-      </w:r>
-      <w:r>
-        <w:t xml:space="preserve">Figura </w:t>
-      </w:r>
-      <w:r>
-        <w:rPr>
-          <w:noProof/>
-        </w:rPr>
-        <w:t>3</w:t>
-      </w:r>
-      <w:r>
-        <w:fldChar w:fldCharType="end"/>
-      </w:r>
-      <w:r>
-        <w:t xml:space="preserve">) </w:t>
-      </w:r>
-      <w:r>
-        <w:t xml:space="preserve">y religión </w:t>
-      </w:r>
-      <w:r>
-        <w:t>(</w:t>
-      </w:r>
-      <w:r>
-        <w:fldChar w:fldCharType="begin"/>
-      </w:r>
-      <w:r>
-        <w:instrText xml:space="preserve"> REF _Ref231391423 \h </w:instrText>
-      </w:r>
-      <w:r>
-        <w:fldChar w:fldCharType="separate"/>
-      </w:r>
-      <w:r>
-        <w:t xml:space="preserve">Figura </w:t>
-      </w:r>
-      <w:r>
-        <w:rPr>
-          <w:noProof/>
-        </w:rPr>
-        <w:t>4</w:t>
-      </w:r>
-      <w:r>
-        <w:fldChar w:fldCharType="end"/>
-      </w:r>
-      <w:r>
-        <w:t xml:space="preserve">). </w:t>
-      </w:r>
-    </w:p>
-    <w:p/>
-    <w:p>
-      <w:pPr>
-        <w:keepNext/>
-        <w:spacing w:before="80" w:after="30"/>
-        <w:jc w:val="center"/>
-      </w:pPr>
-      <w:r>
-        <w:rPr>
-          <w:noProof/>
-        </w:rPr>
-        <w:lastRenderedPageBreak/>
-        <w:drawing>
-          <wp:inline distT="0" distB="0" distL="0" distR="0" wp14:anchorId="5716749C" wp14:editId="390F0C66">
-            <wp:extent cx="6065476" cy="2260879"/>
-            <wp:effectExtent l="0" t="0" r="0" b="6350"/>
-            <wp:docPr id="1699641359" name="Picture 1699641359"/>
-            <wp:cNvGraphicFramePr>
-              <a:graphicFrameLocks xmlns:a="http://schemas.openxmlformats.org/drawingml/2006/main" noChangeAspect="1"/>
-            </wp:cNvGraphicFramePr>
-            <a:graphic xmlns:a="http://schemas.openxmlformats.org/drawingml/2006/main">
-              <a:graphicData uri="http://schemas.openxmlformats.org/drawingml/2006/picture">
-                <pic:pic xmlns:pic="http://schemas.openxmlformats.org/drawingml/2006/picture">
-                  <pic:nvPicPr>
-                    <pic:cNvPr id="0" name=""/>
-                    <pic:cNvPicPr>
-                      <a:picLocks noChangeAspect="1" noChangeArrowheads="1"/>
-                    </pic:cNvPicPr>
-                  </pic:nvPicPr>
-                  <pic:blipFill>
-                    <a:blip r:embed="rId11"/>
-                    <a:srcRect/>
-                    <a:stretch>
-                      <a:fillRect/>
-                    </a:stretch>
-                  </pic:blipFill>
-                  <pic:spPr bwMode="auto">
-                    <a:xfrm>
-                      <a:off x="0" y="0"/>
                       <a:ext cx="6088250" cy="2269368"/>
                     </a:xfrm>
                     <a:prstGeom prst="rect">
@@ -4210,7 +4430,7 @@
         <w:jc w:val="center"/>
       </w:pPr>
       <w:bookmarkStart w:id="10" w:name="_Ref231391086"/>
-      <w:bookmarkStart w:id="11" w:name="_Toc231472829"/>
+      <w:bookmarkStart w:id="11" w:name="_Toc231503935"/>
       <w:r>
         <w:t xml:space="preserve">Figura </w:t>
       </w:r>
@@ -4265,7 +4485,7 @@
           <w:noProof/>
         </w:rPr>
         <w:drawing>
-          <wp:inline distT="0" distB="0" distL="0" distR="0" wp14:anchorId="119D407A" wp14:editId="3B1784CE">
+          <wp:inline distT="0" distB="0" distL="0" distR="0" wp14:anchorId="119D407A" wp14:editId="7B07F114">
             <wp:extent cx="5943600" cy="1981200"/>
             <wp:effectExtent l="0" t="0" r="0" b="0"/>
             <wp:docPr id="1761773335" name="Imagen 2"/>
@@ -4280,7 +4500,7 @@
                     <pic:cNvPicPr/>
                   </pic:nvPicPr>
                   <pic:blipFill>
-                    <a:blip r:embed="rId12" cstate="print">
+                    <a:blip r:embed="rId11" cstate="print">
                       <a:extLst>
                         <a:ext uri="{28A0092B-C50C-407E-A947-70E740481C1C}">
                           <a14:useLocalDpi xmlns:a14="http://schemas.microsoft.com/office/drawing/2010/main" val="0"/>
@@ -4313,7 +4533,7 @@
         <w:jc w:val="center"/>
       </w:pPr>
       <w:bookmarkStart w:id="12" w:name="_Ref231391408"/>
-      <w:bookmarkStart w:id="13" w:name="_Toc231472830"/>
+      <w:bookmarkStart w:id="13" w:name="_Toc231503936"/>
       <w:r>
         <w:t xml:space="preserve">Figura </w:t>
       </w:r>
@@ -4366,23 +4586,34 @@
     </w:p>
     <w:p>
       <w:r>
-        <w:t xml:space="preserve">Viendo el boxplot por idioma, </w:t>
-      </w:r>
-      <w:r>
-        <w:t>vemos que los países que hablan español tienen rendimiento más alto. Esto claramente refuerza los resultados que vimos en el gráfico anterior ya que  est</w:t>
-      </w:r>
-      <w:r>
-        <w:t>a</w:t>
-      </w:r>
-      <w:r>
-        <w:t xml:space="preserve">s </w:t>
+        <w:t xml:space="preserve">Viendo el </w:t>
+      </w:r>
+      <w:proofErr w:type="spellStart"/>
+      <w:r>
+        <w:t>boxplot</w:t>
+      </w:r>
+      <w:proofErr w:type="spellEnd"/>
+      <w:r>
+        <w:t xml:space="preserve"> por idioma, </w:t>
+      </w:r>
+      <w:r>
+        <w:t xml:space="preserve">vemos que los países que hablan español tienen rendimiento más alto. Esto claramente refuerza los resultados que vimos en el gráfico anterior ya </w:t>
+      </w:r>
+      <w:r>
+        <w:t>que estas</w:t>
+      </w:r>
+      <w:r>
+        <w:t xml:space="preserve"> </w:t>
+      </w:r>
+      <w:r>
+        <w:t>variables</w:t>
+      </w:r>
+      <w:r>
+        <w:t xml:space="preserve"> </w:t>
       </w:r>
       <w:r>
         <w:lastRenderedPageBreak/>
-        <w:t>variables</w:t>
-      </w:r>
-      <w:r>
-        <w:t xml:space="preserve"> están estrechamente </w:t>
+        <w:t xml:space="preserve">están estrechamente </w:t>
       </w:r>
       <w:r>
         <w:t>relacionad</w:t>
@@ -4411,15 +4642,15 @@
       <w:pPr>
         <w:keepNext/>
         <w:spacing w:before="80" w:after="100"/>
-      </w:pPr>
-      <w:commentRangeStart w:id="14"/>
+        <w:jc w:val="center"/>
+      </w:pPr>
       <w:r>
         <w:rPr>
           <w:noProof/>
         </w:rPr>
         <w:drawing>
-          <wp:inline distT="0" distB="0" distL="0" distR="0" wp14:anchorId="2C112144" wp14:editId="56CE1564">
-            <wp:extent cx="5943600" cy="1981200"/>
+          <wp:inline distT="0" distB="0" distL="0" distR="0" wp14:anchorId="2C112144" wp14:editId="17AA29CF">
+            <wp:extent cx="5970306" cy="2628900"/>
             <wp:effectExtent l="0" t="0" r="0" b="0"/>
             <wp:docPr id="330224463" name="Imagen 1"/>
             <wp:cNvGraphicFramePr>
@@ -4429,11 +4660,11 @@
               <a:graphicData uri="http://schemas.openxmlformats.org/drawingml/2006/picture">
                 <pic:pic xmlns:pic="http://schemas.openxmlformats.org/drawingml/2006/picture">
                   <pic:nvPicPr>
-                    <pic:cNvPr id="330224463" name="Imagen 330224463"/>
+                    <pic:cNvPr id="330224463" name="Imagen 1"/>
                     <pic:cNvPicPr/>
                   </pic:nvPicPr>
                   <pic:blipFill>
-                    <a:blip r:embed="rId13" cstate="print">
+                    <a:blip r:embed="rId12" cstate="print">
                       <a:extLst>
                         <a:ext uri="{28A0092B-C50C-407E-A947-70E740481C1C}">
                           <a14:useLocalDpi xmlns:a14="http://schemas.microsoft.com/office/drawing/2010/main" val="0"/>
@@ -4447,7 +4678,7 @@
                   <pic:spPr>
                     <a:xfrm>
                       <a:off x="0" y="0"/>
-                      <a:ext cx="5943600" cy="1981200"/>
+                      <a:ext cx="5982026" cy="2634061"/>
                     </a:xfrm>
                     <a:prstGeom prst="rect">
                       <a:avLst/>
@@ -4459,23 +4690,14 @@
           </wp:inline>
         </w:drawing>
       </w:r>
-      <w:commentRangeEnd w:id="14"/>
-      <w:r>
-        <w:rPr>
-          <w:rStyle w:val="CommentReference"/>
-          <w:sz w:val="22"/>
-          <w:szCs w:val="22"/>
-        </w:rPr>
-        <w:commentReference w:id="14"/>
-      </w:r>
     </w:p>
     <w:p>
       <w:pPr>
         <w:pStyle w:val="Caption"/>
         <w:jc w:val="center"/>
       </w:pPr>
-      <w:bookmarkStart w:id="15" w:name="_Ref231391423"/>
-      <w:bookmarkStart w:id="16" w:name="_Toc231472831"/>
+      <w:bookmarkStart w:id="14" w:name="_Ref231391423"/>
+      <w:bookmarkStart w:id="15" w:name="_Toc231503937"/>
       <w:r>
         <w:t xml:space="preserve">Figura </w:t>
       </w:r>
@@ -4487,153 +4709,98 @@
           <w:t>4</w:t>
         </w:r>
       </w:fldSimple>
+      <w:bookmarkEnd w:id="14"/>
+      <w:r>
+        <w:t>:</w:t>
+      </w:r>
+      <w:r>
+        <w:t xml:space="preserve"> </w:t>
+      </w:r>
+      <w:r>
+        <w:t xml:space="preserve">Distribución del puntaje FIFA por </w:t>
+      </w:r>
+      <w:r>
+        <w:t xml:space="preserve">religión principal </w:t>
+      </w:r>
+      <w:r>
+        <w:t>de</w:t>
+      </w:r>
+      <w:r>
+        <w:t>l país de</w:t>
+      </w:r>
+      <w:r>
+        <w:t xml:space="preserve"> origen de la selección</w:t>
+      </w:r>
+      <w:r>
+        <w:t xml:space="preserve"> y distribución de religiones entre los países participantes del torneo</w:t>
+      </w:r>
+      <w:r>
+        <w:t>.</w:t>
+      </w:r>
       <w:bookmarkEnd w:id="15"/>
-      <w:r>
-        <w:t>:</w:t>
+    </w:p>
+    <w:p>
+      <w:r>
+        <w:t xml:space="preserve">Los países cristianos abarcan casi todo el rango. Complementamos el análisis por ello con un gráfico de torta de religiones, para ver la participación de cada una. </w:t>
+      </w:r>
+    </w:p>
+    <w:p>
+      <w:r>
+        <w:t xml:space="preserve">Curiosamente, los países que participan del torneo son mayoritariamente cristianos, islámicos o no tienen religión principal. No hay países identificados como </w:t>
+      </w:r>
+      <w:r>
+        <w:t>mayoritariamente</w:t>
+      </w:r>
+      <w:r>
+        <w:t xml:space="preserve"> budistas, hindúes o judíos.</w:t>
+      </w:r>
+      <w:r>
+        <w:t xml:space="preserve"> Visto que la mayoría de los países son cristianos, no podemos deducir mucho sobre el </w:t>
+      </w:r>
+      <w:proofErr w:type="spellStart"/>
+      <w:r>
+        <w:t>boxplot</w:t>
+      </w:r>
+      <w:proofErr w:type="spellEnd"/>
+      <w:r>
+        <w:t xml:space="preserve">, pero sería válido </w:t>
+      </w:r>
+      <w:r>
+        <w:t xml:space="preserve">pensar que </w:t>
+      </w:r>
+      <w:r>
+        <w:t xml:space="preserve">también </w:t>
+      </w:r>
+      <w:r>
+        <w:t>esta categoría esté relacionada con la de continentes.</w:t>
       </w:r>
       <w:r>
         <w:t xml:space="preserve"> </w:t>
       </w:r>
-      <w:r>
-        <w:t xml:space="preserve">Distribución del puntaje FIFA por </w:t>
-      </w:r>
-      <w:r>
-        <w:t xml:space="preserve">religión principal </w:t>
-      </w:r>
-      <w:r>
-        <w:t>de</w:t>
-      </w:r>
-      <w:r>
-        <w:t>l país de</w:t>
-      </w:r>
-      <w:r>
-        <w:t xml:space="preserve"> origen de la selección.</w:t>
+    </w:p>
+    <w:p>
+      <w:r>
+        <w:t xml:space="preserve">Cuál es la característica cultural que une (o no) estas variables es </w:t>
+      </w:r>
+      <w:proofErr w:type="gramStart"/>
+      <w:r>
+        <w:t>un posible tema a explorar</w:t>
+      </w:r>
+      <w:proofErr w:type="gramEnd"/>
+      <w:r>
+        <w:t xml:space="preserve"> en un futuro análisis.</w:t>
+      </w:r>
+    </w:p>
+    <w:p/>
+    <w:p>
+      <w:pPr>
+        <w:pStyle w:val="Heading2"/>
+      </w:pPr>
+      <w:bookmarkStart w:id="16" w:name="_Toc231472772"/>
+      <w:r>
+        <w:t>La inversión en el plantel y su rendimiento</w:t>
       </w:r>
       <w:bookmarkEnd w:id="16"/>
-    </w:p>
-    <w:p>
-      <w:r>
-        <w:t xml:space="preserve">Los países cristianos abarcan casi todo el rango. Complementamos el análisis por ello con un gráfico de torta de religiones, para ver la participación de cada una. </w:t>
-      </w:r>
-    </w:p>
-    <w:p>
-      <w:pPr>
-        <w:keepNext/>
-        <w:jc w:val="center"/>
-      </w:pPr>
-      <w:r>
-        <w:rPr>
-          <w:noProof/>
-        </w:rPr>
-        <w:drawing>
-          <wp:inline distT="0" distB="0" distL="0" distR="0" wp14:anchorId="0F434931" wp14:editId="51262D19">
-            <wp:extent cx="2632668" cy="2632668"/>
-            <wp:effectExtent l="0" t="0" r="0" b="0"/>
-            <wp:docPr id="970458837" name="Imagen 3"/>
-            <wp:cNvGraphicFramePr>
-              <a:graphicFrameLocks xmlns:a="http://schemas.openxmlformats.org/drawingml/2006/main" noChangeAspect="1"/>
-            </wp:cNvGraphicFramePr>
-            <a:graphic xmlns:a="http://schemas.openxmlformats.org/drawingml/2006/main">
-              <a:graphicData uri="http://schemas.openxmlformats.org/drawingml/2006/picture">
-                <pic:pic xmlns:pic="http://schemas.openxmlformats.org/drawingml/2006/picture">
-                  <pic:nvPicPr>
-                    <pic:cNvPr id="970458837" name="Imagen 970458837"/>
-                    <pic:cNvPicPr/>
-                  </pic:nvPicPr>
-                  <pic:blipFill>
-                    <a:blip r:embed="rId18">
-                      <a:extLst>
-                        <a:ext uri="{28A0092B-C50C-407E-A947-70E740481C1C}">
-                          <a14:useLocalDpi xmlns:a14="http://schemas.microsoft.com/office/drawing/2010/main" val="0"/>
-                        </a:ext>
-                      </a:extLst>
-                    </a:blip>
-                    <a:stretch>
-                      <a:fillRect/>
-                    </a:stretch>
-                  </pic:blipFill>
-                  <pic:spPr>
-                    <a:xfrm>
-                      <a:off x="0" y="0"/>
-                      <a:ext cx="2655220" cy="2655220"/>
-                    </a:xfrm>
-                    <a:prstGeom prst="rect">
-                      <a:avLst/>
-                    </a:prstGeom>
-                  </pic:spPr>
-                </pic:pic>
-              </a:graphicData>
-            </a:graphic>
-          </wp:inline>
-        </w:drawing>
-      </w:r>
-    </w:p>
-    <w:p>
-      <w:pPr>
-        <w:pStyle w:val="Caption"/>
-        <w:jc w:val="center"/>
-      </w:pPr>
-      <w:bookmarkStart w:id="17" w:name="_Toc231472832"/>
-      <w:r>
-        <w:t xml:space="preserve">Figura </w:t>
-      </w:r>
-      <w:fldSimple w:instr=" SEQ Figura \* ARABIC ">
-        <w:r>
-          <w:rPr>
-            <w:noProof/>
-          </w:rPr>
-          <w:t>5</w:t>
-        </w:r>
-      </w:fldSimple>
-      <w:r>
-        <w:t>: Distribución de religiones entre los países participantes del torneo.</w:t>
-      </w:r>
-      <w:bookmarkEnd w:id="17"/>
-    </w:p>
-    <w:p>
-      <w:r>
-        <w:t xml:space="preserve">Curiosamente, los países que participan del torneo son mayoritariamente cristianos, islámicos o no tienen religión principal. No hay países identificados como </w:t>
-      </w:r>
-      <w:r>
-        <w:rPr>
-          <w:u w:val="single"/>
-        </w:rPr>
-        <w:t>mayoritariamente</w:t>
-      </w:r>
-      <w:r>
-        <w:t xml:space="preserve"> budistas, hindúes o judíos.</w:t>
-      </w:r>
-      <w:r>
-        <w:t xml:space="preserve"> Visto que la mayoría de los países son cristianos, no podemos deducir mucho sobre el boxplot, pero sería válido </w:t>
-      </w:r>
-      <w:r>
-        <w:t xml:space="preserve">pensar que </w:t>
-      </w:r>
-      <w:r>
-        <w:t xml:space="preserve">también </w:t>
-      </w:r>
-      <w:r>
-        <w:t>esta categoría esté relacionada con la de continentes.</w:t>
-      </w:r>
-      <w:r>
-        <w:t xml:space="preserve"> </w:t>
-      </w:r>
-    </w:p>
-    <w:p>
-      <w:r>
-        <w:t>Cuál es la característica cultural que une (o no) estas variables es un posible tema a explorar en un futuro análisis.</w:t>
-      </w:r>
-    </w:p>
-    <w:p/>
-    <w:p>
-      <w:pPr>
-        <w:pStyle w:val="Heading2"/>
-      </w:pPr>
-      <w:bookmarkStart w:id="18" w:name="_Toc231472772"/>
-      <w:r>
-        <w:t>La inversión en el plantel y su rendimiento</w:t>
-      </w:r>
-      <w:bookmarkEnd w:id="18"/>
     </w:p>
     <w:p>
       <w:r>
@@ -4689,6 +4856,7 @@
         <w:rPr>
           <w:noProof/>
         </w:rPr>
+        <w:lastRenderedPageBreak/>
         <w:drawing>
           <wp:inline distT="0" distB="0" distL="0" distR="0" wp14:anchorId="5B639425" wp14:editId="16372F5A">
             <wp:extent cx="4114800" cy="2524125"/>
@@ -4707,7 +4875,7 @@
                     </pic:cNvPicPr>
                   </pic:nvPicPr>
                   <pic:blipFill>
-                    <a:blip r:embed="rId19"/>
+                    <a:blip r:embed="rId13"/>
                     <a:srcRect/>
                     <a:stretch>
                       <a:fillRect/>
@@ -4734,8 +4902,8 @@
         <w:pStyle w:val="Caption"/>
         <w:jc w:val="center"/>
       </w:pPr>
-      <w:bookmarkStart w:id="19" w:name="_Ref231392902"/>
-      <w:bookmarkStart w:id="20" w:name="_Toc231472833"/>
+      <w:bookmarkStart w:id="17" w:name="_Ref231392902"/>
+      <w:bookmarkStart w:id="18" w:name="_Toc231503938"/>
       <w:r>
         <w:t xml:space="preserve">Figura </w:t>
       </w:r>
@@ -4747,14 +4915,14 @@
           <w:t>6</w:t>
         </w:r>
       </w:fldSimple>
-      <w:bookmarkEnd w:id="19"/>
+      <w:bookmarkEnd w:id="17"/>
       <w:r>
         <w:t xml:space="preserve">: </w:t>
       </w:r>
       <w:r>
         <w:t>Relación entre el valor del plantel (miles de millones de euros) y el puntaje FIFA, según continente.</w:t>
       </w:r>
-      <w:bookmarkEnd w:id="20"/>
+      <w:bookmarkEnd w:id="18"/>
     </w:p>
     <w:p>
       <w:r>
@@ -5497,7 +5665,7 @@
         <w:pStyle w:val="Caption"/>
         <w:jc w:val="center"/>
       </w:pPr>
-      <w:bookmarkStart w:id="21" w:name="_Toc231472810"/>
+      <w:bookmarkStart w:id="19" w:name="_Toc231472810"/>
       <w:r>
         <w:t xml:space="preserve">Tabla </w:t>
       </w:r>
@@ -5515,7 +5683,7 @@
       <w:r>
         <w:t>(R²) de los modelos evaluados.</w:t>
       </w:r>
-      <w:bookmarkEnd w:id="21"/>
+      <w:bookmarkEnd w:id="19"/>
     </w:p>
     <w:p>
       <w:pPr>
@@ -5543,7 +5711,7 @@
                     <pic:cNvPicPr/>
                   </pic:nvPicPr>
                   <pic:blipFill>
-                    <a:blip r:embed="rId20">
+                    <a:blip r:embed="rId14">
                       <a:extLst>
                         <a:ext uri="{28A0092B-C50C-407E-A947-70E740481C1C}">
                           <a14:useLocalDpi xmlns:a14="http://schemas.microsoft.com/office/drawing/2010/main" val="0"/>
@@ -5575,7 +5743,7 @@
         <w:pStyle w:val="Caption"/>
         <w:jc w:val="center"/>
       </w:pPr>
-      <w:bookmarkStart w:id="22" w:name="_Toc231472834"/>
+      <w:bookmarkStart w:id="20" w:name="_Toc231503939"/>
       <w:r>
         <w:t xml:space="preserve">Figura </w:t>
       </w:r>
@@ -5590,7 +5758,7 @@
       <w:r>
         <w:t>: Ajuste de modelos</w:t>
       </w:r>
-      <w:bookmarkEnd w:id="22"/>
+      <w:bookmarkEnd w:id="20"/>
     </w:p>
     <w:p>
       <w:r>
@@ -5618,8 +5786,13 @@
         <w:t xml:space="preserve">y graficadas </w:t>
       </w:r>
       <w:r>
-        <w:t>sus primera y segunda derivadas con sympy</w:t>
-      </w:r>
+        <w:t>sus primera y segunda derivadas con </w:t>
+      </w:r>
+      <w:proofErr w:type="spellStart"/>
+      <w:r>
+        <w:t>sympy</w:t>
+      </w:r>
+      <w:proofErr w:type="spellEnd"/>
       <w:r>
         <w:t>, que siguen las siguientes fórmulas:</w:t>
       </w:r>
@@ -5913,7 +6086,7 @@
           <w:noProof/>
         </w:rPr>
         <w:drawing>
-          <wp:inline distT="0" distB="0" distL="0" distR="0" wp14:anchorId="71D9D7D5" wp14:editId="06F09699">
+          <wp:inline distT="0" distB="0" distL="0" distR="0" wp14:anchorId="71D9D7D5" wp14:editId="5012C477">
             <wp:extent cx="5943600" cy="1919932"/>
             <wp:effectExtent l="0" t="0" r="0" b="4445"/>
             <wp:docPr id="264529016" name="Imagen 2"/>
@@ -5928,7 +6101,7 @@
                     <pic:cNvPicPr/>
                   </pic:nvPicPr>
                   <pic:blipFill>
-                    <a:blip r:embed="rId21" cstate="print">
+                    <a:blip r:embed="rId15" cstate="print">
                       <a:extLst>
                         <a:ext uri="{28A0092B-C50C-407E-A947-70E740481C1C}">
                           <a14:useLocalDpi xmlns:a14="http://schemas.microsoft.com/office/drawing/2010/main" val="0"/>
@@ -5966,9 +6139,9 @@
         <w:pStyle w:val="Caption"/>
         <w:jc w:val="center"/>
       </w:pPr>
-      <w:bookmarkStart w:id="23" w:name="_Ref231466931"/>
-      <w:bookmarkStart w:id="24" w:name="_Ref231466924"/>
-      <w:bookmarkStart w:id="25" w:name="_Toc231472835"/>
+      <w:bookmarkStart w:id="21" w:name="_Ref231466931"/>
+      <w:bookmarkStart w:id="22" w:name="_Ref231466924"/>
+      <w:bookmarkStart w:id="23" w:name="_Toc231503940"/>
       <w:r>
         <w:t xml:space="preserve">Figura </w:t>
       </w:r>
@@ -5980,18 +6153,18 @@
           <w:t>8</w:t>
         </w:r>
       </w:fldSimple>
+      <w:bookmarkEnd w:id="21"/>
+      <w:r>
+        <w:t>: Modelo cuadrático</w:t>
+      </w:r>
+      <w:r>
+        <w:t>:</w:t>
+      </w:r>
+      <w:r>
+        <w:t xml:space="preserve"> función y primera y segunda derivada.</w:t>
+      </w:r>
+      <w:bookmarkEnd w:id="22"/>
       <w:bookmarkEnd w:id="23"/>
-      <w:r>
-        <w:t>: Modelo cuadrático</w:t>
-      </w:r>
-      <w:r>
-        <w:t>:</w:t>
-      </w:r>
-      <w:r>
-        <w:t xml:space="preserve"> función y primera y segunda derivada.</w:t>
-      </w:r>
-      <w:bookmarkEnd w:id="24"/>
-      <w:bookmarkEnd w:id="25"/>
     </w:p>
     <w:p/>
     <w:p>
@@ -6148,11 +6321,11 @@
       <w:pPr>
         <w:pStyle w:val="Heading2"/>
       </w:pPr>
-      <w:bookmarkStart w:id="26" w:name="_Toc231472773"/>
+      <w:bookmarkStart w:id="24" w:name="_Toc231472773"/>
       <w:r>
         <w:t>Residuos</w:t>
       </w:r>
-      <w:bookmarkEnd w:id="26"/>
+      <w:bookmarkEnd w:id="24"/>
     </w:p>
     <w:p>
       <w:r>
@@ -6189,7 +6362,15 @@
         <w:t>conjunto</w:t>
       </w:r>
       <w:r>
-        <w:t xml:space="preserve"> (+161 puntos): con un plantel de €575 millones —equivalente al 44 % del de Inglaterra— alcanza 1.875 puntos FIFA, como si su plantel valiera casi el doble. La acompañan México, Irán, Estados Unidos y Croacia, todas selecciones de valor bajo o medio. Los mayores residuos negativos corresponden a Ghana, Haití, Suecia, Nueva Zelanda y Curaçao.</w:t>
+        <w:t xml:space="preserve"> (+161 puntos): con un plantel de €575 millones —equivalente al 44 % del de Inglaterra— alcanza 1.875 puntos FIFA, como si su plantel valiera casi el doble. La acompañan México, Irán, Estados Unidos y Croacia, todas selecciones de valor bajo o medio. Los mayores residuos negativos corresponden a Ghana, Haití, Suecia, Nueva Zelanda y </w:t>
+      </w:r>
+      <w:proofErr w:type="spellStart"/>
+      <w:r>
+        <w:t>Curaçao</w:t>
+      </w:r>
+      <w:proofErr w:type="spellEnd"/>
+      <w:r>
+        <w:t>.</w:t>
       </w:r>
     </w:p>
     <w:p/>
@@ -6212,6 +6393,7 @@
             <w:shd w:val="clear" w:color="auto" w:fill="3A7C22" w:themeFill="accent6" w:themeFillShade="BF"/>
           </w:tcPr>
           <w:p>
+            <w:proofErr w:type="spellStart"/>
             <w:r>
               <w:rPr>
                 <w:b/>
@@ -6222,6 +6404,7 @@
               </w:rPr>
               <w:t>Sobre-rendimiento</w:t>
             </w:r>
+            <w:proofErr w:type="spellEnd"/>
           </w:p>
         </w:tc>
         <w:tc>
@@ -6241,7 +6424,29 @@
                 <w:sz w:val="19"/>
                 <w:szCs w:val="19"/>
               </w:rPr>
-              <w:t>Residuo (pts)</w:t>
+              <w:t>Residuo (</w:t>
+            </w:r>
+            <w:proofErr w:type="spellStart"/>
+            <w:r>
+              <w:rPr>
+                <w:b/>
+                <w:bCs/>
+                <w:color w:val="FFFFFF"/>
+                <w:sz w:val="19"/>
+                <w:szCs w:val="19"/>
+              </w:rPr>
+              <w:t>pts</w:t>
+            </w:r>
+            <w:proofErr w:type="spellEnd"/>
+            <w:r>
+              <w:rPr>
+                <w:b/>
+                <w:bCs/>
+                <w:color w:val="FFFFFF"/>
+                <w:sz w:val="19"/>
+                <w:szCs w:val="19"/>
+              </w:rPr>
+              <w:t>)</w:t>
             </w:r>
           </w:p>
         </w:tc>
@@ -6251,6 +6456,7 @@
             <w:shd w:val="clear" w:color="auto" w:fill="BF4E14" w:themeFill="accent2" w:themeFillShade="BF"/>
           </w:tcPr>
           <w:p>
+            <w:proofErr w:type="spellStart"/>
             <w:r>
               <w:rPr>
                 <w:b/>
@@ -6261,6 +6467,7 @@
               </w:rPr>
               <w:t>Sub-rendimiento</w:t>
             </w:r>
+            <w:proofErr w:type="spellEnd"/>
           </w:p>
         </w:tc>
         <w:tc>
@@ -6280,7 +6487,29 @@
                 <w:sz w:val="19"/>
                 <w:szCs w:val="19"/>
               </w:rPr>
-              <w:t>Residuo (pts)</w:t>
+              <w:t>Residuo (</w:t>
+            </w:r>
+            <w:proofErr w:type="spellStart"/>
+            <w:r>
+              <w:rPr>
+                <w:b/>
+                <w:bCs/>
+                <w:color w:val="FFFFFF"/>
+                <w:sz w:val="19"/>
+                <w:szCs w:val="19"/>
+              </w:rPr>
+              <w:t>pts</w:t>
+            </w:r>
+            <w:proofErr w:type="spellEnd"/>
+            <w:r>
+              <w:rPr>
+                <w:b/>
+                <w:bCs/>
+                <w:color w:val="FFFFFF"/>
+                <w:sz w:val="19"/>
+                <w:szCs w:val="19"/>
+              </w:rPr>
+              <w:t>)</w:t>
             </w:r>
           </w:p>
         </w:tc>
@@ -6596,6 +6825,7 @@
             <w:tcW w:w="2340" w:type="dxa"/>
           </w:tcPr>
           <w:p>
+            <w:proofErr w:type="spellStart"/>
             <w:r>
               <w:rPr>
                 <w:color w:val="000000"/>
@@ -6604,6 +6834,7 @@
               </w:rPr>
               <w:t>Curaçao</w:t>
             </w:r>
+            <w:proofErr w:type="spellEnd"/>
           </w:p>
         </w:tc>
         <w:tc>
@@ -6632,7 +6863,7 @@
         <w:pStyle w:val="Caption"/>
         <w:jc w:val="center"/>
       </w:pPr>
-      <w:bookmarkStart w:id="27" w:name="_Toc231472811"/>
+      <w:bookmarkStart w:id="25" w:name="_Toc231472811"/>
       <w:r>
         <w:t xml:space="preserve">Tabla </w:t>
       </w:r>
@@ -6650,7 +6881,7 @@
       <w:r>
         <w:t>Cinco mayores residuos positivos y negativos del modelo cuadrático</w:t>
       </w:r>
-      <w:bookmarkEnd w:id="27"/>
+      <w:bookmarkEnd w:id="25"/>
     </w:p>
     <w:p/>
     <w:p>
@@ -6688,7 +6919,7 @@
                     </pic:cNvPicPr>
                   </pic:nvPicPr>
                   <pic:blipFill>
-                    <a:blip r:embed="rId22"/>
+                    <a:blip r:embed="rId16"/>
                     <a:srcRect/>
                     <a:stretch>
                       <a:fillRect/>
@@ -6715,7 +6946,7 @@
         <w:pStyle w:val="Caption"/>
         <w:jc w:val="center"/>
       </w:pPr>
-      <w:bookmarkStart w:id="28" w:name="_Toc231472836"/>
+      <w:bookmarkStart w:id="26" w:name="_Toc231503941"/>
       <w:r>
         <w:t xml:space="preserve">Figura </w:t>
       </w:r>
@@ -6748,7 +6979,7 @@
       <w:r>
         <w:t>y residuos de los casos más destacados.</w:t>
       </w:r>
-      <w:bookmarkEnd w:id="28"/>
+      <w:bookmarkEnd w:id="26"/>
     </w:p>
     <w:p>
       <w:pPr>
@@ -6757,7 +6988,23 @@
         </w:rPr>
       </w:pPr>
       <w:r>
-        <w:t xml:space="preserve">El residuo positivo de Argentina (+161 pts) es el mayor del dataset, pero no es un caso aislado: lo acompañan México (+159), Irán (+155), Estados Unidos (+137) y Croacia (+135). Todos son planteles de valor bajo o medio (por debajo del vértice de €1,30B) que rinden muy por encima de lo que su inversión predice. </w:t>
+        <w:t xml:space="preserve">El residuo positivo de Argentina (+161 </w:t>
+      </w:r>
+      <w:proofErr w:type="spellStart"/>
+      <w:r>
+        <w:t>pts</w:t>
+      </w:r>
+      <w:proofErr w:type="spellEnd"/>
+      <w:r>
+        <w:t xml:space="preserve">) es el mayor del </w:t>
+      </w:r>
+      <w:proofErr w:type="spellStart"/>
+      <w:r>
+        <w:t>dataset</w:t>
+      </w:r>
+      <w:proofErr w:type="spellEnd"/>
+      <w:r>
+        <w:t xml:space="preserve">, pero no es un caso aislado: lo acompañan México (+159), Irán (+155), Estados Unidos (+137) y Croacia (+135). Todos son planteles de valor bajo o medio (por debajo del vértice de €1,30B) que rinden muy por encima de lo que su inversión predice. </w:t>
       </w:r>
       <w:r>
         <w:t>Esto podría interpretarse como</w:t>
@@ -6769,7 +7016,15 @@
         <w:t xml:space="preserve"> Sin embargo, notamos que l</w:t>
       </w:r>
       <w:r>
-        <w:t>os residuos negativos más grandes —Ghana (−188), Haití (−171), Suecia (−170), Nueva Zelanda (−168) y Curaçao (−160)— también corresponden, salvo Suecia, a planteles de valor muy bajo</w:t>
+        <w:t xml:space="preserve">os residuos negativos más grandes —Ghana (−188), Haití (−171), Suecia (−170), Nueva Zelanda (−168) y </w:t>
+      </w:r>
+      <w:proofErr w:type="spellStart"/>
+      <w:r>
+        <w:t>Curaçao</w:t>
+      </w:r>
+      <w:proofErr w:type="spellEnd"/>
+      <w:r>
+        <w:t xml:space="preserve"> (−160)— también corresponden, salvo Suecia, a planteles de valor muy bajo</w:t>
       </w:r>
       <w:r>
         <w:t xml:space="preserve">. </w:t>
@@ -6780,26 +7035,32 @@
     </w:p>
     <w:p>
       <w:r>
-        <w:t xml:space="preserve">El modelo, por tanto, ajusta razonablemente bien a las potencias consolidadas pero pierde poder explicativo en el extremo de baja inversión, </w:t>
+        <w:t xml:space="preserve">El modelo, por tanto, ajusta razonablemente bien a las potencias </w:t>
+      </w:r>
+      <w:proofErr w:type="gramStart"/>
+      <w:r>
+        <w:t>consolidadas</w:t>
+      </w:r>
+      <w:proofErr w:type="gramEnd"/>
+      <w:r>
+        <w:t xml:space="preserve"> pero pierde poder explicativo en el extremo de baja inversión, </w:t>
       </w:r>
       <w:r>
         <w:t>donde la dispersión es mayor y la relación inversión–rendimiento se vuelve mucho más ruidosa.</w:t>
       </w:r>
     </w:p>
-    <w:p/>
     <w:p>
       <w:pPr>
         <w:pStyle w:val="Heading1"/>
       </w:pPr>
-      <w:bookmarkStart w:id="29" w:name="_Toc231472774"/>
+      <w:bookmarkStart w:id="27" w:name="_Toc231472774"/>
       <w:r>
         <w:t>Conclusiones</w:t>
       </w:r>
-      <w:bookmarkEnd w:id="29"/>
-    </w:p>
-    <w:p>
-      <w:r>
-        <w:lastRenderedPageBreak/>
+      <w:bookmarkEnd w:id="27"/>
+    </w:p>
+    <w:p>
+      <w:r>
         <w:t xml:space="preserve">El trabajo confirma que </w:t>
       </w:r>
       <w:r>
@@ -6824,6 +7085,7 @@
           <w:b/>
           <w:bCs/>
         </w:rPr>
+        <w:lastRenderedPageBreak/>
         <w:t>Valor del plantel.</w:t>
       </w:r>
       <w:r>
@@ -6887,14 +7149,14 @@
       <w:pPr>
         <w:pStyle w:val="Heading1"/>
       </w:pPr>
-      <w:bookmarkStart w:id="30" w:name="_Toc231472775"/>
+      <w:bookmarkStart w:id="28" w:name="_Toc231472775"/>
       <w:r>
         <w:t xml:space="preserve">Reflexión </w:t>
       </w:r>
       <w:r>
         <w:t>metodológica</w:t>
       </w:r>
-      <w:bookmarkEnd w:id="30"/>
+      <w:bookmarkEnd w:id="28"/>
     </w:p>
     <w:p>
       <w:r>
@@ -6911,12 +7173,20 @@
     </w:p>
     <w:p>
       <w:r>
+        <w:t xml:space="preserve">El informe también contó con asistencia de IA, al ser el primer acercamiento un informe generado a partir de la </w:t>
+      </w:r>
+      <w:proofErr w:type="spellStart"/>
+      <w:r>
+        <w:t>Jupyter</w:t>
+      </w:r>
+      <w:proofErr w:type="spellEnd"/>
+      <w:r>
+        <w:t xml:space="preserve"> Notebook. El mismo fue extensamente modificado para reflejar el trabajo realizado e incluir las conclusiones del equipo.</w:t>
+      </w:r>
+    </w:p>
+    <w:p>
+      <w:r>
         <w:lastRenderedPageBreak/>
-        <w:t>El informe también contó con asistencia de IA, al ser el primer acercamiento un informe generado a partir de la Jupyter Notebook. El mismo fue extensamente modificado para reflejar el trabajo realizado e incluir las conclusiones del equipo.</w:t>
-      </w:r>
-    </w:p>
-    <w:p>
-      <w:r>
         <w:t>El principal aprendizaje metodológico fue la importancia de auditar críticamente las sugerencias automatizadas —especialmente la elección del modelo y la interpretación de sus parámetros— para asegurar que las conclusiones se sostuvieran en la evidencia de los datos y no en la fluidez del texto generado.</w:t>
       </w:r>
       <w:r>
@@ -6931,7 +7201,15 @@
         <w:t>estaba</w:t>
       </w:r>
       <w:r>
-        <w:t xml:space="preserve"> la sospecha de que Argentina presentaba un outlier muy marcado y, al introducir esa información al modelo, lo dio por cierto y nos proporcionó múltiples teorías para reforzar ese hecho. </w:t>
+        <w:t xml:space="preserve"> la sospecha de que Argentina presentaba un </w:t>
+      </w:r>
+      <w:proofErr w:type="spellStart"/>
+      <w:r>
+        <w:t>outlier</w:t>
+      </w:r>
+      <w:proofErr w:type="spellEnd"/>
+      <w:r>
+        <w:t xml:space="preserve"> muy marcado y, al introducir esa información al modelo, lo dio por cierto y nos proporcionó múltiples teorías para reforzar ese hecho. </w:t>
       </w:r>
       <w:r>
         <w:t>Al evaluar puntualmente esa afirmación, resultó ser que Argentina no era un caso aislado.</w:t>
@@ -6954,7 +7232,7 @@
           <w:numId w:val="0"/>
         </w:numPr>
       </w:pPr>
-      <w:bookmarkStart w:id="31" w:name="_Toc231472776"/>
+      <w:bookmarkStart w:id="29" w:name="_Toc231472776"/>
       <w:r>
         <w:lastRenderedPageBreak/>
         <w:t>Apéndice A</w:t>
@@ -6965,7 +7243,7 @@
       <w:r>
         <w:t>Listado completo de variables de la tabla paises.csv</w:t>
       </w:r>
-      <w:bookmarkEnd w:id="31"/>
+      <w:bookmarkEnd w:id="29"/>
     </w:p>
     <w:p>
       <w:r>
@@ -6994,8 +7272,13 @@
           <w:numId w:val="3"/>
         </w:numPr>
       </w:pPr>
-      <w:r>
-        <w:t>version: refiere a la versión del torneo FIFA sobre el cuál trata la información.</w:t>
+      <w:proofErr w:type="spellStart"/>
+      <w:r>
+        <w:t>version</w:t>
+      </w:r>
+      <w:proofErr w:type="spellEnd"/>
+      <w:r>
+        <w:t>: refiere a la versión del torneo FIFA sobre el cuál trata la información.</w:t>
       </w:r>
     </w:p>
     <w:p>
@@ -7005,8 +7288,13 @@
           <w:numId w:val="3"/>
         </w:numPr>
       </w:pPr>
-      <w:r>
-        <w:t>team: identifica al equipo/plantel nacional.</w:t>
+      <w:proofErr w:type="spellStart"/>
+      <w:r>
+        <w:t>team</w:t>
+      </w:r>
+      <w:proofErr w:type="spellEnd"/>
+      <w:r>
+        <w:t>: identifica al equipo/plantel nacional.</w:t>
       </w:r>
     </w:p>
     <w:p>
@@ -7016,8 +7304,13 @@
           <w:numId w:val="3"/>
         </w:numPr>
       </w:pPr>
-      <w:r>
-        <w:t>continent: de qué continente es el equipo.</w:t>
+      <w:proofErr w:type="spellStart"/>
+      <w:r>
+        <w:t>continent</w:t>
+      </w:r>
+      <w:proofErr w:type="spellEnd"/>
+      <w:r>
+        <w:t>: de qué continente es el equipo.</w:t>
       </w:r>
     </w:p>
     <w:p>
@@ -7027,8 +7320,21 @@
           <w:numId w:val="3"/>
         </w:numPr>
       </w:pPr>
-      <w:r>
-        <w:t>is_host: si es el anfitrión del torneo en el año indicado en "version".</w:t>
+      <w:proofErr w:type="spellStart"/>
+      <w:r>
+        <w:t>is_host</w:t>
+      </w:r>
+      <w:proofErr w:type="spellEnd"/>
+      <w:r>
+        <w:t>: si es el anfitrión del torneo en el año indicado en "</w:t>
+      </w:r>
+      <w:proofErr w:type="spellStart"/>
+      <w:r>
+        <w:t>version</w:t>
+      </w:r>
+      <w:proofErr w:type="spellEnd"/>
+      <w:r>
+        <w:t>".</w:t>
       </w:r>
     </w:p>
     <w:p>
@@ -7093,8 +7399,13 @@
           <w:numId w:val="4"/>
         </w:numPr>
       </w:pPr>
-      <w:r>
-        <w:t>world_cup_titles_before: veces que el plantel ha ganado el torneo.</w:t>
+      <w:proofErr w:type="spellStart"/>
+      <w:r>
+        <w:t>world_cup_titles_before</w:t>
+      </w:r>
+      <w:proofErr w:type="spellEnd"/>
+      <w:r>
+        <w:t>: veces que el plantel ha ganado el torneo.</w:t>
       </w:r>
     </w:p>
     <w:p>
@@ -7104,8 +7415,13 @@
           <w:numId w:val="4"/>
         </w:numPr>
       </w:pPr>
-      <w:r>
-        <w:t>squad_total_market_value_eur: valor de mercado del equipo en euros.</w:t>
+      <w:proofErr w:type="spellStart"/>
+      <w:r>
+        <w:t>squad_total_market_value_eur</w:t>
+      </w:r>
+      <w:proofErr w:type="spellEnd"/>
+      <w:r>
+        <w:t>: valor de mercado del equipo en euros.</w:t>
       </w:r>
     </w:p>
     <w:p>
@@ -7115,8 +7431,13 @@
           <w:numId w:val="4"/>
         </w:numPr>
       </w:pPr>
-      <w:r>
-        <w:t>fifa_rank_pre_tournament: posición en el ranking FIFA antes del comienzo del torneo.</w:t>
+      <w:proofErr w:type="spellStart"/>
+      <w:r>
+        <w:t>fifa_rank_pre_tournament</w:t>
+      </w:r>
+      <w:proofErr w:type="spellEnd"/>
+      <w:r>
+        <w:t>: posición en el ranking FIFA antes del comienzo del torneo.</w:t>
       </w:r>
     </w:p>
     <w:p>
@@ -7126,8 +7447,13 @@
           <w:numId w:val="4"/>
         </w:numPr>
       </w:pPr>
-      <w:r>
-        <w:t>fifa_points_pre_tournament: puntaje FIFA antes del comienzo del torneo.</w:t>
+      <w:proofErr w:type="spellStart"/>
+      <w:r>
+        <w:t>fifa_points_pre_tournament</w:t>
+      </w:r>
+      <w:proofErr w:type="spellEnd"/>
+      <w:r>
+        <w:t>: puntaje FIFA antes del comienzo del torneo.</w:t>
       </w:r>
     </w:p>
     <w:p>
@@ -7137,8 +7463,13 @@
           <w:numId w:val="4"/>
         </w:numPr>
       </w:pPr>
-      <w:r>
-        <w:t>squad_avg_age: edad promedio de los jugadores.</w:t>
+      <w:proofErr w:type="spellStart"/>
+      <w:r>
+        <w:t>squad_avg_age</w:t>
+      </w:r>
+      <w:proofErr w:type="spellEnd"/>
+      <w:r>
+        <w:t>: edad promedio de los jugadores.</w:t>
       </w:r>
     </w:p>
     <w:p>
@@ -7148,8 +7479,13 @@
           <w:numId w:val="4"/>
         </w:numPr>
       </w:pPr>
-      <w:r>
-        <w:t>world_cup_participations_before: cuántas veces ha participado en la copa del Mundo.</w:t>
+      <w:proofErr w:type="spellStart"/>
+      <w:r>
+        <w:t>world_cup_participations_before</w:t>
+      </w:r>
+      <w:proofErr w:type="spellEnd"/>
+      <w:r>
+        <w:t>: cuántas veces ha participado en la copa del Mundo.</w:t>
       </w:r>
     </w:p>
     <w:p>
@@ -7159,8 +7495,13 @@
           <w:numId w:val="4"/>
         </w:numPr>
       </w:pPr>
-      <w:r>
-        <w:t>groups_passed_before: cuántas veces ha superado la fase de grupos históricamente.</w:t>
+      <w:proofErr w:type="spellStart"/>
+      <w:r>
+        <w:t>groups_passed_before</w:t>
+      </w:r>
+      <w:proofErr w:type="spellEnd"/>
+      <w:r>
+        <w:t>: cuántas veces ha superado la fase de grupos históricamente.</w:t>
       </w:r>
     </w:p>
     <w:p>
@@ -7181,8 +7522,13 @@
           <w:numId w:val="4"/>
         </w:numPr>
       </w:pPr>
-      <w:r>
-        <w:t>quarterfinals_before: cuántos cuartos de finales ha jugado el plantel históricamente.</w:t>
+      <w:proofErr w:type="spellStart"/>
+      <w:r>
+        <w:t>quarterfinals_before</w:t>
+      </w:r>
+      <w:proofErr w:type="spellEnd"/>
+      <w:r>
+        <w:t>: cuántos cuartos de finales ha jugado el plantel históricamente.</w:t>
       </w:r>
     </w:p>
     <w:p>
@@ -7192,8 +7538,13 @@
           <w:numId w:val="4"/>
         </w:numPr>
       </w:pPr>
-      <w:r>
-        <w:t>semifinals_before: cuántas semifinales ha jugado el plantel históricamente.</w:t>
+      <w:proofErr w:type="spellStart"/>
+      <w:r>
+        <w:t>semifinals_before</w:t>
+      </w:r>
+      <w:proofErr w:type="spellEnd"/>
+      <w:r>
+        <w:t>: cuántas semifinales ha jugado el plantel históricamente.</w:t>
       </w:r>
     </w:p>
     <w:p>
@@ -7203,8 +7554,13 @@
           <w:numId w:val="4"/>
         </w:numPr>
       </w:pPr>
-      <w:r>
-        <w:t>finals_before: cuántas finales ha jugado el plantel históricamente.</w:t>
+      <w:proofErr w:type="spellStart"/>
+      <w:r>
+        <w:t>finals_before</w:t>
+      </w:r>
+      <w:proofErr w:type="spellEnd"/>
+      <w:r>
+        <w:t>: cuántas finales ha jugado el plantel históricamente.</w:t>
       </w:r>
     </w:p>
     <w:p>
@@ -7225,8 +7581,13 @@
           <w:numId w:val="5"/>
         </w:numPr>
       </w:pPr>
-      <w:r>
-        <w:t>winner: si fue el ganador del torneo.</w:t>
+      <w:proofErr w:type="spellStart"/>
+      <w:r>
+        <w:t>winner</w:t>
+      </w:r>
+      <w:proofErr w:type="spellEnd"/>
+      <w:r>
+        <w:t>: si fue el ganador del torneo.</w:t>
       </w:r>
     </w:p>
     <w:p>
@@ -7236,8 +7597,13 @@
           <w:numId w:val="5"/>
         </w:numPr>
       </w:pPr>
-      <w:r>
-        <w:t>finalist: si fue finalista en el torneo.</w:t>
+      <w:proofErr w:type="spellStart"/>
+      <w:r>
+        <w:t>finalist</w:t>
+      </w:r>
+      <w:proofErr w:type="spellEnd"/>
+      <w:r>
+        <w:t>: si fue finalista en el torneo.</w:t>
       </w:r>
     </w:p>
     <w:p>
@@ -7247,8 +7613,13 @@
           <w:numId w:val="5"/>
         </w:numPr>
       </w:pPr>
-      <w:r>
-        <w:t>semi_finalist: si fue semifinalista en el torneo.</w:t>
+      <w:proofErr w:type="spellStart"/>
+      <w:r>
+        <w:t>semi_finalist</w:t>
+      </w:r>
+      <w:proofErr w:type="spellEnd"/>
+      <w:r>
+        <w:t>: si fue semifinalista en el torneo.</w:t>
       </w:r>
     </w:p>
     <w:p>
@@ -7258,8 +7629,13 @@
           <w:numId w:val="5"/>
         </w:numPr>
       </w:pPr>
-      <w:r>
-        <w:t>quarter_finalist: si llegó a cuartos de finales en el torneo.</w:t>
+      <w:proofErr w:type="spellStart"/>
+      <w:r>
+        <w:t>quarter_finalist</w:t>
+      </w:r>
+      <w:proofErr w:type="spellEnd"/>
+      <w:r>
+        <w:t>: si llegó a cuartos de finales en el torneo.</w:t>
       </w:r>
     </w:p>
     <w:p>
@@ -7279,7 +7655,7 @@
           <w:numId w:val="0"/>
         </w:numPr>
       </w:pPr>
-      <w:bookmarkStart w:id="32" w:name="_Toc231472777"/>
+      <w:bookmarkStart w:id="30" w:name="_Toc231472777"/>
       <w:r>
         <w:lastRenderedPageBreak/>
         <w:t>Apéndice B</w:t>
@@ -7293,7 +7669,7 @@
       <w:r>
         <w:t>country_info.csv</w:t>
       </w:r>
-      <w:bookmarkEnd w:id="32"/>
+      <w:bookmarkEnd w:id="30"/>
     </w:p>
     <w:p>
       <w:r>
@@ -7321,8 +7697,13 @@
           <w:numId w:val="6"/>
         </w:numPr>
       </w:pPr>
-      <w:r>
-        <w:t>demonym: gentilicio.</w:t>
+      <w:proofErr w:type="spellStart"/>
+      <w:r>
+        <w:t>demonym</w:t>
+      </w:r>
+      <w:proofErr w:type="spellEnd"/>
+      <w:r>
+        <w:t>: gentilicio.</w:t>
       </w:r>
     </w:p>
     <w:p>
@@ -7354,8 +7735,13 @@
           <w:numId w:val="6"/>
         </w:numPr>
       </w:pPr>
-      <w:r>
-        <w:t>tld: código de sitios web del país.</w:t>
+      <w:proofErr w:type="spellStart"/>
+      <w:r>
+        <w:t>tld</w:t>
+      </w:r>
+      <w:proofErr w:type="spellEnd"/>
+      <w:r>
+        <w:t>: código de sitios web del país.</w:t>
       </w:r>
     </w:p>
     <w:p>
@@ -7365,8 +7751,13 @@
           <w:numId w:val="6"/>
         </w:numPr>
       </w:pPr>
-      <w:r>
-        <w:t>currency: moneda oficial.</w:t>
+      <w:proofErr w:type="spellStart"/>
+      <w:r>
+        <w:t>currency</w:t>
+      </w:r>
+      <w:proofErr w:type="spellEnd"/>
+      <w:r>
+        <w:t>: moneda oficial.</w:t>
       </w:r>
     </w:p>
     <w:p>
@@ -7376,8 +7767,13 @@
           <w:numId w:val="6"/>
         </w:numPr>
       </w:pPr>
-      <w:r>
-        <w:t>population: población.</w:t>
+      <w:proofErr w:type="spellStart"/>
+      <w:r>
+        <w:t>population</w:t>
+      </w:r>
+      <w:proofErr w:type="spellEnd"/>
+      <w:r>
+        <w:t>: población.</w:t>
       </w:r>
     </w:p>
     <w:p>
@@ -7387,8 +7783,13 @@
           <w:numId w:val="6"/>
         </w:numPr>
       </w:pPr>
-      <w:r>
-        <w:t>density: densidad poblacional.</w:t>
+      <w:proofErr w:type="spellStart"/>
+      <w:r>
+        <w:t>density</w:t>
+      </w:r>
+      <w:proofErr w:type="spellEnd"/>
+      <w:r>
+        <w:t>: densidad poblacional.</w:t>
       </w:r>
     </w:p>
     <w:p>
@@ -7398,8 +7799,13 @@
           <w:numId w:val="6"/>
         </w:numPr>
       </w:pPr>
-      <w:r>
-        <w:t>area: extensión geográfica del país.</w:t>
+      <w:proofErr w:type="spellStart"/>
+      <w:r>
+        <w:t>area</w:t>
+      </w:r>
+      <w:proofErr w:type="spellEnd"/>
+      <w:r>
+        <w:t>: extensión geográfica del país.</w:t>
       </w:r>
     </w:p>
     <w:p>
@@ -7409,8 +7815,13 @@
           <w:numId w:val="6"/>
         </w:numPr>
       </w:pPr>
-      <w:r>
-        <w:t>gdp: producto bruto interno (PBI).</w:t>
+      <w:proofErr w:type="spellStart"/>
+      <w:r>
+        <w:t>gdp</w:t>
+      </w:r>
+      <w:proofErr w:type="spellEnd"/>
+      <w:r>
+        <w:t>: producto bruto interno (PBI).</w:t>
       </w:r>
     </w:p>
     <w:p>
@@ -7420,8 +7831,13 @@
           <w:numId w:val="6"/>
         </w:numPr>
       </w:pPr>
-      <w:r>
-        <w:t>median_age: mediana de edad.</w:t>
+      <w:proofErr w:type="spellStart"/>
+      <w:r>
+        <w:t>median_age</w:t>
+      </w:r>
+      <w:proofErr w:type="spellEnd"/>
+      <w:r>
+        <w:t>: mediana de edad.</w:t>
       </w:r>
     </w:p>
     <w:p>
@@ -7431,8 +7847,13 @@
           <w:numId w:val="6"/>
         </w:numPr>
       </w:pPr>
-      <w:r>
-        <w:t>language: idioma oficial.</w:t>
+      <w:proofErr w:type="spellStart"/>
+      <w:r>
+        <w:t>language</w:t>
+      </w:r>
+      <w:proofErr w:type="spellEnd"/>
+      <w:r>
+        <w:t>: idioma oficial.</w:t>
       </w:r>
     </w:p>
     <w:p>
@@ -7442,8 +7863,13 @@
           <w:numId w:val="6"/>
         </w:numPr>
       </w:pPr>
-      <w:r>
-        <w:t>website: web oficial.</w:t>
+      <w:proofErr w:type="spellStart"/>
+      <w:r>
+        <w:t>website</w:t>
+      </w:r>
+      <w:proofErr w:type="spellEnd"/>
+      <w:r>
+        <w:t>: web oficial.</w:t>
       </w:r>
     </w:p>
     <w:p>
@@ -7453,8 +7879,13 @@
           <w:numId w:val="6"/>
         </w:numPr>
       </w:pPr>
-      <w:r>
-        <w:t>calling_code: código telefónico del país.</w:t>
+      <w:proofErr w:type="spellStart"/>
+      <w:r>
+        <w:t>calling_code</w:t>
+      </w:r>
+      <w:proofErr w:type="spellEnd"/>
+      <w:r>
+        <w:t>: código telefónico del país.</w:t>
       </w:r>
     </w:p>
     <w:p>
@@ -7464,8 +7895,13 @@
           <w:numId w:val="6"/>
         </w:numPr>
       </w:pPr>
-      <w:r>
-        <w:t>driving_side: dirección de manejo vehicular.</w:t>
+      <w:proofErr w:type="spellStart"/>
+      <w:r>
+        <w:t>driving_side</w:t>
+      </w:r>
+      <w:proofErr w:type="spellEnd"/>
+      <w:r>
+        <w:t>: dirección de manejo vehicular.</w:t>
       </w:r>
     </w:p>
     <w:p>
@@ -7475,8 +7911,13 @@
           <w:numId w:val="6"/>
         </w:numPr>
       </w:pPr>
-      <w:r>
-        <w:t>continent: continente.</w:t>
+      <w:proofErr w:type="spellStart"/>
+      <w:r>
+        <w:t>continent</w:t>
+      </w:r>
+      <w:proofErr w:type="spellEnd"/>
+      <w:r>
+        <w:t>: continente.</w:t>
       </w:r>
     </w:p>
     <w:p>
@@ -7486,8 +7927,13 @@
           <w:numId w:val="6"/>
         </w:numPr>
       </w:pPr>
-      <w:r>
-        <w:t>un_member: si es miembro de la ONU.</w:t>
+      <w:proofErr w:type="spellStart"/>
+      <w:r>
+        <w:t>un_member</w:t>
+      </w:r>
+      <w:proofErr w:type="spellEnd"/>
+      <w:r>
+        <w:t>: si es miembro de la ONU.</w:t>
       </w:r>
     </w:p>
     <w:p>
@@ -7497,14 +7943,19 @@
           <w:numId w:val="6"/>
         </w:numPr>
       </w:pPr>
-      <w:r>
-        <w:t>religion: religión principal.</w:t>
+      <w:proofErr w:type="spellStart"/>
+      <w:r>
+        <w:t>religion</w:t>
+      </w:r>
+      <w:proofErr w:type="spellEnd"/>
+      <w:r>
+        <w:t>: religión principal.</w:t>
       </w:r>
     </w:p>
     <w:p/>
     <w:sectPr>
-      <w:headerReference w:type="default" r:id="rId23"/>
-      <w:footerReference w:type="default" r:id="rId24"/>
+      <w:headerReference w:type="default" r:id="rId17"/>
+      <w:footerReference w:type="default" r:id="rId18"/>
       <w:pgSz w:w="12240" w:h="15840"/>
       <w:pgMar w:top="1440" w:right="1440" w:bottom="1440" w:left="1440" w:header="708" w:footer="708" w:gutter="0"/>
       <w:cols w:space="720"/>
@@ -7512,45 +7963,6 @@
     </w:sectPr>
   </w:body>
 </w:document>
-</file>
-
-<file path=word/comments.xml><?xml version="1.0" encoding="utf-8"?>
-<w:comments xmlns:wpc="http://schemas.microsoft.com/office/word/2010/wordprocessingCanvas" xmlns:cx="http://schemas.microsoft.com/office/drawing/2014/chartex" xmlns:cx1="http://schemas.microsoft.com/office/drawing/2015/9/8/chartex" xmlns:cx2="http://schemas.microsoft.com/office/drawing/2015/10/21/chartex" xmlns:cx3="http://schemas.microsoft.com/office/drawing/2016/5/9/chartex" xmlns:cx4="http://schemas.microsoft.com/office/drawing/2016/5/10/chartex" xmlns:cx5="http://schemas.microsoft.com/office/drawing/2016/5/11/chartex" xmlns:cx6="http://schemas.microsoft.com/office/drawing/2016/5/12/chartex" xmlns:cx7="http://schemas.microsoft.com/office/drawing/2016/5/13/chartex" xmlns:cx8="http://schemas.microsoft.com/office/drawing/2016/5/14/chartex" xmlns:mc="http://schemas.openxmlformats.org/markup-compatibility/2006" xmlns:aink="http://schemas.microsoft.com/office/drawing/2016/ink" xmlns:am3d="http://schemas.microsoft.com/office/drawing/2017/model3d" xmlns:o="urn:schemas-microsoft-com:office:office" xmlns:oel="http://schemas.microsoft.com/office/2019/extlst" xmlns:r="http://schemas.openxmlformats.org/officeDocument/2006/relationships" xmlns:m="http://schemas.openxmlformats.org/officeDocument/2006/math" xmlns:v="urn:schemas-microsoft-com:vml" xmlns:wp14="http://schemas.microsoft.com/office/word/2010/wordprocessingDrawing" xmlns:wp="http://schemas.openxmlformats.org/drawingml/2006/wordprocessingDrawing" xmlns:w10="urn:schemas-microsoft-com:office:word" xmlns:w="http://schemas.openxmlformats.org/wordprocessingml/2006/main" xmlns:w14="http://schemas.microsoft.com/office/word/2010/wordml" xmlns:w15="http://schemas.microsoft.com/office/word/2012/wordml" xmlns:w16cex="http://schemas.microsoft.com/office/word/2018/wordml/cex" xmlns:w16cid="http://schemas.microsoft.com/office/word/2016/wordml/cid" xmlns:w16="http://schemas.microsoft.com/office/word/2018/wordml" xmlns:w16du="http://schemas.microsoft.com/office/word/2023/wordml/word16du" xmlns:w16sdtdh="http://schemas.microsoft.com/office/word/2020/wordml/sdtdatahash" xmlns:w16sdtfl="http://schemas.microsoft.com/office/word/2024/wordml/sdtformatlock" xmlns:w16se="http://schemas.microsoft.com/office/word/2015/wordml/symex" xmlns:wpg="http://schemas.microsoft.com/office/word/2010/wordprocessingGroup" xmlns:wpi="http://schemas.microsoft.com/office/word/2010/wordprocessingInk" xmlns:wne="http://schemas.microsoft.com/office/word/2006/wordml" xmlns:wps="http://schemas.microsoft.com/office/word/2010/wordprocessingShape" mc:Ignorable="w14 w15 w16se w16cid w16 w16cex w16sdtdh w16sdtfl w16du wp14">
-  <w:comment w:id="14" w:author="Carla Garibotti" w:date="2026-06-04T11:35:00Z" w:initials="CG">
-    <w:p>
-      <w:pPr>
-        <w:pStyle w:val="CommentText"/>
-      </w:pPr>
-      <w:r>
-        <w:rPr>
-          <w:rStyle w:val="CommentReference"/>
-        </w:rPr>
-        <w:annotationRef/>
-      </w:r>
-      <w:r>
-        <w:t>Editar el grafico, que no quede tan ancho</w:t>
-      </w:r>
-    </w:p>
-  </w:comment>
-</w:comments>
-</file>
-
-<file path=word/commentsExtended.xml><?xml version="1.0" encoding="utf-8"?>
-<w15:commentsEx xmlns:wpc="http://schemas.microsoft.com/office/word/2010/wordprocessingCanvas" xmlns:cx="http://schemas.microsoft.com/office/drawing/2014/chartex" xmlns:cx1="http://schemas.microsoft.com/office/drawing/2015/9/8/chartex" xmlns:cx2="http://schemas.microsoft.com/office/drawing/2015/10/21/chartex" xmlns:cx3="http://schemas.microsoft.com/office/drawing/2016/5/9/chartex" xmlns:cx4="http://schemas.microsoft.com/office/drawing/2016/5/10/chartex" xmlns:cx5="http://schemas.microsoft.com/office/drawing/2016/5/11/chartex" xmlns:cx6="http://schemas.microsoft.com/office/drawing/2016/5/12/chartex" xmlns:cx7="http://schemas.microsoft.com/office/drawing/2016/5/13/chartex" xmlns:cx8="http://schemas.microsoft.com/office/drawing/2016/5/14/chartex" xmlns:mc="http://schemas.openxmlformats.org/markup-compatibility/2006" xmlns:aink="http://schemas.microsoft.com/office/drawing/2016/ink" xmlns:am3d="http://schemas.microsoft.com/office/drawing/2017/model3d" xmlns:o="urn:schemas-microsoft-com:office:office" xmlns:oel="http://schemas.microsoft.com/office/2019/extlst" xmlns:r="http://schemas.openxmlformats.org/officeDocument/2006/relationships" xmlns:m="http://schemas.openxmlformats.org/officeDocument/2006/math" xmlns:v="urn:schemas-microsoft-com:vml" xmlns:wp14="http://schemas.microsoft.com/office/word/2010/wordprocessingDrawing" xmlns:wp="http://schemas.openxmlformats.org/drawingml/2006/wordprocessingDrawing" xmlns:w10="urn:schemas-microsoft-com:office:word" xmlns:w="http://schemas.openxmlformats.org/wordprocessingml/2006/main" xmlns:w14="http://schemas.microsoft.com/office/word/2010/wordml" xmlns:w15="http://schemas.microsoft.com/office/word/2012/wordml" xmlns:w16cex="http://schemas.microsoft.com/office/word/2018/wordml/cex" xmlns:w16cid="http://schemas.microsoft.com/office/word/2016/wordml/cid" xmlns:w16="http://schemas.microsoft.com/office/word/2018/wordml" xmlns:w16du="http://schemas.microsoft.com/office/word/2023/wordml/word16du" xmlns:w16sdtdh="http://schemas.microsoft.com/office/word/2020/wordml/sdtdatahash" xmlns:w16sdtfl="http://schemas.microsoft.com/office/word/2024/wordml/sdtformatlock" xmlns:w16se="http://schemas.microsoft.com/office/word/2015/wordml/symex" xmlns:wpg="http://schemas.microsoft.com/office/word/2010/wordprocessingGroup" xmlns:wpi="http://schemas.microsoft.com/office/word/2010/wordprocessingInk" xmlns:wne="http://schemas.microsoft.com/office/word/2006/wordml" xmlns:wps="http://schemas.microsoft.com/office/word/2010/wordprocessingShape" mc:Ignorable="w14 w15 w16se w16cid w16 w16cex w16sdtdh w16sdtfl w16du wp14">
-  <w15:commentEx w15:paraId="0F547643" w15:done="0"/>
-</w15:commentsEx>
-</file>
-
-<file path=word/commentsExtensible.xml><?xml version="1.0" encoding="utf-8"?>
-<w16cex:commentsExtensible xmlns:wpc="http://schemas.microsoft.com/office/word/2010/wordprocessingCanvas" xmlns:cx="http://schemas.microsoft.com/office/drawing/2014/chartex" xmlns:cx1="http://schemas.microsoft.com/office/drawing/2015/9/8/chartex" xmlns:cx2="http://schemas.microsoft.com/office/drawing/2015/10/21/chartex" xmlns:cx3="http://schemas.microsoft.com/office/drawing/2016/5/9/chartex" xmlns:cx4="http://schemas.microsoft.com/office/drawing/2016/5/10/chartex" xmlns:cx5="http://schemas.microsoft.com/office/drawing/2016/5/11/chartex" xmlns:cx6="http://schemas.microsoft.com/office/drawing/2016/5/12/chartex" xmlns:cx7="http://schemas.microsoft.com/office/drawing/2016/5/13/chartex" xmlns:cx8="http://schemas.microsoft.com/office/drawing/2016/5/14/chartex" xmlns:cr="http://schemas.microsoft.com/office/comments/2020/reactions" xmlns:mc="http://schemas.openxmlformats.org/markup-compatibility/2006" xmlns:aink="http://schemas.microsoft.com/office/drawing/2016/ink" xmlns:am3d="http://schemas.microsoft.com/office/drawing/2017/model3d" xmlns:o="urn:schemas-microsoft-com:office:office" xmlns:oel="http://schemas.microsoft.com/office/2019/extlst" xmlns:r="http://schemas.openxmlformats.org/officeDocument/2006/relationships" xmlns:m="http://schemas.openxmlformats.org/officeDocument/2006/math" xmlns:v="urn:schemas-microsoft-com:vml" xmlns:wp14="http://schemas.microsoft.com/office/word/2010/wordprocessingDrawing" xmlns:wp="http://schemas.openxmlformats.org/drawingml/2006/wordprocessingDrawing" xmlns:w10="urn:schemas-microsoft-com:office:word" xmlns:w="http://schemas.openxmlformats.org/wordprocessingml/2006/main" xmlns:w14="http://schemas.microsoft.com/office/word/2010/wordml" xmlns:w15="http://schemas.microsoft.com/office/word/2012/wordml" xmlns:w16cex="http://schemas.microsoft.com/office/word/2018/wordml/cex" xmlns:w16cid="http://schemas.microsoft.com/office/word/2016/wordml/cid" xmlns:w16="http://schemas.microsoft.com/office/word/2018/wordml" xmlns:w16du="http://schemas.microsoft.com/office/word/2023/wordml/word16du" xmlns:w16sdtdh="http://schemas.microsoft.com/office/word/2020/wordml/sdtdatahash" xmlns:w16sdtfl="http://schemas.microsoft.com/office/word/2024/wordml/sdtformatlock" xmlns:w16se="http://schemas.microsoft.com/office/word/2015/wordml/symex" xmlns:wpg="http://schemas.microsoft.com/office/word/2010/wordprocessingGroup" xmlns:wpi="http://schemas.microsoft.com/office/word/2010/wordprocessingInk" xmlns:wne="http://schemas.microsoft.com/office/word/2006/wordml" xmlns:wps="http://schemas.microsoft.com/office/word/2010/wordprocessingShape" mc:Ignorable="w14 w15 w16se w16cid w16 w16cex w16sdtdh w16sdtfl cr w16du wp14">
-  <w16cex:commentExtensible w16cex:durableId="33CED5B2" w16cex:dateUtc="2026-06-04T14:35:00Z"/>
-</w16cex:commentsExtensible>
-</file>
-
-<file path=word/commentsIds.xml><?xml version="1.0" encoding="utf-8"?>
-<w16cid:commentsIds xmlns:wpc="http://schemas.microsoft.com/office/word/2010/wordprocessingCanvas" xmlns:cx="http://schemas.microsoft.com/office/drawing/2014/chartex" xmlns:cx1="http://schemas.microsoft.com/office/drawing/2015/9/8/chartex" xmlns:cx2="http://schemas.microsoft.com/office/drawing/2015/10/21/chartex" xmlns:cx3="http://schemas.microsoft.com/office/drawing/2016/5/9/chartex" xmlns:cx4="http://schemas.microsoft.com/office/drawing/2016/5/10/chartex" xmlns:cx5="http://schemas.microsoft.com/office/drawing/2016/5/11/chartex" xmlns:cx6="http://schemas.microsoft.com/office/drawing/2016/5/12/chartex" xmlns:cx7="http://schemas.microsoft.com/office/drawing/2016/5/13/chartex" xmlns:cx8="http://schemas.microsoft.com/office/drawing/2016/5/14/chartex" xmlns:mc="http://schemas.openxmlformats.org/markup-compatibility/2006" xmlns:aink="http://schemas.microsoft.com/office/drawing/2016/ink" xmlns:am3d="http://schemas.microsoft.com/office/drawing/2017/model3d" xmlns:o="urn:schemas-microsoft-com:office:office" xmlns:oel="http://schemas.microsoft.com/office/2019/extlst" xmlns:r="http://schemas.openxmlformats.org/officeDocument/2006/relationships" xmlns:m="http://schemas.openxmlformats.org/officeDocument/2006/math" xmlns:v="urn:schemas-microsoft-com:vml" xmlns:wp14="http://schemas.microsoft.com/office/word/2010/wordprocessingDrawing" xmlns:wp="http://schemas.openxmlformats.org/drawingml/2006/wordprocessingDrawing" xmlns:w10="urn:schemas-microsoft-com:office:word" xmlns:w="http://schemas.openxmlformats.org/wordprocessingml/2006/main" xmlns:w14="http://schemas.microsoft.com/office/word/2010/wordml" xmlns:w15="http://schemas.microsoft.com/office/word/2012/wordml" xmlns:w16cex="http://schemas.microsoft.com/office/word/2018/wordml/cex" xmlns:w16cid="http://schemas.microsoft.com/office/word/2016/wordml/cid" xmlns:w16="http://schemas.microsoft.com/office/word/2018/wordml" xmlns:w16du="http://schemas.microsoft.com/office/word/2023/wordml/word16du" xmlns:w16sdtdh="http://schemas.microsoft.com/office/word/2020/wordml/sdtdatahash" xmlns:w16sdtfl="http://schemas.microsoft.com/office/word/2024/wordml/sdtformatlock" xmlns:w16se="http://schemas.microsoft.com/office/word/2015/wordml/symex" xmlns:wpg="http://schemas.microsoft.com/office/word/2010/wordprocessingGroup" xmlns:wpi="http://schemas.microsoft.com/office/word/2010/wordprocessingInk" xmlns:wne="http://schemas.microsoft.com/office/word/2006/wordml" xmlns:wps="http://schemas.microsoft.com/office/word/2010/wordprocessingShape" mc:Ignorable="w14 w15 w16se w16cid w16 w16cex w16sdtdh w16sdtfl w16du wp14">
-  <w16cid:commentId w16cid:paraId="0F547643" w16cid:durableId="33CED5B2"/>
-</w16cid:commentsIds>
 </file>
 
 <file path=word/endnotes.xml><?xml version="1.0" encoding="utf-8"?>
@@ -8986,14 +9398,6 @@
     <w:abstractNumId w:val="1"/>
   </w:num>
 </w:numbering>
-</file>
-
-<file path=word/people.xml><?xml version="1.0" encoding="utf-8"?>
-<w15:people xmlns:wpc="http://schemas.microsoft.com/office/word/2010/wordprocessingCanvas" xmlns:cx="http://schemas.microsoft.com/office/drawing/2014/chartex" xmlns:cx1="http://schemas.microsoft.com/office/drawing/2015/9/8/chartex" xmlns:cx2="http://schemas.microsoft.com/office/drawing/2015/10/21/chartex" xmlns:cx3="http://schemas.microsoft.com/office/drawing/2016/5/9/chartex" xmlns:cx4="http://schemas.microsoft.com/office/drawing/2016/5/10/chartex" xmlns:cx5="http://schemas.microsoft.com/office/drawing/2016/5/11/chartex" xmlns:cx6="http://schemas.microsoft.com/office/drawing/2016/5/12/chartex" xmlns:cx7="http://schemas.microsoft.com/office/drawing/2016/5/13/chartex" xmlns:cx8="http://schemas.microsoft.com/office/drawing/2016/5/14/chartex" xmlns:mc="http://schemas.openxmlformats.org/markup-compatibility/2006" xmlns:aink="http://schemas.microsoft.com/office/drawing/2016/ink" xmlns:am3d="http://schemas.microsoft.com/office/drawing/2017/model3d" xmlns:o="urn:schemas-microsoft-com:office:office" xmlns:oel="http://schemas.microsoft.com/office/2019/extlst" xmlns:r="http://schemas.openxmlformats.org/officeDocument/2006/relationships" xmlns:m="http://schemas.openxmlformats.org/officeDocument/2006/math" xmlns:v="urn:schemas-microsoft-com:vml" xmlns:wp14="http://schemas.microsoft.com/office/word/2010/wordprocessingDrawing" xmlns:wp="http://schemas.openxmlformats.org/drawingml/2006/wordprocessingDrawing" xmlns:w10="urn:schemas-microsoft-com:office:word" xmlns:w="http://schemas.openxmlformats.org/wordprocessingml/2006/main" xmlns:w14="http://schemas.microsoft.com/office/word/2010/wordml" xmlns:w15="http://schemas.microsoft.com/office/word/2012/wordml" xmlns:w16cex="http://schemas.microsoft.com/office/word/2018/wordml/cex" xmlns:w16cid="http://schemas.microsoft.com/office/word/2016/wordml/cid" xmlns:w16="http://schemas.microsoft.com/office/word/2018/wordml" xmlns:w16du="http://schemas.microsoft.com/office/word/2023/wordml/word16du" xmlns:w16sdtdh="http://schemas.microsoft.com/office/word/2020/wordml/sdtdatahash" xmlns:w16sdtfl="http://schemas.microsoft.com/office/word/2024/wordml/sdtformatlock" xmlns:w16se="http://schemas.microsoft.com/office/word/2015/wordml/symex" xmlns:wpg="http://schemas.microsoft.com/office/word/2010/wordprocessingGroup" xmlns:wpi="http://schemas.microsoft.com/office/word/2010/wordprocessingInk" xmlns:wne="http://schemas.microsoft.com/office/word/2006/wordml" xmlns:wps="http://schemas.microsoft.com/office/word/2010/wordprocessingShape" mc:Ignorable="w14 w15 w16se w16cid w16 w16cex w16sdtdh w16sdtfl w16du wp14">
-  <w15:person w15:author="Carla Garibotti">
-    <w15:presenceInfo w15:providerId="AD" w15:userId="S::cgaribotti@dreiconsa.com::e108638f-f23e-4831-a3ea-e344dafbfbb3"/>
-  </w15:person>
-</w15:people>
 </file>
 
 <file path=word/styles.xml><?xml version="1.0" encoding="utf-8"?>
@@ -9423,7 +9827,7 @@
     <w:uiPriority w:val="9"/>
     <w:unhideWhenUsed/>
     <w:qFormat/>
-    <w:rsid w:val="000D24AA"/>
+    <w:rsid w:val="005735A8"/>
     <w:pPr>
       <w:numPr>
         <w:ilvl w:val="1"/>
@@ -9434,7 +9838,7 @@
       <w:outlineLvl w:val="1"/>
     </w:pPr>
     <w:rPr>
-      <w:color w:val="7F7F7F" w:themeColor="text1" w:themeTint="80"/>
+      <w:color w:val="404040" w:themeColor="text1" w:themeTint="BF"/>
       <w:sz w:val="26"/>
       <w:szCs w:val="26"/>
     </w:rPr>

</xml_diff>

<commit_message>
feat: eliminacion del markdown redundante en la notebook
</commit_message>
<xml_diff>
--- a/informe/Informe_TPGrupal_Mundial_2026.docx
+++ b/informe/Informe_TPGrupal_Mundial_2026.docx
@@ -355,35 +355,50 @@
       <w:pPr>
         <w:spacing w:line="240" w:lineRule="auto"/>
         <w:jc w:val="center"/>
-      </w:pPr>
-      <w:proofErr w:type="gramStart"/>
-      <w:r>
-        <w:t>Link</w:t>
-      </w:r>
-      <w:proofErr w:type="gramEnd"/>
-      <w:r>
-        <w:t xml:space="preserve"> al repositorio: </w:t>
-      </w:r>
-      <w:hyperlink r:id="rId8" w:history="1">
-        <w:r>
-          <w:rPr>
-            <w:rStyle w:val="Hyperlink"/>
-          </w:rPr>
-          <w:t>https://github.com/gleo1973/tp-laboratorio-mcag-1c2026</w:t>
-        </w:r>
-      </w:hyperlink>
+        <w:rPr>
+          <w:lang w:val="it-IT"/>
+        </w:rPr>
+      </w:pPr>
+      <w:r>
+        <w:rPr>
+          <w:lang w:val="it-IT"/>
+        </w:rPr>
+        <w:t xml:space="preserve">Link al repositorio: </w:t>
+      </w:r>
+      <w:r>
+        <w:fldChar w:fldCharType="begin"/>
+      </w:r>
+      <w:r>
+        <w:rPr>
+          <w:lang w:val="it-IT"/>
+        </w:rPr>
+        <w:instrText>HYPERLINK "https://github.com/gleo1973/tp-laboratorio-mcag-1c2026"</w:instrText>
+      </w:r>
+      <w:r>
+        <w:fldChar w:fldCharType="separate"/>
+      </w:r>
+      <w:r>
+        <w:rPr>
+          <w:rStyle w:val="Hyperlink"/>
+          <w:lang w:val="it-IT"/>
+        </w:rPr>
+        <w:t>https://github.com/gleo1973/tp-laboratorio-mcag-1c2026</w:t>
+      </w:r>
+      <w:r>
+        <w:fldChar w:fldCharType="end"/>
+      </w:r>
     </w:p>
     <w:p>
       <w:pPr>
         <w:spacing w:line="240" w:lineRule="auto"/>
         <w:jc w:val="center"/>
         <w:rPr>
-          <w:lang w:val="en-US"/>
+          <w:lang w:val="it-IT"/>
         </w:rPr>
       </w:pPr>
       <w:r>
         <w:rPr>
-          <w:lang w:val="en-US"/>
+          <w:lang w:val="it-IT"/>
         </w:rPr>
         <w:t xml:space="preserve">Web url: </w:t>
       </w:r>
@@ -392,7 +407,7 @@
       </w:r>
       <w:r>
         <w:rPr>
-          <w:lang w:val="en-GB"/>
+          <w:lang w:val="it-IT"/>
         </w:rPr>
         <w:instrText>HYPERLINK "https://gleo1973.github.io/tp-laboratorio-mcag-1c2026/"</w:instrText>
       </w:r>
@@ -402,7 +417,7 @@
       <w:r>
         <w:rPr>
           <w:rStyle w:val="Hyperlink"/>
-          <w:lang w:val="en-US"/>
+          <w:lang w:val="it-IT"/>
         </w:rPr>
         <w:t>https://gleo1973.github.io/tp-laboratorio-mcag-1c2026/</w:t>
       </w:r>
@@ -415,7 +430,7 @@
         <w:spacing w:line="240" w:lineRule="auto"/>
         <w:jc w:val="center"/>
         <w:rPr>
-          <w:lang w:val="en-US"/>
+          <w:lang w:val="it-IT"/>
         </w:rPr>
       </w:pPr>
     </w:p>
@@ -424,7 +439,7 @@
         <w:spacing w:line="240" w:lineRule="auto"/>
         <w:jc w:val="left"/>
         <w:rPr>
-          <w:lang w:val="en-US"/>
+          <w:lang w:val="it-IT"/>
         </w:rPr>
       </w:pPr>
     </w:p>
@@ -433,12 +448,12 @@
         <w:spacing w:line="240" w:lineRule="auto"/>
         <w:jc w:val="left"/>
         <w:rPr>
-          <w:lang w:val="en-US"/>
+          <w:lang w:val="it-IT"/>
         </w:rPr>
       </w:pPr>
       <w:r>
         <w:rPr>
-          <w:lang w:val="en-US"/>
+          <w:lang w:val="it-IT"/>
         </w:rPr>
         <w:br w:type="page"/>
       </w:r>
@@ -2949,16 +2964,11 @@
     </w:p>
     <w:p>
       <w:pPr>
-        <w:spacing w:line="240" w:lineRule="auto"/>
-        <w:jc w:val="left"/>
-      </w:pPr>
-    </w:p>
-    <w:p>
-      <w:pPr>
         <w:pStyle w:val="Heading1"/>
       </w:pPr>
       <w:bookmarkStart w:id="0" w:name="_Toc231472765"/>
       <w:r>
+        <w:lastRenderedPageBreak/>
         <w:t>Resumen</w:t>
       </w:r>
       <w:bookmarkEnd w:id="0"/>
@@ -3156,20 +3166,23 @@
     </w:p>
     <w:p>
       <w:r>
+        <w:t xml:space="preserve">La cuestión es relevante porque permite </w:t>
+      </w:r>
+      <w:r>
+        <w:t xml:space="preserve">distinguir entre lo modificable y lo </w:t>
+      </w:r>
+      <w:r>
+        <w:t xml:space="preserve">estructural. </w:t>
+      </w:r>
+      <w:r>
+        <w:t xml:space="preserve"> </w:t>
+      </w:r>
+      <w:r>
+        <w:t xml:space="preserve">Las características demográficas y económicas de un país son relativamente estables en el tiempo: si </w:t>
+      </w:r>
+      <w:r>
         <w:lastRenderedPageBreak/>
-        <w:t xml:space="preserve">La cuestión es relevante porque permite </w:t>
-      </w:r>
-      <w:r>
-        <w:t xml:space="preserve">distinguir entre lo modificable y lo </w:t>
-      </w:r>
-      <w:r>
-        <w:t xml:space="preserve">estructural. </w:t>
-      </w:r>
-      <w:r>
-        <w:t xml:space="preserve"> </w:t>
-      </w:r>
-      <w:r>
-        <w:t>Las características demográficas y económicas de un país son relativamente estables en el tiempo: si fueran el principal determinante del rendimiento, este estaría en buena medida "predeterminado" y sería difícil de mejorar</w:t>
+        <w:t>fueran el principal determinante del rendimiento, este estaría en buena medida "predeterminado" y sería difícil de mejorar</w:t>
       </w:r>
       <w:r>
         <w:t xml:space="preserve"> de forma directa</w:t>
@@ -3720,7 +3733,6 @@
         </w:numPr>
       </w:pPr>
       <w:r>
-        <w:lastRenderedPageBreak/>
         <w:t>se homologó la denominación de la República Democrática del Congo</w:t>
       </w:r>
       <w:r>
@@ -3745,6 +3757,7 @@
     </w:p>
     <w:p>
       <w:r>
+        <w:lastRenderedPageBreak/>
         <w:t>En este último punto vale detenernos. El análisis depende de tomar variables económicas y demográficas por país. La mayoría de las fuentes toman a Inglaterra y Escocia como parte de Reino Unido; encontrar la información específica de cada una</w:t>
       </w:r>
       <w:r>
@@ -4174,6 +4187,221 @@
             <wp:extent cx="5817996" cy="3329875"/>
             <wp:effectExtent l="0" t="0" r="0" b="4445"/>
             <wp:docPr id="1" name="Picture 1"/>
+            <wp:cNvGraphicFramePr>
+              <a:graphicFrameLocks xmlns:a="http://schemas.openxmlformats.org/drawingml/2006/main" noChangeAspect="1"/>
+            </wp:cNvGraphicFramePr>
+            <a:graphic xmlns:a="http://schemas.openxmlformats.org/drawingml/2006/main">
+              <a:graphicData uri="http://schemas.openxmlformats.org/drawingml/2006/picture">
+                <pic:pic xmlns:pic="http://schemas.openxmlformats.org/drawingml/2006/picture">
+                  <pic:nvPicPr>
+                    <pic:cNvPr id="0" name=""/>
+                    <pic:cNvPicPr>
+                      <a:picLocks noChangeAspect="1" noChangeArrowheads="1"/>
+                    </pic:cNvPicPr>
+                  </pic:nvPicPr>
+                  <pic:blipFill>
+                    <a:blip r:embed="rId8"/>
+                    <a:srcRect/>
+                    <a:stretch>
+                      <a:fillRect/>
+                    </a:stretch>
+                  </pic:blipFill>
+                  <pic:spPr bwMode="auto">
+                    <a:xfrm>
+                      <a:off x="0" y="0"/>
+                      <a:ext cx="5854087" cy="3350532"/>
+                    </a:xfrm>
+                    <a:prstGeom prst="rect">
+                      <a:avLst/>
+                    </a:prstGeom>
+                  </pic:spPr>
+                </pic:pic>
+              </a:graphicData>
+            </a:graphic>
+          </wp:inline>
+        </w:drawing>
+      </w:r>
+    </w:p>
+    <w:p>
+      <w:pPr>
+        <w:pStyle w:val="Caption"/>
+        <w:jc w:val="center"/>
+      </w:pPr>
+      <w:bookmarkStart w:id="7" w:name="_Ref231390466"/>
+      <w:bookmarkStart w:id="8" w:name="_Toc231503934"/>
+      <w:r>
+        <w:t xml:space="preserve">Figura </w:t>
+      </w:r>
+      <w:fldSimple w:instr=" SEQ Figura \* ARABIC ">
+        <w:r>
+          <w:rPr>
+            <w:noProof/>
+          </w:rPr>
+          <w:t>1</w:t>
+        </w:r>
+      </w:fldSimple>
+      <w:bookmarkEnd w:id="7"/>
+      <w:r>
+        <w:t xml:space="preserve">: </w:t>
+      </w:r>
+      <w:r>
+        <w:t>Matriz de correlación entre el puntaje FIFA, el valor del plantel y los indicadores demográficos y económicos del país de origen.</w:t>
+      </w:r>
+      <w:bookmarkEnd w:id="8"/>
+    </w:p>
+    <w:p>
+      <w:pPr>
+        <w:rPr>
+          <w:u w:val="single"/>
+        </w:rPr>
+      </w:pPr>
+    </w:p>
+    <w:p>
+      <w:pPr>
+        <w:pStyle w:val="Heading2"/>
+      </w:pPr>
+      <w:bookmarkStart w:id="9" w:name="_Toc231472771"/>
+      <w:r>
+        <w:t xml:space="preserve">Variables </w:t>
+      </w:r>
+      <w:r>
+        <w:t>categóricas</w:t>
+      </w:r>
+      <w:bookmarkEnd w:id="9"/>
+    </w:p>
+    <w:p>
+      <w:pPr>
+        <w:rPr>
+          <w:u w:val="single"/>
+        </w:rPr>
+      </w:pPr>
+      <w:r>
+        <w:t xml:space="preserve">A </w:t>
+      </w:r>
+      <w:proofErr w:type="gramStart"/>
+      <w:r>
+        <w:t>continuación</w:t>
+      </w:r>
+      <w:proofErr w:type="gramEnd"/>
+      <w:r>
+        <w:t xml:space="preserve"> se evaluaron las variables categóricas </w:t>
+      </w:r>
+      <w:r>
+        <w:t>utilizando</w:t>
+      </w:r>
+      <w:r>
+        <w:t xml:space="preserve"> gráficos de </w:t>
+      </w:r>
+      <w:proofErr w:type="spellStart"/>
+      <w:r>
+        <w:t>boxplot</w:t>
+      </w:r>
+      <w:proofErr w:type="spellEnd"/>
+      <w:r>
+        <w:t>: por continente (</w:t>
+      </w:r>
+      <w:r>
+        <w:fldChar w:fldCharType="begin"/>
+      </w:r>
+      <w:r>
+        <w:instrText xml:space="preserve"> REF _Ref231391086 \h </w:instrText>
+      </w:r>
+      <w:r>
+        <w:fldChar w:fldCharType="separate"/>
+      </w:r>
+      <w:r>
+        <w:t xml:space="preserve">Figura </w:t>
+      </w:r>
+      <w:r>
+        <w:rPr>
+          <w:noProof/>
+        </w:rPr>
+        <w:t>2</w:t>
+      </w:r>
+      <w:r>
+        <w:fldChar w:fldCharType="end"/>
+      </w:r>
+      <w:r>
+        <w:t xml:space="preserve">), </w:t>
+      </w:r>
+      <w:r>
+        <w:t>idioma</w:t>
+      </w:r>
+      <w:r>
+        <w:t xml:space="preserve"> (</w:t>
+      </w:r>
+      <w:r>
+        <w:fldChar w:fldCharType="begin"/>
+      </w:r>
+      <w:r>
+        <w:instrText xml:space="preserve"> REF _Ref231391408 \h </w:instrText>
+      </w:r>
+      <w:r>
+        <w:fldChar w:fldCharType="separate"/>
+      </w:r>
+      <w:r>
+        <w:t xml:space="preserve">Figura </w:t>
+      </w:r>
+      <w:r>
+        <w:rPr>
+          <w:noProof/>
+        </w:rPr>
+        <w:t>3</w:t>
+      </w:r>
+      <w:r>
+        <w:fldChar w:fldCharType="end"/>
+      </w:r>
+      <w:r>
+        <w:t xml:space="preserve">) </w:t>
+      </w:r>
+      <w:r>
+        <w:t xml:space="preserve">y religión </w:t>
+      </w:r>
+      <w:r>
+        <w:t>(</w:t>
+      </w:r>
+      <w:r>
+        <w:fldChar w:fldCharType="begin"/>
+      </w:r>
+      <w:r>
+        <w:instrText xml:space="preserve"> REF _Ref231391423 \h </w:instrText>
+      </w:r>
+      <w:r>
+        <w:fldChar w:fldCharType="separate"/>
+      </w:r>
+      <w:r>
+        <w:t xml:space="preserve">Figura </w:t>
+      </w:r>
+      <w:r>
+        <w:rPr>
+          <w:noProof/>
+        </w:rPr>
+        <w:t>4</w:t>
+      </w:r>
+      <w:r>
+        <w:fldChar w:fldCharType="end"/>
+      </w:r>
+      <w:r>
+        <w:t xml:space="preserve">). </w:t>
+      </w:r>
+    </w:p>
+    <w:p/>
+    <w:p>
+      <w:pPr>
+        <w:keepNext/>
+        <w:spacing w:before="80" w:after="30"/>
+        <w:jc w:val="center"/>
+      </w:pPr>
+      <w:r>
+        <w:rPr>
+          <w:noProof/>
+        </w:rPr>
+        <w:lastRenderedPageBreak/>
+        <w:drawing>
+          <wp:inline distT="0" distB="0" distL="0" distR="0" wp14:anchorId="5716749C" wp14:editId="390F0C66">
+            <wp:extent cx="6065476" cy="2260879"/>
+            <wp:effectExtent l="0" t="0" r="0" b="6350"/>
+            <wp:docPr id="1699641359" name="Picture 1699641359"/>
             <wp:cNvGraphicFramePr>
               <a:graphicFrameLocks xmlns:a="http://schemas.openxmlformats.org/drawingml/2006/main" noChangeAspect="1"/>
             </wp:cNvGraphicFramePr>
@@ -4196,221 +4424,6 @@
                   <pic:spPr bwMode="auto">
                     <a:xfrm>
                       <a:off x="0" y="0"/>
-                      <a:ext cx="5854087" cy="3350532"/>
-                    </a:xfrm>
-                    <a:prstGeom prst="rect">
-                      <a:avLst/>
-                    </a:prstGeom>
-                  </pic:spPr>
-                </pic:pic>
-              </a:graphicData>
-            </a:graphic>
-          </wp:inline>
-        </w:drawing>
-      </w:r>
-    </w:p>
-    <w:p>
-      <w:pPr>
-        <w:pStyle w:val="Caption"/>
-        <w:jc w:val="center"/>
-      </w:pPr>
-      <w:bookmarkStart w:id="7" w:name="_Ref231390466"/>
-      <w:bookmarkStart w:id="8" w:name="_Toc231503934"/>
-      <w:r>
-        <w:t xml:space="preserve">Figura </w:t>
-      </w:r>
-      <w:fldSimple w:instr=" SEQ Figura \* ARABIC ">
-        <w:r>
-          <w:rPr>
-            <w:noProof/>
-          </w:rPr>
-          <w:t>1</w:t>
-        </w:r>
-      </w:fldSimple>
-      <w:bookmarkEnd w:id="7"/>
-      <w:r>
-        <w:t xml:space="preserve">: </w:t>
-      </w:r>
-      <w:r>
-        <w:t>Matriz de correlación entre el puntaje FIFA, el valor del plantel y los indicadores demográficos y económicos del país de origen.</w:t>
-      </w:r>
-      <w:bookmarkEnd w:id="8"/>
-    </w:p>
-    <w:p>
-      <w:pPr>
-        <w:rPr>
-          <w:u w:val="single"/>
-        </w:rPr>
-      </w:pPr>
-    </w:p>
-    <w:p>
-      <w:pPr>
-        <w:pStyle w:val="Heading2"/>
-      </w:pPr>
-      <w:bookmarkStart w:id="9" w:name="_Toc231472771"/>
-      <w:r>
-        <w:t xml:space="preserve">Variables </w:t>
-      </w:r>
-      <w:r>
-        <w:t>categóricas</w:t>
-      </w:r>
-      <w:bookmarkEnd w:id="9"/>
-    </w:p>
-    <w:p>
-      <w:pPr>
-        <w:rPr>
-          <w:u w:val="single"/>
-        </w:rPr>
-      </w:pPr>
-      <w:r>
-        <w:t xml:space="preserve">A </w:t>
-      </w:r>
-      <w:proofErr w:type="gramStart"/>
-      <w:r>
-        <w:t>continuación</w:t>
-      </w:r>
-      <w:proofErr w:type="gramEnd"/>
-      <w:r>
-        <w:t xml:space="preserve"> se evaluaron las variables categóricas </w:t>
-      </w:r>
-      <w:r>
-        <w:t>utilizando</w:t>
-      </w:r>
-      <w:r>
-        <w:t xml:space="preserve"> gráficos de </w:t>
-      </w:r>
-      <w:proofErr w:type="spellStart"/>
-      <w:r>
-        <w:t>boxplot</w:t>
-      </w:r>
-      <w:proofErr w:type="spellEnd"/>
-      <w:r>
-        <w:t>: por continente (</w:t>
-      </w:r>
-      <w:r>
-        <w:fldChar w:fldCharType="begin"/>
-      </w:r>
-      <w:r>
-        <w:instrText xml:space="preserve"> REF _Ref231391086 \h </w:instrText>
-      </w:r>
-      <w:r>
-        <w:fldChar w:fldCharType="separate"/>
-      </w:r>
-      <w:r>
-        <w:t xml:space="preserve">Figura </w:t>
-      </w:r>
-      <w:r>
-        <w:rPr>
-          <w:noProof/>
-        </w:rPr>
-        <w:t>2</w:t>
-      </w:r>
-      <w:r>
-        <w:fldChar w:fldCharType="end"/>
-      </w:r>
-      <w:r>
-        <w:t xml:space="preserve">), </w:t>
-      </w:r>
-      <w:r>
-        <w:t>idioma</w:t>
-      </w:r>
-      <w:r>
-        <w:t xml:space="preserve"> (</w:t>
-      </w:r>
-      <w:r>
-        <w:fldChar w:fldCharType="begin"/>
-      </w:r>
-      <w:r>
-        <w:instrText xml:space="preserve"> REF _Ref231391408 \h </w:instrText>
-      </w:r>
-      <w:r>
-        <w:fldChar w:fldCharType="separate"/>
-      </w:r>
-      <w:r>
-        <w:t xml:space="preserve">Figura </w:t>
-      </w:r>
-      <w:r>
-        <w:rPr>
-          <w:noProof/>
-        </w:rPr>
-        <w:t>3</w:t>
-      </w:r>
-      <w:r>
-        <w:fldChar w:fldCharType="end"/>
-      </w:r>
-      <w:r>
-        <w:t xml:space="preserve">) </w:t>
-      </w:r>
-      <w:r>
-        <w:t xml:space="preserve">y religión </w:t>
-      </w:r>
-      <w:r>
-        <w:t>(</w:t>
-      </w:r>
-      <w:r>
-        <w:fldChar w:fldCharType="begin"/>
-      </w:r>
-      <w:r>
-        <w:instrText xml:space="preserve"> REF _Ref231391423 \h </w:instrText>
-      </w:r>
-      <w:r>
-        <w:fldChar w:fldCharType="separate"/>
-      </w:r>
-      <w:r>
-        <w:t xml:space="preserve">Figura </w:t>
-      </w:r>
-      <w:r>
-        <w:rPr>
-          <w:noProof/>
-        </w:rPr>
-        <w:t>4</w:t>
-      </w:r>
-      <w:r>
-        <w:fldChar w:fldCharType="end"/>
-      </w:r>
-      <w:r>
-        <w:t xml:space="preserve">). </w:t>
-      </w:r>
-    </w:p>
-    <w:p/>
-    <w:p>
-      <w:pPr>
-        <w:keepNext/>
-        <w:spacing w:before="80" w:after="30"/>
-        <w:jc w:val="center"/>
-      </w:pPr>
-      <w:r>
-        <w:rPr>
-          <w:noProof/>
-        </w:rPr>
-        <w:lastRenderedPageBreak/>
-        <w:drawing>
-          <wp:inline distT="0" distB="0" distL="0" distR="0" wp14:anchorId="5716749C" wp14:editId="390F0C66">
-            <wp:extent cx="6065476" cy="2260879"/>
-            <wp:effectExtent l="0" t="0" r="0" b="6350"/>
-            <wp:docPr id="1699641359" name="Picture 1699641359"/>
-            <wp:cNvGraphicFramePr>
-              <a:graphicFrameLocks xmlns:a="http://schemas.openxmlformats.org/drawingml/2006/main" noChangeAspect="1"/>
-            </wp:cNvGraphicFramePr>
-            <a:graphic xmlns:a="http://schemas.openxmlformats.org/drawingml/2006/main">
-              <a:graphicData uri="http://schemas.openxmlformats.org/drawingml/2006/picture">
-                <pic:pic xmlns:pic="http://schemas.openxmlformats.org/drawingml/2006/picture">
-                  <pic:nvPicPr>
-                    <pic:cNvPr id="0" name=""/>
-                    <pic:cNvPicPr>
-                      <a:picLocks noChangeAspect="1" noChangeArrowheads="1"/>
-                    </pic:cNvPicPr>
-                  </pic:nvPicPr>
-                  <pic:blipFill>
-                    <a:blip r:embed="rId10"/>
-                    <a:srcRect/>
-                    <a:stretch>
-                      <a:fillRect/>
-                    </a:stretch>
-                  </pic:blipFill>
-                  <pic:spPr bwMode="auto">
-                    <a:xfrm>
-                      <a:off x="0" y="0"/>
                       <a:ext cx="6088250" cy="2269368"/>
                     </a:xfrm>
                     <a:prstGeom prst="rect">
@@ -4485,7 +4498,7 @@
           <w:noProof/>
         </w:rPr>
         <w:drawing>
-          <wp:inline distT="0" distB="0" distL="0" distR="0" wp14:anchorId="119D407A" wp14:editId="7B07F114">
+          <wp:inline distT="0" distB="0" distL="0" distR="0" wp14:anchorId="119D407A" wp14:editId="58AB950B">
             <wp:extent cx="5943600" cy="1981200"/>
             <wp:effectExtent l="0" t="0" r="0" b="0"/>
             <wp:docPr id="1761773335" name="Imagen 2"/>
@@ -4500,7 +4513,7 @@
                     <pic:cNvPicPr/>
                   </pic:nvPicPr>
                   <pic:blipFill>
-                    <a:blip r:embed="rId11" cstate="print">
+                    <a:blip r:embed="rId10" cstate="print">
                       <a:extLst>
                         <a:ext uri="{28A0092B-C50C-407E-A947-70E740481C1C}">
                           <a14:useLocalDpi xmlns:a14="http://schemas.microsoft.com/office/drawing/2010/main" val="0"/>
@@ -4664,7 +4677,7 @@
                     <pic:cNvPicPr/>
                   </pic:nvPicPr>
                   <pic:blipFill>
-                    <a:blip r:embed="rId12" cstate="print">
+                    <a:blip r:embed="rId11" cstate="print">
                       <a:extLst>
                         <a:ext uri="{28A0092B-C50C-407E-A947-70E740481C1C}">
                           <a14:useLocalDpi xmlns:a14="http://schemas.microsoft.com/office/drawing/2010/main" val="0"/>
@@ -4875,7 +4888,7 @@
                     </pic:cNvPicPr>
                   </pic:nvPicPr>
                   <pic:blipFill>
-                    <a:blip r:embed="rId13"/>
+                    <a:blip r:embed="rId12"/>
                     <a:srcRect/>
                     <a:stretch>
                       <a:fillRect/>
@@ -5711,7 +5724,7 @@
                     <pic:cNvPicPr/>
                   </pic:nvPicPr>
                   <pic:blipFill>
-                    <a:blip r:embed="rId14">
+                    <a:blip r:embed="rId13">
                       <a:extLst>
                         <a:ext uri="{28A0092B-C50C-407E-A947-70E740481C1C}">
                           <a14:useLocalDpi xmlns:a14="http://schemas.microsoft.com/office/drawing/2010/main" val="0"/>
@@ -6086,7 +6099,7 @@
           <w:noProof/>
         </w:rPr>
         <w:drawing>
-          <wp:inline distT="0" distB="0" distL="0" distR="0" wp14:anchorId="71D9D7D5" wp14:editId="5012C477">
+          <wp:inline distT="0" distB="0" distL="0" distR="0" wp14:anchorId="71D9D7D5" wp14:editId="477B1A45">
             <wp:extent cx="5943600" cy="1919932"/>
             <wp:effectExtent l="0" t="0" r="0" b="4445"/>
             <wp:docPr id="264529016" name="Imagen 2"/>
@@ -6101,7 +6114,7 @@
                     <pic:cNvPicPr/>
                   </pic:nvPicPr>
                   <pic:blipFill>
-                    <a:blip r:embed="rId15" cstate="print">
+                    <a:blip r:embed="rId14" cstate="print">
                       <a:extLst>
                         <a:ext uri="{28A0092B-C50C-407E-A947-70E740481C1C}">
                           <a14:useLocalDpi xmlns:a14="http://schemas.microsoft.com/office/drawing/2010/main" val="0"/>
@@ -6919,7 +6932,7 @@
                     </pic:cNvPicPr>
                   </pic:nvPicPr>
                   <pic:blipFill>
-                    <a:blip r:embed="rId16"/>
+                    <a:blip r:embed="rId15"/>
                     <a:srcRect/>
                     <a:stretch>
                       <a:fillRect/>
@@ -7954,8 +7967,8 @@
     </w:p>
     <w:p/>
     <w:sectPr>
-      <w:headerReference w:type="default" r:id="rId17"/>
-      <w:footerReference w:type="default" r:id="rId18"/>
+      <w:headerReference w:type="default" r:id="rId16"/>
+      <w:footerReference w:type="default" r:id="rId17"/>
       <w:pgSz w:w="12240" w:h="15840"/>
       <w:pgMar w:top="1440" w:right="1440" w:bottom="1440" w:left="1440" w:header="708" w:footer="708" w:gutter="0"/>
       <w:cols w:space="720"/>

</xml_diff>

<commit_message>
fix: actualizacion del PPT e informe para reflejar los nuevos graficos
</commit_message>
<xml_diff>
--- a/informe/Informe_TPGrupal_Mundial_2026.docx
+++ b/informe/Informe_TPGrupal_Mundial_2026.docx
@@ -365,72 +365,46 @@
         </w:rPr>
         <w:t xml:space="preserve">Link al repositorio: </w:t>
       </w:r>
-      <w:r>
-        <w:fldChar w:fldCharType="begin"/>
-      </w:r>
-      <w:r>
-        <w:rPr>
-          <w:lang w:val="it-IT"/>
-        </w:rPr>
-        <w:instrText>HYPERLINK "https://github.com/gleo1973/tp-laboratorio-mcag-1c2026"</w:instrText>
-      </w:r>
-      <w:r>
-        <w:fldChar w:fldCharType="separate"/>
-      </w:r>
-      <w:r>
-        <w:rPr>
-          <w:rStyle w:val="Hyperlink"/>
-          <w:lang w:val="it-IT"/>
-        </w:rPr>
-        <w:t>https://github.com/gleo1973/tp-laboratorio-mcag-1c2026</w:t>
-      </w:r>
-      <w:r>
-        <w:fldChar w:fldCharType="end"/>
-      </w:r>
+      <w:hyperlink r:id="rId8" w:history="1">
+        <w:r>
+          <w:rPr>
+            <w:rStyle w:val="Hyperlink"/>
+            <w:lang w:val="it-IT"/>
+          </w:rPr>
+          <w:t>https://github.com/gleo1973/tp-laboratorio-mcag-1c2026</w:t>
+        </w:r>
+      </w:hyperlink>
     </w:p>
     <w:p>
       <w:pPr>
         <w:spacing w:line="240" w:lineRule="auto"/>
         <w:jc w:val="center"/>
         <w:rPr>
-          <w:lang w:val="it-IT"/>
+          <w:lang w:val="en-GB"/>
         </w:rPr>
       </w:pPr>
       <w:r>
         <w:rPr>
-          <w:lang w:val="it-IT"/>
+          <w:lang w:val="en-GB"/>
         </w:rPr>
         <w:t xml:space="preserve">Web url: </w:t>
       </w:r>
-      <w:r>
-        <w:fldChar w:fldCharType="begin"/>
-      </w:r>
-      <w:r>
-        <w:rPr>
-          <w:lang w:val="it-IT"/>
-        </w:rPr>
-        <w:instrText>HYPERLINK "https://gleo1973.github.io/tp-laboratorio-mcag-1c2026/"</w:instrText>
-      </w:r>
-      <w:r>
-        <w:fldChar w:fldCharType="separate"/>
-      </w:r>
-      <w:r>
-        <w:rPr>
-          <w:rStyle w:val="Hyperlink"/>
-          <w:lang w:val="it-IT"/>
-        </w:rPr>
-        <w:t>https://gleo1973.github.io/tp-laboratorio-mcag-1c2026/</w:t>
-      </w:r>
-      <w:r>
-        <w:fldChar w:fldCharType="end"/>
-      </w:r>
+      <w:hyperlink r:id="rId9" w:history="1">
+        <w:r>
+          <w:rPr>
+            <w:rStyle w:val="Hyperlink"/>
+            <w:lang w:val="en-GB"/>
+          </w:rPr>
+          <w:t>https://gleo1973.github.io/tp-laboratorio-mcag-1c2026/</w:t>
+        </w:r>
+      </w:hyperlink>
     </w:p>
     <w:p>
       <w:pPr>
         <w:spacing w:line="240" w:lineRule="auto"/>
         <w:jc w:val="center"/>
         <w:rPr>
-          <w:lang w:val="it-IT"/>
+          <w:lang w:val="en-GB"/>
         </w:rPr>
       </w:pPr>
     </w:p>
@@ -439,7 +413,7 @@
         <w:spacing w:line="240" w:lineRule="auto"/>
         <w:jc w:val="left"/>
         <w:rPr>
-          <w:lang w:val="it-IT"/>
+          <w:lang w:val="en-GB"/>
         </w:rPr>
       </w:pPr>
     </w:p>
@@ -448,12 +422,12 @@
         <w:spacing w:line="240" w:lineRule="auto"/>
         <w:jc w:val="left"/>
         <w:rPr>
-          <w:lang w:val="it-IT"/>
+          <w:lang w:val="en-GB"/>
         </w:rPr>
       </w:pPr>
       <w:r>
         <w:rPr>
-          <w:lang w:val="it-IT"/>
+          <w:lang w:val="en-GB"/>
         </w:rPr>
         <w:br w:type="page"/>
       </w:r>
@@ -1260,7 +1234,7 @@
                 <w:sz w:val="20"/>
                 <w:szCs w:val="20"/>
               </w:rPr>
-              <w:t>6</w:t>
+              <w:t>8</w:t>
             </w:r>
             <w:r>
               <w:rPr>
@@ -1366,7 +1340,7 @@
                 <w:sz w:val="20"/>
                 <w:szCs w:val="20"/>
               </w:rPr>
-              <w:t>9</w:t>
+              <w:t>10</w:t>
             </w:r>
             <w:r>
               <w:rPr>
@@ -1472,7 +1446,7 @@
                 <w:sz w:val="20"/>
                 <w:szCs w:val="20"/>
               </w:rPr>
-              <w:t>11</w:t>
+              <w:t>12</w:t>
             </w:r>
             <w:r>
               <w:rPr>
@@ -1578,7 +1552,7 @@
                 <w:sz w:val="20"/>
                 <w:szCs w:val="20"/>
               </w:rPr>
-              <w:t>12</w:t>
+              <w:t>13</w:t>
             </w:r>
             <w:r>
               <w:rPr>
@@ -1684,7 +1658,7 @@
                 <w:sz w:val="20"/>
                 <w:szCs w:val="20"/>
               </w:rPr>
-              <w:t>13</w:t>
+              <w:t>15</w:t>
             </w:r>
             <w:r>
               <w:rPr>
@@ -1771,7 +1745,7 @@
                 <w:sz w:val="20"/>
                 <w:szCs w:val="20"/>
               </w:rPr>
-              <w:t>15</w:t>
+              <w:t>16</w:t>
             </w:r>
             <w:r>
               <w:rPr>
@@ -1858,7 +1832,7 @@
                 <w:sz w:val="20"/>
                 <w:szCs w:val="20"/>
               </w:rPr>
-              <w:t>16</w:t>
+              <w:t>17</w:t>
             </w:r>
             <w:r>
               <w:rPr>
@@ -1922,8 +1896,8 @@
         </w:tabs>
         <w:rPr>
           <w:noProof/>
-          <w:sz w:val="20"/>
-          <w:szCs w:val="20"/>
+          <w:sz w:val="18"/>
+          <w:szCs w:val="18"/>
         </w:rPr>
       </w:pPr>
       <w:r>
@@ -1952,8 +1926,8 @@
           <w:rPr>
             <w:rStyle w:val="Hyperlink"/>
             <w:noProof/>
-            <w:sz w:val="20"/>
-            <w:szCs w:val="20"/>
+            <w:sz w:val="18"/>
+            <w:szCs w:val="18"/>
           </w:rPr>
           <w:t>Tabla 1: Datasets utilizados</w:t>
         </w:r>
@@ -1961,8 +1935,8 @@
           <w:rPr>
             <w:noProof/>
             <w:webHidden/>
-            <w:sz w:val="20"/>
-            <w:szCs w:val="20"/>
+            <w:sz w:val="18"/>
+            <w:szCs w:val="18"/>
           </w:rPr>
           <w:tab/>
         </w:r>
@@ -1970,8 +1944,8 @@
           <w:rPr>
             <w:noProof/>
             <w:webHidden/>
-            <w:sz w:val="20"/>
-            <w:szCs w:val="20"/>
+            <w:sz w:val="18"/>
+            <w:szCs w:val="18"/>
           </w:rPr>
           <w:fldChar w:fldCharType="begin"/>
         </w:r>
@@ -1979,8 +1953,8 @@
           <w:rPr>
             <w:noProof/>
             <w:webHidden/>
-            <w:sz w:val="20"/>
-            <w:szCs w:val="20"/>
+            <w:sz w:val="18"/>
+            <w:szCs w:val="18"/>
           </w:rPr>
           <w:instrText xml:space="preserve"> PAGEREF _Toc231472809 \h </w:instrText>
         </w:r>
@@ -1988,16 +1962,16 @@
           <w:rPr>
             <w:noProof/>
             <w:webHidden/>
-            <w:sz w:val="20"/>
-            <w:szCs w:val="20"/>
+            <w:sz w:val="18"/>
+            <w:szCs w:val="18"/>
           </w:rPr>
         </w:r>
         <w:r>
           <w:rPr>
             <w:noProof/>
             <w:webHidden/>
-            <w:sz w:val="20"/>
-            <w:szCs w:val="20"/>
+            <w:sz w:val="18"/>
+            <w:szCs w:val="18"/>
           </w:rPr>
           <w:fldChar w:fldCharType="separate"/>
         </w:r>
@@ -2005,8 +1979,8 @@
           <w:rPr>
             <w:noProof/>
             <w:webHidden/>
-            <w:sz w:val="20"/>
-            <w:szCs w:val="20"/>
+            <w:sz w:val="18"/>
+            <w:szCs w:val="18"/>
           </w:rPr>
           <w:t>4</w:t>
         </w:r>
@@ -2014,8 +1988,8 @@
           <w:rPr>
             <w:noProof/>
             <w:webHidden/>
-            <w:sz w:val="20"/>
-            <w:szCs w:val="20"/>
+            <w:sz w:val="18"/>
+            <w:szCs w:val="18"/>
           </w:rPr>
           <w:fldChar w:fldCharType="end"/>
         </w:r>
@@ -2029,8 +2003,8 @@
         </w:tabs>
         <w:rPr>
           <w:noProof/>
-          <w:sz w:val="20"/>
-          <w:szCs w:val="20"/>
+          <w:sz w:val="18"/>
+          <w:szCs w:val="18"/>
         </w:rPr>
       </w:pPr>
       <w:hyperlink w:anchor="_Toc231472810" w:history="1">
@@ -2038,8 +2012,8 @@
           <w:rPr>
             <w:rStyle w:val="Hyperlink"/>
             <w:noProof/>
-            <w:sz w:val="20"/>
-            <w:szCs w:val="20"/>
+            <w:sz w:val="18"/>
+            <w:szCs w:val="18"/>
           </w:rPr>
           <w:t>Tabla 2: Coeficiente de determinación (R²) de los modelos evaluados.</w:t>
         </w:r>
@@ -2047,8 +2021,8 @@
           <w:rPr>
             <w:noProof/>
             <w:webHidden/>
-            <w:sz w:val="20"/>
-            <w:szCs w:val="20"/>
+            <w:sz w:val="18"/>
+            <w:szCs w:val="18"/>
           </w:rPr>
           <w:tab/>
         </w:r>
@@ -2056,8 +2030,8 @@
           <w:rPr>
             <w:noProof/>
             <w:webHidden/>
-            <w:sz w:val="20"/>
-            <w:szCs w:val="20"/>
+            <w:sz w:val="18"/>
+            <w:szCs w:val="18"/>
           </w:rPr>
           <w:fldChar w:fldCharType="begin"/>
         </w:r>
@@ -2065,8 +2039,8 @@
           <w:rPr>
             <w:noProof/>
             <w:webHidden/>
-            <w:sz w:val="20"/>
-            <w:szCs w:val="20"/>
+            <w:sz w:val="18"/>
+            <w:szCs w:val="18"/>
           </w:rPr>
           <w:instrText xml:space="preserve"> PAGEREF _Toc231472810 \h </w:instrText>
         </w:r>
@@ -2074,16 +2048,16 @@
           <w:rPr>
             <w:noProof/>
             <w:webHidden/>
-            <w:sz w:val="20"/>
-            <w:szCs w:val="20"/>
+            <w:sz w:val="18"/>
+            <w:szCs w:val="18"/>
           </w:rPr>
         </w:r>
         <w:r>
           <w:rPr>
             <w:noProof/>
             <w:webHidden/>
-            <w:sz w:val="20"/>
-            <w:szCs w:val="20"/>
+            <w:sz w:val="18"/>
+            <w:szCs w:val="18"/>
           </w:rPr>
           <w:fldChar w:fldCharType="separate"/>
         </w:r>
@@ -2091,8 +2065,8 @@
           <w:rPr>
             <w:noProof/>
             <w:webHidden/>
-            <w:sz w:val="20"/>
-            <w:szCs w:val="20"/>
+            <w:sz w:val="18"/>
+            <w:szCs w:val="18"/>
           </w:rPr>
           <w:t>9</w:t>
         </w:r>
@@ -2100,8 +2074,8 @@
           <w:rPr>
             <w:noProof/>
             <w:webHidden/>
-            <w:sz w:val="20"/>
-            <w:szCs w:val="20"/>
+            <w:sz w:val="18"/>
+            <w:szCs w:val="18"/>
           </w:rPr>
           <w:fldChar w:fldCharType="end"/>
         </w:r>
@@ -2115,8 +2089,8 @@
         </w:tabs>
         <w:rPr>
           <w:noProof/>
-          <w:sz w:val="20"/>
-          <w:szCs w:val="20"/>
+          <w:sz w:val="18"/>
+          <w:szCs w:val="18"/>
         </w:rPr>
       </w:pPr>
       <w:hyperlink w:anchor="_Toc231472811" w:history="1">
@@ -2124,8 +2098,8 @@
           <w:rPr>
             <w:rStyle w:val="Hyperlink"/>
             <w:noProof/>
-            <w:sz w:val="20"/>
-            <w:szCs w:val="20"/>
+            <w:sz w:val="18"/>
+            <w:szCs w:val="18"/>
           </w:rPr>
           <w:t>Tabla 3: Cinco mayores residuos positivos y negativos del modelo cuadrático</w:t>
         </w:r>
@@ -2133,8 +2107,8 @@
           <w:rPr>
             <w:noProof/>
             <w:webHidden/>
-            <w:sz w:val="20"/>
-            <w:szCs w:val="20"/>
+            <w:sz w:val="18"/>
+            <w:szCs w:val="18"/>
           </w:rPr>
           <w:tab/>
         </w:r>
@@ -2142,8 +2116,8 @@
           <w:rPr>
             <w:noProof/>
             <w:webHidden/>
-            <w:sz w:val="20"/>
-            <w:szCs w:val="20"/>
+            <w:sz w:val="18"/>
+            <w:szCs w:val="18"/>
           </w:rPr>
           <w:fldChar w:fldCharType="begin"/>
         </w:r>
@@ -2151,8 +2125,8 @@
           <w:rPr>
             <w:noProof/>
             <w:webHidden/>
-            <w:sz w:val="20"/>
-            <w:szCs w:val="20"/>
+            <w:sz w:val="18"/>
+            <w:szCs w:val="18"/>
           </w:rPr>
           <w:instrText xml:space="preserve"> PAGEREF _Toc231472811 \h </w:instrText>
         </w:r>
@@ -2160,16 +2134,16 @@
           <w:rPr>
             <w:noProof/>
             <w:webHidden/>
-            <w:sz w:val="20"/>
-            <w:szCs w:val="20"/>
+            <w:sz w:val="18"/>
+            <w:szCs w:val="18"/>
           </w:rPr>
         </w:r>
         <w:r>
           <w:rPr>
             <w:noProof/>
             <w:webHidden/>
-            <w:sz w:val="20"/>
-            <w:szCs w:val="20"/>
+            <w:sz w:val="18"/>
+            <w:szCs w:val="18"/>
           </w:rPr>
           <w:fldChar w:fldCharType="separate"/>
         </w:r>
@@ -2177,8 +2151,8 @@
           <w:rPr>
             <w:noProof/>
             <w:webHidden/>
-            <w:sz w:val="20"/>
-            <w:szCs w:val="20"/>
+            <w:sz w:val="18"/>
+            <w:szCs w:val="18"/>
           </w:rPr>
           <w:t>11</w:t>
         </w:r>
@@ -2186,8 +2160,8 @@
           <w:rPr>
             <w:noProof/>
             <w:webHidden/>
-            <w:sz w:val="20"/>
-            <w:szCs w:val="20"/>
+            <w:sz w:val="18"/>
+            <w:szCs w:val="18"/>
           </w:rPr>
           <w:fldChar w:fldCharType="end"/>
         </w:r>
@@ -2213,7 +2187,7 @@
     </w:p>
     <w:p>
       <w:pPr>
-        <w:spacing w:after="240" w:line="240" w:lineRule="auto"/>
+        <w:spacing w:line="240" w:lineRule="auto"/>
         <w:jc w:val="left"/>
         <w:rPr>
           <w:noProof/>
@@ -2260,25 +2234,27 @@
           <w:rFonts w:asciiTheme="minorHAnsi" w:eastAsiaTheme="minorEastAsia" w:hAnsiTheme="minorHAnsi" w:cstheme="minorBidi"/>
           <w:noProof/>
           <w:kern w:val="2"/>
+          <w:sz w:val="18"/>
+          <w:szCs w:val="18"/>
           <w14:ligatures w14:val="standardContextual"/>
         </w:rPr>
       </w:pPr>
-      <w:hyperlink w:anchor="_Toc231503934" w:history="1">
+      <w:hyperlink w:anchor="_Toc231904772" w:history="1">
         <w:r>
           <w:rPr>
             <w:rStyle w:val="Hyperlink"/>
             <w:noProof/>
-            <w:sz w:val="20"/>
-            <w:szCs w:val="20"/>
-          </w:rPr>
-          <w:t>Figura 1: Matriz de correlación entre el puntaje FIFA, el valor del plantel y los indicadores demográficos y económicos del país de origen.</w:t>
+            <w:sz w:val="18"/>
+            <w:szCs w:val="18"/>
+          </w:rPr>
+          <w:t>Figura 1: Histograma de distribución de puntos FIFA</w:t>
         </w:r>
         <w:r>
           <w:rPr>
             <w:noProof/>
             <w:webHidden/>
-            <w:sz w:val="20"/>
-            <w:szCs w:val="20"/>
+            <w:sz w:val="18"/>
+            <w:szCs w:val="18"/>
           </w:rPr>
           <w:tab/>
         </w:r>
@@ -2286,8 +2262,8 @@
           <w:rPr>
             <w:noProof/>
             <w:webHidden/>
-            <w:sz w:val="20"/>
-            <w:szCs w:val="20"/>
+            <w:sz w:val="18"/>
+            <w:szCs w:val="18"/>
           </w:rPr>
           <w:fldChar w:fldCharType="begin"/>
         </w:r>
@@ -2295,25 +2271,25 @@
           <w:rPr>
             <w:noProof/>
             <w:webHidden/>
-            <w:sz w:val="20"/>
-            <w:szCs w:val="20"/>
-          </w:rPr>
-          <w:instrText xml:space="preserve"> PAGEREF _Toc231503934 \h </w:instrText>
+            <w:sz w:val="18"/>
+            <w:szCs w:val="18"/>
+          </w:rPr>
+          <w:instrText xml:space="preserve"> PAGEREF _Toc231904772 \h </w:instrText>
         </w:r>
         <w:r>
           <w:rPr>
             <w:noProof/>
             <w:webHidden/>
-            <w:sz w:val="20"/>
-            <w:szCs w:val="20"/>
+            <w:sz w:val="18"/>
+            <w:szCs w:val="18"/>
           </w:rPr>
         </w:r>
         <w:r>
           <w:rPr>
             <w:noProof/>
             <w:webHidden/>
-            <w:sz w:val="20"/>
-            <w:szCs w:val="20"/>
+            <w:sz w:val="18"/>
+            <w:szCs w:val="18"/>
           </w:rPr>
           <w:fldChar w:fldCharType="separate"/>
         </w:r>
@@ -2321,8 +2297,8 @@
           <w:rPr>
             <w:noProof/>
             <w:webHidden/>
-            <w:sz w:val="20"/>
-            <w:szCs w:val="20"/>
+            <w:sz w:val="18"/>
+            <w:szCs w:val="18"/>
           </w:rPr>
           <w:t>7</w:t>
         </w:r>
@@ -2330,8 +2306,8 @@
           <w:rPr>
             <w:noProof/>
             <w:webHidden/>
-            <w:sz w:val="20"/>
-            <w:szCs w:val="20"/>
+            <w:sz w:val="18"/>
+            <w:szCs w:val="18"/>
           </w:rPr>
           <w:fldChar w:fldCharType="end"/>
         </w:r>
@@ -2347,25 +2323,27 @@
           <w:rFonts w:asciiTheme="minorHAnsi" w:eastAsiaTheme="minorEastAsia" w:hAnsiTheme="minorHAnsi" w:cstheme="minorBidi"/>
           <w:noProof/>
           <w:kern w:val="2"/>
+          <w:sz w:val="18"/>
+          <w:szCs w:val="18"/>
           <w14:ligatures w14:val="standardContextual"/>
         </w:rPr>
       </w:pPr>
-      <w:hyperlink w:anchor="_Toc231503935" w:history="1">
+      <w:hyperlink w:anchor="_Toc231904773" w:history="1">
         <w:r>
           <w:rPr>
             <w:rStyle w:val="Hyperlink"/>
             <w:noProof/>
-            <w:sz w:val="20"/>
-            <w:szCs w:val="20"/>
-          </w:rPr>
-          <w:t>Figura 2: Distribución del puntaje FIFA por continente de origen de la selección.</w:t>
+            <w:sz w:val="18"/>
+            <w:szCs w:val="18"/>
+          </w:rPr>
+          <w:t>Figura 2: Histogramas de distribución del valor del equipo, PBI y PBI per cápita.</w:t>
         </w:r>
         <w:r>
           <w:rPr>
             <w:noProof/>
             <w:webHidden/>
-            <w:sz w:val="20"/>
-            <w:szCs w:val="20"/>
+            <w:sz w:val="18"/>
+            <w:szCs w:val="18"/>
           </w:rPr>
           <w:tab/>
         </w:r>
@@ -2373,8 +2351,8 @@
           <w:rPr>
             <w:noProof/>
             <w:webHidden/>
-            <w:sz w:val="20"/>
-            <w:szCs w:val="20"/>
+            <w:sz w:val="18"/>
+            <w:szCs w:val="18"/>
           </w:rPr>
           <w:fldChar w:fldCharType="begin"/>
         </w:r>
@@ -2382,25 +2360,25 @@
           <w:rPr>
             <w:noProof/>
             <w:webHidden/>
-            <w:sz w:val="20"/>
-            <w:szCs w:val="20"/>
-          </w:rPr>
-          <w:instrText xml:space="preserve"> PAGEREF _Toc231503935 \h </w:instrText>
+            <w:sz w:val="18"/>
+            <w:szCs w:val="18"/>
+          </w:rPr>
+          <w:instrText xml:space="preserve"> PAGEREF _Toc231904773 \h </w:instrText>
         </w:r>
         <w:r>
           <w:rPr>
             <w:noProof/>
             <w:webHidden/>
-            <w:sz w:val="20"/>
-            <w:szCs w:val="20"/>
+            <w:sz w:val="18"/>
+            <w:szCs w:val="18"/>
           </w:rPr>
         </w:r>
         <w:r>
           <w:rPr>
             <w:noProof/>
             <w:webHidden/>
-            <w:sz w:val="20"/>
-            <w:szCs w:val="20"/>
+            <w:sz w:val="18"/>
+            <w:szCs w:val="18"/>
           </w:rPr>
           <w:fldChar w:fldCharType="separate"/>
         </w:r>
@@ -2408,17 +2386,17 @@
           <w:rPr>
             <w:noProof/>
             <w:webHidden/>
-            <w:sz w:val="20"/>
-            <w:szCs w:val="20"/>
-          </w:rPr>
-          <w:t>8</w:t>
+            <w:sz w:val="18"/>
+            <w:szCs w:val="18"/>
+          </w:rPr>
+          <w:t>7</w:t>
         </w:r>
         <w:r>
           <w:rPr>
             <w:noProof/>
             <w:webHidden/>
-            <w:sz w:val="20"/>
-            <w:szCs w:val="20"/>
+            <w:sz w:val="18"/>
+            <w:szCs w:val="18"/>
           </w:rPr>
           <w:fldChar w:fldCharType="end"/>
         </w:r>
@@ -2434,25 +2412,27 @@
           <w:rFonts w:asciiTheme="minorHAnsi" w:eastAsiaTheme="minorEastAsia" w:hAnsiTheme="minorHAnsi" w:cstheme="minorBidi"/>
           <w:noProof/>
           <w:kern w:val="2"/>
+          <w:sz w:val="18"/>
+          <w:szCs w:val="18"/>
           <w14:ligatures w14:val="standardContextual"/>
         </w:rPr>
       </w:pPr>
-      <w:hyperlink w:anchor="_Toc231503936" w:history="1">
+      <w:hyperlink w:anchor="_Toc231904774" w:history="1">
         <w:r>
           <w:rPr>
             <w:rStyle w:val="Hyperlink"/>
             <w:noProof/>
-            <w:sz w:val="20"/>
-            <w:szCs w:val="20"/>
-          </w:rPr>
-          <w:t>Figura 3: Distribución del puntaje FIFA por idioma mayoritario del país de origen de la selección (para idiomas que son hablados en 3 países o más).</w:t>
+            <w:sz w:val="18"/>
+            <w:szCs w:val="18"/>
+          </w:rPr>
+          <w:t>Figura 3: Histograma de distribución de población, densidad y superficie.</w:t>
         </w:r>
         <w:r>
           <w:rPr>
             <w:noProof/>
             <w:webHidden/>
-            <w:sz w:val="20"/>
-            <w:szCs w:val="20"/>
+            <w:sz w:val="18"/>
+            <w:szCs w:val="18"/>
           </w:rPr>
           <w:tab/>
         </w:r>
@@ -2460,8 +2440,8 @@
           <w:rPr>
             <w:noProof/>
             <w:webHidden/>
-            <w:sz w:val="20"/>
-            <w:szCs w:val="20"/>
+            <w:sz w:val="18"/>
+            <w:szCs w:val="18"/>
           </w:rPr>
           <w:fldChar w:fldCharType="begin"/>
         </w:r>
@@ -2469,25 +2449,25 @@
           <w:rPr>
             <w:noProof/>
             <w:webHidden/>
-            <w:sz w:val="20"/>
-            <w:szCs w:val="20"/>
-          </w:rPr>
-          <w:instrText xml:space="preserve"> PAGEREF _Toc231503936 \h </w:instrText>
+            <w:sz w:val="18"/>
+            <w:szCs w:val="18"/>
+          </w:rPr>
+          <w:instrText xml:space="preserve"> PAGEREF _Toc231904774 \h </w:instrText>
         </w:r>
         <w:r>
           <w:rPr>
             <w:noProof/>
             <w:webHidden/>
-            <w:sz w:val="20"/>
-            <w:szCs w:val="20"/>
+            <w:sz w:val="18"/>
+            <w:szCs w:val="18"/>
           </w:rPr>
         </w:r>
         <w:r>
           <w:rPr>
             <w:noProof/>
             <w:webHidden/>
-            <w:sz w:val="20"/>
-            <w:szCs w:val="20"/>
+            <w:sz w:val="18"/>
+            <w:szCs w:val="18"/>
           </w:rPr>
           <w:fldChar w:fldCharType="separate"/>
         </w:r>
@@ -2495,8 +2475,8 @@
           <w:rPr>
             <w:noProof/>
             <w:webHidden/>
-            <w:sz w:val="20"/>
-            <w:szCs w:val="20"/>
+            <w:sz w:val="18"/>
+            <w:szCs w:val="18"/>
           </w:rPr>
           <w:t>8</w:t>
         </w:r>
@@ -2504,8 +2484,8 @@
           <w:rPr>
             <w:noProof/>
             <w:webHidden/>
-            <w:sz w:val="20"/>
-            <w:szCs w:val="20"/>
+            <w:sz w:val="18"/>
+            <w:szCs w:val="18"/>
           </w:rPr>
           <w:fldChar w:fldCharType="end"/>
         </w:r>
@@ -2521,25 +2501,27 @@
           <w:rFonts w:asciiTheme="minorHAnsi" w:eastAsiaTheme="minorEastAsia" w:hAnsiTheme="minorHAnsi" w:cstheme="minorBidi"/>
           <w:noProof/>
           <w:kern w:val="2"/>
+          <w:sz w:val="18"/>
+          <w:szCs w:val="18"/>
           <w14:ligatures w14:val="standardContextual"/>
         </w:rPr>
       </w:pPr>
-      <w:hyperlink w:anchor="_Toc231503937" w:history="1">
+      <w:hyperlink w:anchor="_Toc231904775" w:history="1">
         <w:r>
           <w:rPr>
             <w:rStyle w:val="Hyperlink"/>
             <w:noProof/>
-            <w:sz w:val="20"/>
-            <w:szCs w:val="20"/>
-          </w:rPr>
-          <w:t>Figura 4: Distribución del puntaje FIFA por religión principal del país de origen de la selección y distribución de religiones entre los países participantes del torneo.</w:t>
+            <w:sz w:val="18"/>
+            <w:szCs w:val="18"/>
+          </w:rPr>
+          <w:t>Figura 4: Matriz de correlación entre el puntaje FIFA, el valor del plantel y los indicadores demográficos y económicos del país de origen.</w:t>
         </w:r>
         <w:r>
           <w:rPr>
             <w:noProof/>
             <w:webHidden/>
-            <w:sz w:val="20"/>
-            <w:szCs w:val="20"/>
+            <w:sz w:val="18"/>
+            <w:szCs w:val="18"/>
           </w:rPr>
           <w:tab/>
         </w:r>
@@ -2547,8 +2529,8 @@
           <w:rPr>
             <w:noProof/>
             <w:webHidden/>
-            <w:sz w:val="20"/>
-            <w:szCs w:val="20"/>
+            <w:sz w:val="18"/>
+            <w:szCs w:val="18"/>
           </w:rPr>
           <w:fldChar w:fldCharType="begin"/>
         </w:r>
@@ -2556,25 +2538,25 @@
           <w:rPr>
             <w:noProof/>
             <w:webHidden/>
-            <w:sz w:val="20"/>
-            <w:szCs w:val="20"/>
-          </w:rPr>
-          <w:instrText xml:space="preserve"> PAGEREF _Toc231503937 \h </w:instrText>
+            <w:sz w:val="18"/>
+            <w:szCs w:val="18"/>
+          </w:rPr>
+          <w:instrText xml:space="preserve"> PAGEREF _Toc231904775 \h </w:instrText>
         </w:r>
         <w:r>
           <w:rPr>
             <w:noProof/>
             <w:webHidden/>
-            <w:sz w:val="20"/>
-            <w:szCs w:val="20"/>
+            <w:sz w:val="18"/>
+            <w:szCs w:val="18"/>
           </w:rPr>
         </w:r>
         <w:r>
           <w:rPr>
             <w:noProof/>
             <w:webHidden/>
-            <w:sz w:val="20"/>
-            <w:szCs w:val="20"/>
+            <w:sz w:val="18"/>
+            <w:szCs w:val="18"/>
           </w:rPr>
           <w:fldChar w:fldCharType="separate"/>
         </w:r>
@@ -2582,17 +2564,17 @@
           <w:rPr>
             <w:noProof/>
             <w:webHidden/>
-            <w:sz w:val="20"/>
-            <w:szCs w:val="20"/>
-          </w:rPr>
-          <w:t>9</w:t>
+            <w:sz w:val="18"/>
+            <w:szCs w:val="18"/>
+          </w:rPr>
+          <w:t>8</w:t>
         </w:r>
         <w:r>
           <w:rPr>
             <w:noProof/>
             <w:webHidden/>
-            <w:sz w:val="20"/>
-            <w:szCs w:val="20"/>
+            <w:sz w:val="18"/>
+            <w:szCs w:val="18"/>
           </w:rPr>
           <w:fldChar w:fldCharType="end"/>
         </w:r>
@@ -2608,25 +2590,27 @@
           <w:rFonts w:asciiTheme="minorHAnsi" w:eastAsiaTheme="minorEastAsia" w:hAnsiTheme="minorHAnsi" w:cstheme="minorBidi"/>
           <w:noProof/>
           <w:kern w:val="2"/>
+          <w:sz w:val="18"/>
+          <w:szCs w:val="18"/>
           <w14:ligatures w14:val="standardContextual"/>
         </w:rPr>
       </w:pPr>
-      <w:hyperlink w:anchor="_Toc231503938" w:history="1">
+      <w:hyperlink w:anchor="_Toc231904776" w:history="1">
         <w:r>
           <w:rPr>
             <w:rStyle w:val="Hyperlink"/>
             <w:noProof/>
-            <w:sz w:val="20"/>
-            <w:szCs w:val="20"/>
-          </w:rPr>
-          <w:t>Figura 6: Relación entre el valor del plantel (miles de millones de euros) y el puntaje FIFA, según continente.</w:t>
+            <w:sz w:val="18"/>
+            <w:szCs w:val="18"/>
+          </w:rPr>
+          <w:t>Figura 5: Distribución del puntaje FIFA por continente de origen de la selección.</w:t>
         </w:r>
         <w:r>
           <w:rPr>
             <w:noProof/>
             <w:webHidden/>
-            <w:sz w:val="20"/>
-            <w:szCs w:val="20"/>
+            <w:sz w:val="18"/>
+            <w:szCs w:val="18"/>
           </w:rPr>
           <w:tab/>
         </w:r>
@@ -2634,8 +2618,8 @@
           <w:rPr>
             <w:noProof/>
             <w:webHidden/>
-            <w:sz w:val="20"/>
-            <w:szCs w:val="20"/>
+            <w:sz w:val="18"/>
+            <w:szCs w:val="18"/>
           </w:rPr>
           <w:fldChar w:fldCharType="begin"/>
         </w:r>
@@ -2643,25 +2627,25 @@
           <w:rPr>
             <w:noProof/>
             <w:webHidden/>
-            <w:sz w:val="20"/>
-            <w:szCs w:val="20"/>
-          </w:rPr>
-          <w:instrText xml:space="preserve"> PAGEREF _Toc231503938 \h </w:instrText>
+            <w:sz w:val="18"/>
+            <w:szCs w:val="18"/>
+          </w:rPr>
+          <w:instrText xml:space="preserve"> PAGEREF _Toc231904776 \h </w:instrText>
         </w:r>
         <w:r>
           <w:rPr>
             <w:noProof/>
             <w:webHidden/>
-            <w:sz w:val="20"/>
-            <w:szCs w:val="20"/>
+            <w:sz w:val="18"/>
+            <w:szCs w:val="18"/>
           </w:rPr>
         </w:r>
         <w:r>
           <w:rPr>
             <w:noProof/>
             <w:webHidden/>
-            <w:sz w:val="20"/>
-            <w:szCs w:val="20"/>
+            <w:sz w:val="18"/>
+            <w:szCs w:val="18"/>
           </w:rPr>
           <w:fldChar w:fldCharType="separate"/>
         </w:r>
@@ -2669,17 +2653,17 @@
           <w:rPr>
             <w:noProof/>
             <w:webHidden/>
-            <w:sz w:val="20"/>
-            <w:szCs w:val="20"/>
-          </w:rPr>
-          <w:t>10</w:t>
+            <w:sz w:val="18"/>
+            <w:szCs w:val="18"/>
+          </w:rPr>
+          <w:t>9</w:t>
         </w:r>
         <w:r>
           <w:rPr>
             <w:noProof/>
             <w:webHidden/>
-            <w:sz w:val="20"/>
-            <w:szCs w:val="20"/>
+            <w:sz w:val="18"/>
+            <w:szCs w:val="18"/>
           </w:rPr>
           <w:fldChar w:fldCharType="end"/>
         </w:r>
@@ -2695,25 +2679,27 @@
           <w:rFonts w:asciiTheme="minorHAnsi" w:eastAsiaTheme="minorEastAsia" w:hAnsiTheme="minorHAnsi" w:cstheme="minorBidi"/>
           <w:noProof/>
           <w:kern w:val="2"/>
+          <w:sz w:val="18"/>
+          <w:szCs w:val="18"/>
           <w14:ligatures w14:val="standardContextual"/>
         </w:rPr>
       </w:pPr>
-      <w:hyperlink w:anchor="_Toc231503939" w:history="1">
+      <w:hyperlink w:anchor="_Toc231904777" w:history="1">
         <w:r>
           <w:rPr>
             <w:rStyle w:val="Hyperlink"/>
             <w:noProof/>
-            <w:sz w:val="20"/>
-            <w:szCs w:val="20"/>
-          </w:rPr>
-          <w:t>Figura 7: Ajuste de modelos</w:t>
+            <w:sz w:val="18"/>
+            <w:szCs w:val="18"/>
+          </w:rPr>
+          <w:t>Figura 6: Distribución del puntaje FIFA por idioma mayoritario del país de origen de la selección (para idiomas que son hablados en 3 países o más).</w:t>
         </w:r>
         <w:r>
           <w:rPr>
             <w:noProof/>
             <w:webHidden/>
-            <w:sz w:val="20"/>
-            <w:szCs w:val="20"/>
+            <w:sz w:val="18"/>
+            <w:szCs w:val="18"/>
           </w:rPr>
           <w:tab/>
         </w:r>
@@ -2721,8 +2707,8 @@
           <w:rPr>
             <w:noProof/>
             <w:webHidden/>
-            <w:sz w:val="20"/>
-            <w:szCs w:val="20"/>
+            <w:sz w:val="18"/>
+            <w:szCs w:val="18"/>
           </w:rPr>
           <w:fldChar w:fldCharType="begin"/>
         </w:r>
@@ -2730,25 +2716,25 @@
           <w:rPr>
             <w:noProof/>
             <w:webHidden/>
-            <w:sz w:val="20"/>
-            <w:szCs w:val="20"/>
-          </w:rPr>
-          <w:instrText xml:space="preserve"> PAGEREF _Toc231503939 \h </w:instrText>
+            <w:sz w:val="18"/>
+            <w:szCs w:val="18"/>
+          </w:rPr>
+          <w:instrText xml:space="preserve"> PAGEREF _Toc231904777 \h </w:instrText>
         </w:r>
         <w:r>
           <w:rPr>
             <w:noProof/>
             <w:webHidden/>
-            <w:sz w:val="20"/>
-            <w:szCs w:val="20"/>
+            <w:sz w:val="18"/>
+            <w:szCs w:val="18"/>
           </w:rPr>
         </w:r>
         <w:r>
           <w:rPr>
             <w:noProof/>
             <w:webHidden/>
-            <w:sz w:val="20"/>
-            <w:szCs w:val="20"/>
+            <w:sz w:val="18"/>
+            <w:szCs w:val="18"/>
           </w:rPr>
           <w:fldChar w:fldCharType="separate"/>
         </w:r>
@@ -2756,17 +2742,17 @@
           <w:rPr>
             <w:noProof/>
             <w:webHidden/>
-            <w:sz w:val="20"/>
-            <w:szCs w:val="20"/>
-          </w:rPr>
-          <w:t>11</w:t>
+            <w:sz w:val="18"/>
+            <w:szCs w:val="18"/>
+          </w:rPr>
+          <w:t>10</w:t>
         </w:r>
         <w:r>
           <w:rPr>
             <w:noProof/>
             <w:webHidden/>
-            <w:sz w:val="20"/>
-            <w:szCs w:val="20"/>
+            <w:sz w:val="18"/>
+            <w:szCs w:val="18"/>
           </w:rPr>
           <w:fldChar w:fldCharType="end"/>
         </w:r>
@@ -2782,25 +2768,27 @@
           <w:rFonts w:asciiTheme="minorHAnsi" w:eastAsiaTheme="minorEastAsia" w:hAnsiTheme="minorHAnsi" w:cstheme="minorBidi"/>
           <w:noProof/>
           <w:kern w:val="2"/>
+          <w:sz w:val="18"/>
+          <w:szCs w:val="18"/>
           <w14:ligatures w14:val="standardContextual"/>
         </w:rPr>
       </w:pPr>
-      <w:hyperlink w:anchor="_Toc231503940" w:history="1">
+      <w:hyperlink w:anchor="_Toc231904778" w:history="1">
         <w:r>
           <w:rPr>
             <w:rStyle w:val="Hyperlink"/>
             <w:noProof/>
-            <w:sz w:val="20"/>
-            <w:szCs w:val="20"/>
-          </w:rPr>
-          <w:t>Figura 8: Modelo cuadrático: función y primera y segunda derivada.</w:t>
+            <w:sz w:val="18"/>
+            <w:szCs w:val="18"/>
+          </w:rPr>
+          <w:t>Figura 7: Distribución del puntaje FIFA por religión principal del país de origen de la selección y distribución de religiones entre los países participantes del torneo.</w:t>
         </w:r>
         <w:r>
           <w:rPr>
             <w:noProof/>
             <w:webHidden/>
-            <w:sz w:val="20"/>
-            <w:szCs w:val="20"/>
+            <w:sz w:val="18"/>
+            <w:szCs w:val="18"/>
           </w:rPr>
           <w:tab/>
         </w:r>
@@ -2808,8 +2796,8 @@
           <w:rPr>
             <w:noProof/>
             <w:webHidden/>
-            <w:sz w:val="20"/>
-            <w:szCs w:val="20"/>
+            <w:sz w:val="18"/>
+            <w:szCs w:val="18"/>
           </w:rPr>
           <w:fldChar w:fldCharType="begin"/>
         </w:r>
@@ -2817,25 +2805,25 @@
           <w:rPr>
             <w:noProof/>
             <w:webHidden/>
-            <w:sz w:val="20"/>
-            <w:szCs w:val="20"/>
-          </w:rPr>
-          <w:instrText xml:space="preserve"> PAGEREF _Toc231503940 \h </w:instrText>
+            <w:sz w:val="18"/>
+            <w:szCs w:val="18"/>
+          </w:rPr>
+          <w:instrText xml:space="preserve"> PAGEREF _Toc231904778 \h </w:instrText>
         </w:r>
         <w:r>
           <w:rPr>
             <w:noProof/>
             <w:webHidden/>
-            <w:sz w:val="20"/>
-            <w:szCs w:val="20"/>
+            <w:sz w:val="18"/>
+            <w:szCs w:val="18"/>
           </w:rPr>
         </w:r>
         <w:r>
           <w:rPr>
             <w:noProof/>
             <w:webHidden/>
-            <w:sz w:val="20"/>
-            <w:szCs w:val="20"/>
+            <w:sz w:val="18"/>
+            <w:szCs w:val="18"/>
           </w:rPr>
           <w:fldChar w:fldCharType="separate"/>
         </w:r>
@@ -2843,17 +2831,17 @@
           <w:rPr>
             <w:noProof/>
             <w:webHidden/>
-            <w:sz w:val="20"/>
-            <w:szCs w:val="20"/>
-          </w:rPr>
-          <w:t>11</w:t>
+            <w:sz w:val="18"/>
+            <w:szCs w:val="18"/>
+          </w:rPr>
+          <w:t>10</w:t>
         </w:r>
         <w:r>
           <w:rPr>
             <w:noProof/>
             <w:webHidden/>
-            <w:sz w:val="20"/>
-            <w:szCs w:val="20"/>
+            <w:sz w:val="18"/>
+            <w:szCs w:val="18"/>
           </w:rPr>
           <w:fldChar w:fldCharType="end"/>
         </w:r>
@@ -2869,25 +2857,27 @@
           <w:rFonts w:asciiTheme="minorHAnsi" w:eastAsiaTheme="minorEastAsia" w:hAnsiTheme="minorHAnsi" w:cstheme="minorBidi"/>
           <w:noProof/>
           <w:kern w:val="2"/>
+          <w:sz w:val="18"/>
+          <w:szCs w:val="18"/>
           <w14:ligatures w14:val="standardContextual"/>
         </w:rPr>
       </w:pPr>
-      <w:hyperlink w:anchor="_Toc231503941" w:history="1">
+      <w:hyperlink w:anchor="_Toc231904779" w:history="1">
         <w:r>
           <w:rPr>
             <w:rStyle w:val="Hyperlink"/>
             <w:noProof/>
-            <w:sz w:val="20"/>
-            <w:szCs w:val="20"/>
-          </w:rPr>
-          <w:t>Figura 9: Modelo cuadrático, con máximo y residuos de los casos más destacados.</w:t>
+            <w:sz w:val="18"/>
+            <w:szCs w:val="18"/>
+          </w:rPr>
+          <w:t>Figura 8: Relación entre el valor del plantel (miles de millones de euros) y el puntaje FIFA, según continente.</w:t>
         </w:r>
         <w:r>
           <w:rPr>
             <w:noProof/>
             <w:webHidden/>
-            <w:sz w:val="20"/>
-            <w:szCs w:val="20"/>
+            <w:sz w:val="18"/>
+            <w:szCs w:val="18"/>
           </w:rPr>
           <w:tab/>
         </w:r>
@@ -2895,8 +2885,8 @@
           <w:rPr>
             <w:noProof/>
             <w:webHidden/>
-            <w:sz w:val="20"/>
-            <w:szCs w:val="20"/>
+            <w:sz w:val="18"/>
+            <w:szCs w:val="18"/>
           </w:rPr>
           <w:fldChar w:fldCharType="begin"/>
         </w:r>
@@ -2904,25 +2894,25 @@
           <w:rPr>
             <w:noProof/>
             <w:webHidden/>
-            <w:sz w:val="20"/>
-            <w:szCs w:val="20"/>
-          </w:rPr>
-          <w:instrText xml:space="preserve"> PAGEREF _Toc231503941 \h </w:instrText>
+            <w:sz w:val="18"/>
+            <w:szCs w:val="18"/>
+          </w:rPr>
+          <w:instrText xml:space="preserve"> PAGEREF _Toc231904779 \h </w:instrText>
         </w:r>
         <w:r>
           <w:rPr>
             <w:noProof/>
             <w:webHidden/>
-            <w:sz w:val="20"/>
-            <w:szCs w:val="20"/>
+            <w:sz w:val="18"/>
+            <w:szCs w:val="18"/>
           </w:rPr>
         </w:r>
         <w:r>
           <w:rPr>
             <w:noProof/>
             <w:webHidden/>
-            <w:sz w:val="20"/>
-            <w:szCs w:val="20"/>
+            <w:sz w:val="18"/>
+            <w:szCs w:val="18"/>
           </w:rPr>
           <w:fldChar w:fldCharType="separate"/>
         </w:r>
@@ -2930,17 +2920,284 @@
           <w:rPr>
             <w:noProof/>
             <w:webHidden/>
-            <w:sz w:val="20"/>
-            <w:szCs w:val="20"/>
-          </w:rPr>
-          <w:t>13</w:t>
+            <w:sz w:val="18"/>
+            <w:szCs w:val="18"/>
+          </w:rPr>
+          <w:t>11</w:t>
         </w:r>
         <w:r>
           <w:rPr>
             <w:noProof/>
             <w:webHidden/>
-            <w:sz w:val="20"/>
-            <w:szCs w:val="20"/>
+            <w:sz w:val="18"/>
+            <w:szCs w:val="18"/>
+          </w:rPr>
+          <w:fldChar w:fldCharType="end"/>
+        </w:r>
+      </w:hyperlink>
+    </w:p>
+    <w:p>
+      <w:pPr>
+        <w:pStyle w:val="TableofFigures"/>
+        <w:tabs>
+          <w:tab w:val="right" w:leader="dot" w:pos="9350"/>
+        </w:tabs>
+        <w:rPr>
+          <w:rFonts w:asciiTheme="minorHAnsi" w:eastAsiaTheme="minorEastAsia" w:hAnsiTheme="minorHAnsi" w:cstheme="minorBidi"/>
+          <w:noProof/>
+          <w:kern w:val="2"/>
+          <w:sz w:val="18"/>
+          <w:szCs w:val="18"/>
+          <w14:ligatures w14:val="standardContextual"/>
+        </w:rPr>
+      </w:pPr>
+      <w:hyperlink w:anchor="_Toc231904780" w:history="1">
+        <w:r>
+          <w:rPr>
+            <w:rStyle w:val="Hyperlink"/>
+            <w:noProof/>
+            <w:sz w:val="18"/>
+            <w:szCs w:val="18"/>
+          </w:rPr>
+          <w:t>Figura 9: Ajuste de modelos</w:t>
+        </w:r>
+        <w:r>
+          <w:rPr>
+            <w:noProof/>
+            <w:webHidden/>
+            <w:sz w:val="18"/>
+            <w:szCs w:val="18"/>
+          </w:rPr>
+          <w:tab/>
+        </w:r>
+        <w:r>
+          <w:rPr>
+            <w:noProof/>
+            <w:webHidden/>
+            <w:sz w:val="18"/>
+            <w:szCs w:val="18"/>
+          </w:rPr>
+          <w:fldChar w:fldCharType="begin"/>
+        </w:r>
+        <w:r>
+          <w:rPr>
+            <w:noProof/>
+            <w:webHidden/>
+            <w:sz w:val="18"/>
+            <w:szCs w:val="18"/>
+          </w:rPr>
+          <w:instrText xml:space="preserve"> PAGEREF _Toc231904780 \h </w:instrText>
+        </w:r>
+        <w:r>
+          <w:rPr>
+            <w:noProof/>
+            <w:webHidden/>
+            <w:sz w:val="18"/>
+            <w:szCs w:val="18"/>
+          </w:rPr>
+        </w:r>
+        <w:r>
+          <w:rPr>
+            <w:noProof/>
+            <w:webHidden/>
+            <w:sz w:val="18"/>
+            <w:szCs w:val="18"/>
+          </w:rPr>
+          <w:fldChar w:fldCharType="separate"/>
+        </w:r>
+        <w:r>
+          <w:rPr>
+            <w:noProof/>
+            <w:webHidden/>
+            <w:sz w:val="18"/>
+            <w:szCs w:val="18"/>
+          </w:rPr>
+          <w:t>12</w:t>
+        </w:r>
+        <w:r>
+          <w:rPr>
+            <w:noProof/>
+            <w:webHidden/>
+            <w:sz w:val="18"/>
+            <w:szCs w:val="18"/>
+          </w:rPr>
+          <w:fldChar w:fldCharType="end"/>
+        </w:r>
+      </w:hyperlink>
+    </w:p>
+    <w:p>
+      <w:pPr>
+        <w:pStyle w:val="TableofFigures"/>
+        <w:tabs>
+          <w:tab w:val="right" w:leader="dot" w:pos="9350"/>
+        </w:tabs>
+        <w:rPr>
+          <w:rFonts w:asciiTheme="minorHAnsi" w:eastAsiaTheme="minorEastAsia" w:hAnsiTheme="minorHAnsi" w:cstheme="minorBidi"/>
+          <w:noProof/>
+          <w:kern w:val="2"/>
+          <w:sz w:val="18"/>
+          <w:szCs w:val="18"/>
+          <w14:ligatures w14:val="standardContextual"/>
+        </w:rPr>
+      </w:pPr>
+      <w:hyperlink w:anchor="_Toc231904781" w:history="1">
+        <w:r>
+          <w:rPr>
+            <w:rStyle w:val="Hyperlink"/>
+            <w:noProof/>
+            <w:sz w:val="18"/>
+            <w:szCs w:val="18"/>
+          </w:rPr>
+          <w:t>Figura 10: Modelo cuadrático: función y primera y segunda derivada.</w:t>
+        </w:r>
+        <w:r>
+          <w:rPr>
+            <w:noProof/>
+            <w:webHidden/>
+            <w:sz w:val="18"/>
+            <w:szCs w:val="18"/>
+          </w:rPr>
+          <w:tab/>
+        </w:r>
+        <w:r>
+          <w:rPr>
+            <w:noProof/>
+            <w:webHidden/>
+            <w:sz w:val="18"/>
+            <w:szCs w:val="18"/>
+          </w:rPr>
+          <w:fldChar w:fldCharType="begin"/>
+        </w:r>
+        <w:r>
+          <w:rPr>
+            <w:noProof/>
+            <w:webHidden/>
+            <w:sz w:val="18"/>
+            <w:szCs w:val="18"/>
+          </w:rPr>
+          <w:instrText xml:space="preserve"> PAGEREF _Toc231904781 \h </w:instrText>
+        </w:r>
+        <w:r>
+          <w:rPr>
+            <w:noProof/>
+            <w:webHidden/>
+            <w:sz w:val="18"/>
+            <w:szCs w:val="18"/>
+          </w:rPr>
+        </w:r>
+        <w:r>
+          <w:rPr>
+            <w:noProof/>
+            <w:webHidden/>
+            <w:sz w:val="18"/>
+            <w:szCs w:val="18"/>
+          </w:rPr>
+          <w:fldChar w:fldCharType="separate"/>
+        </w:r>
+        <w:r>
+          <w:rPr>
+            <w:noProof/>
+            <w:webHidden/>
+            <w:sz w:val="18"/>
+            <w:szCs w:val="18"/>
+          </w:rPr>
+          <w:t>12</w:t>
+        </w:r>
+        <w:r>
+          <w:rPr>
+            <w:noProof/>
+            <w:webHidden/>
+            <w:sz w:val="18"/>
+            <w:szCs w:val="18"/>
+          </w:rPr>
+          <w:fldChar w:fldCharType="end"/>
+        </w:r>
+      </w:hyperlink>
+    </w:p>
+    <w:p>
+      <w:pPr>
+        <w:pStyle w:val="TableofFigures"/>
+        <w:tabs>
+          <w:tab w:val="right" w:leader="dot" w:pos="9350"/>
+        </w:tabs>
+        <w:rPr>
+          <w:rFonts w:asciiTheme="minorHAnsi" w:eastAsiaTheme="minorEastAsia" w:hAnsiTheme="minorHAnsi" w:cstheme="minorBidi"/>
+          <w:noProof/>
+          <w:kern w:val="2"/>
+          <w:sz w:val="18"/>
+          <w:szCs w:val="18"/>
+          <w14:ligatures w14:val="standardContextual"/>
+        </w:rPr>
+      </w:pPr>
+      <w:hyperlink w:anchor="_Toc231904782" w:history="1">
+        <w:r>
+          <w:rPr>
+            <w:rStyle w:val="Hyperlink"/>
+            <w:noProof/>
+            <w:sz w:val="18"/>
+            <w:szCs w:val="18"/>
+          </w:rPr>
+          <w:t>Figura 11: Modelo cuadrático, con máximo y residuos de los casos más destacados.</w:t>
+        </w:r>
+        <w:r>
+          <w:rPr>
+            <w:noProof/>
+            <w:webHidden/>
+            <w:sz w:val="18"/>
+            <w:szCs w:val="18"/>
+          </w:rPr>
+          <w:tab/>
+        </w:r>
+        <w:r>
+          <w:rPr>
+            <w:noProof/>
+            <w:webHidden/>
+            <w:sz w:val="18"/>
+            <w:szCs w:val="18"/>
+          </w:rPr>
+          <w:fldChar w:fldCharType="begin"/>
+        </w:r>
+        <w:r>
+          <w:rPr>
+            <w:noProof/>
+            <w:webHidden/>
+            <w:sz w:val="18"/>
+            <w:szCs w:val="18"/>
+          </w:rPr>
+          <w:instrText xml:space="preserve"> PAGEREF _Toc231904782 \h </w:instrText>
+        </w:r>
+        <w:r>
+          <w:rPr>
+            <w:noProof/>
+            <w:webHidden/>
+            <w:sz w:val="18"/>
+            <w:szCs w:val="18"/>
+          </w:rPr>
+        </w:r>
+        <w:r>
+          <w:rPr>
+            <w:noProof/>
+            <w:webHidden/>
+            <w:sz w:val="18"/>
+            <w:szCs w:val="18"/>
+          </w:rPr>
+          <w:fldChar w:fldCharType="separate"/>
+        </w:r>
+        <w:r>
+          <w:rPr>
+            <w:noProof/>
+            <w:webHidden/>
+            <w:sz w:val="18"/>
+            <w:szCs w:val="18"/>
+          </w:rPr>
+          <w:t>14</w:t>
+        </w:r>
+        <w:r>
+          <w:rPr>
+            <w:noProof/>
+            <w:webHidden/>
+            <w:sz w:val="18"/>
+            <w:szCs w:val="18"/>
           </w:rPr>
           <w:fldChar w:fldCharType="end"/>
         </w:r>
@@ -3031,7 +3288,13 @@
         <w:t xml:space="preserve"> </w:t>
       </w:r>
       <w:r>
-        <w:t xml:space="preserve">— no presentan asociación relevante con el puntaje FIFA, mientras que el valor de mercado del plantel exhibe una correlación fuerte (r = 0,77). </w:t>
+        <w:t>— no presentan asociación relevante con el puntaje FIFA, mientras que el valor de mercado del plantel exhibe una correlación fuerte (r = 0,7</w:t>
+      </w:r>
+      <w:r>
+        <w:t>6</w:t>
+      </w:r>
+      <w:r>
+        <w:t xml:space="preserve">). </w:t>
       </w:r>
       <w:r>
         <w:t xml:space="preserve"> </w:t>
@@ -3146,7 +3409,13 @@
         <w:t xml:space="preserve">(medido como el puntaje FIFA previo al torneo) </w:t>
       </w:r>
       <w:r>
-        <w:t xml:space="preserve">puede explicarse a partir del nivel de desarrollo económico y demográfico de su país? Y si no es así, ¿qué variables </w:t>
+        <w:t xml:space="preserve">puede explicarse a partir </w:t>
+      </w:r>
+      <w:r>
+        <w:t xml:space="preserve">variables económicas y demográficas </w:t>
+      </w:r>
+      <w:r>
+        <w:t xml:space="preserve">de su país? Y si no es así, ¿qué variables </w:t>
       </w:r>
       <w:r>
         <w:t>(</w:t>
@@ -4142,51 +4411,42 @@
     </w:p>
     <w:p>
       <w:r>
-        <w:t xml:space="preserve">El primer paso fue generar un mapa de calor para buscar correlación entre las variables numéricas (ver </w:t>
-      </w:r>
-      <w:r>
-        <w:fldChar w:fldCharType="begin"/>
-      </w:r>
-      <w:r>
-        <w:instrText xml:space="preserve"> REF _Ref231390466 \h </w:instrText>
-      </w:r>
-      <w:r>
-        <w:fldChar w:fldCharType="separate"/>
-      </w:r>
-      <w:r>
-        <w:t xml:space="preserve">Figura </w:t>
+        <w:t xml:space="preserve">El primer paso fue </w:t>
+      </w:r>
+      <w:r>
+        <w:t xml:space="preserve">revisar la distribución de las variables numéricas usando la función </w:t>
       </w:r>
       <w:r>
         <w:rPr>
-          <w:noProof/>
+          <w:i/>
+          <w:iCs/>
         </w:rPr>
-        <w:t>1</w:t>
-      </w:r>
-      <w:r>
-        <w:fldChar w:fldCharType="end"/>
-      </w:r>
-      <w:r>
-        <w:t>). La matriz de correlación ofrece el primer hallazgo central: el puntaje FIFA se asocia fuertemente con el valor de mercado del plantel (r = 0,77), pero no se vincula con la edad media del plantel ni tampoco con los indicadores económicos y demográficos del país. En otras palabras, la prosperidad general de una nación no anticipa el desempeño de su selección, pero sí lo hace el capital deportivo concentrado en el plantel.</w:t>
+        <w:t>describe</w:t>
+      </w:r>
+      <w:r>
+        <w:t xml:space="preserve"> de pandas.</w:t>
+      </w:r>
+      <w:r>
+        <w:t xml:space="preserve"> La variable central de análisis es el puntaje FIFA, así que fue graficada en un histograma para conocer su distribución.</w:t>
+      </w:r>
+      <w:r>
+        <w:t xml:space="preserve"> </w:t>
       </w:r>
     </w:p>
     <w:p>
       <w:pPr>
         <w:keepNext/>
-        <w:spacing w:before="80" w:after="30"/>
         <w:jc w:val="center"/>
-        <w:rPr>
-          <w:u w:val="single"/>
-        </w:rPr>
       </w:pPr>
       <w:r>
         <w:rPr>
           <w:noProof/>
         </w:rPr>
         <w:drawing>
-          <wp:inline distT="0" distB="0" distL="0" distR="0" wp14:anchorId="22C21601" wp14:editId="0EC4989D">
-            <wp:extent cx="5817996" cy="3329875"/>
-            <wp:effectExtent l="0" t="0" r="0" b="4445"/>
-            <wp:docPr id="1" name="Picture 1"/>
+          <wp:inline distT="0" distB="0" distL="0" distR="0" wp14:anchorId="7BFF8138" wp14:editId="4CCFBACF">
+            <wp:extent cx="4114800" cy="2468880"/>
+            <wp:effectExtent l="0" t="0" r="0" b="7620"/>
+            <wp:docPr id="1395919992" name="Picture 2"/>
             <wp:cNvGraphicFramePr>
               <a:graphicFrameLocks xmlns:a="http://schemas.openxmlformats.org/drawingml/2006/main" noChangeAspect="1"/>
             </wp:cNvGraphicFramePr>
@@ -4194,22 +4454,25 @@
               <a:graphicData uri="http://schemas.openxmlformats.org/drawingml/2006/picture">
                 <pic:pic xmlns:pic="http://schemas.openxmlformats.org/drawingml/2006/picture">
                   <pic:nvPicPr>
-                    <pic:cNvPr id="0" name=""/>
-                    <pic:cNvPicPr>
-                      <a:picLocks noChangeAspect="1" noChangeArrowheads="1"/>
-                    </pic:cNvPicPr>
+                    <pic:cNvPr id="1395919992" name="Picture 1395919992"/>
+                    <pic:cNvPicPr/>
                   </pic:nvPicPr>
                   <pic:blipFill>
-                    <a:blip r:embed="rId8"/>
-                    <a:srcRect/>
+                    <a:blip r:embed="rId10" cstate="print">
+                      <a:extLst>
+                        <a:ext uri="{28A0092B-C50C-407E-A947-70E740481C1C}">
+                          <a14:useLocalDpi xmlns:a14="http://schemas.microsoft.com/office/drawing/2010/main" val="0"/>
+                        </a:ext>
+                      </a:extLst>
+                    </a:blip>
                     <a:stretch>
                       <a:fillRect/>
                     </a:stretch>
                   </pic:blipFill>
-                  <pic:spPr bwMode="auto">
+                  <pic:spPr>
                     <a:xfrm>
                       <a:off x="0" y="0"/>
-                      <a:ext cx="5854087" cy="3350532"/>
+                      <a:ext cx="4114800" cy="2468880"/>
                     </a:xfrm>
                     <a:prstGeom prst="rect">
                       <a:avLst/>
@@ -4227,8 +4490,7 @@
         <w:pStyle w:val="Caption"/>
         <w:jc w:val="center"/>
       </w:pPr>
-      <w:bookmarkStart w:id="7" w:name="_Ref231390466"/>
-      <w:bookmarkStart w:id="8" w:name="_Toc231503934"/>
+      <w:bookmarkStart w:id="7" w:name="_Toc231904772"/>
       <w:r>
         <w:t xml:space="preserve">Figura </w:t>
       </w:r>
@@ -4240,131 +4502,321 @@
           <w:t>1</w:t>
         </w:r>
       </w:fldSimple>
+      <w:r>
+        <w:t>: Histograma de distribución de puntos FIFA</w:t>
+      </w:r>
       <w:bookmarkEnd w:id="7"/>
-      <w:r>
-        <w:t xml:space="preserve">: </w:t>
-      </w:r>
-      <w:r>
-        <w:t>Matriz de correlación entre el puntaje FIFA, el valor del plantel y los indicadores demográficos y económicos del país de origen.</w:t>
-      </w:r>
-      <w:bookmarkEnd w:id="8"/>
-    </w:p>
-    <w:p>
-      <w:pPr>
-        <w:rPr>
-          <w:u w:val="single"/>
-        </w:rPr>
-      </w:pPr>
-    </w:p>
-    <w:p>
-      <w:pPr>
-        <w:pStyle w:val="Heading2"/>
-      </w:pPr>
-      <w:bookmarkStart w:id="9" w:name="_Toc231472771"/>
-      <w:r>
-        <w:t xml:space="preserve">Variables </w:t>
-      </w:r>
-      <w:r>
-        <w:t>categóricas</w:t>
-      </w:r>
-      <w:bookmarkEnd w:id="9"/>
-    </w:p>
-    <w:p>
-      <w:pPr>
-        <w:rPr>
-          <w:u w:val="single"/>
-        </w:rPr>
-      </w:pPr>
-      <w:r>
-        <w:t xml:space="preserve">A </w:t>
-      </w:r>
-      <w:proofErr w:type="gramStart"/>
-      <w:r>
-        <w:t>continuación</w:t>
-      </w:r>
-      <w:proofErr w:type="gramEnd"/>
-      <w:r>
-        <w:t xml:space="preserve"> se evaluaron las variables categóricas </w:t>
-      </w:r>
-      <w:r>
-        <w:t>utilizando</w:t>
-      </w:r>
-      <w:r>
-        <w:t xml:space="preserve"> gráficos de </w:t>
-      </w:r>
-      <w:proofErr w:type="spellStart"/>
-      <w:r>
-        <w:t>boxplot</w:t>
-      </w:r>
-      <w:proofErr w:type="spellEnd"/>
-      <w:r>
-        <w:t>: por continente (</w:t>
-      </w:r>
-      <w:r>
-        <w:fldChar w:fldCharType="begin"/>
-      </w:r>
-      <w:r>
-        <w:instrText xml:space="preserve"> REF _Ref231391086 \h </w:instrText>
-      </w:r>
-      <w:r>
-        <w:fldChar w:fldCharType="separate"/>
-      </w:r>
-      <w:r>
-        <w:t xml:space="preserve">Figura </w:t>
-      </w:r>
+    </w:p>
+    <w:p>
+      <w:r>
+        <w:t>E</w:t>
+      </w:r>
+      <w:r>
+        <w:t xml:space="preserve">l gráfico sigue una distribución normal; nos confirma lo que decía la descripción de estadísticos de que la media y la mediana son muy similares. Los equipos se encuentran principalmente alrededor del valor promedio, con muy pocos equipos en los extremos. </w:t>
+      </w:r>
+    </w:p>
+    <w:p>
+      <w:r>
+        <w:t xml:space="preserve">Con las otras variables se observa en los estadísticos que hay más dispersión, entonces se generaron unos histogramas para ver la distribución de estos. </w:t>
+      </w:r>
+    </w:p>
+    <w:p/>
+    <w:p>
+      <w:pPr>
+        <w:keepNext/>
+        <w:ind w:left="-993"/>
+        <w:jc w:val="center"/>
+      </w:pPr>
       <w:r>
         <w:rPr>
           <w:noProof/>
         </w:rPr>
-        <w:t>2</w:t>
-      </w:r>
-      <w:r>
-        <w:fldChar w:fldCharType="end"/>
-      </w:r>
-      <w:r>
-        <w:t xml:space="preserve">), </w:t>
-      </w:r>
-      <w:r>
-        <w:t>idioma</w:t>
-      </w:r>
-      <w:r>
-        <w:t xml:space="preserve"> (</w:t>
-      </w:r>
-      <w:r>
-        <w:fldChar w:fldCharType="begin"/>
-      </w:r>
-      <w:r>
-        <w:instrText xml:space="preserve"> REF _Ref231391408 \h </w:instrText>
-      </w:r>
-      <w:r>
-        <w:fldChar w:fldCharType="separate"/>
-      </w:r>
+        <w:drawing>
+          <wp:inline distT="0" distB="0" distL="0" distR="0" wp14:anchorId="0F8F4A6B" wp14:editId="77FD55C1">
+            <wp:extent cx="7302500" cy="2190750"/>
+            <wp:effectExtent l="0" t="0" r="0" b="0"/>
+            <wp:docPr id="1552921174" name="Picture 1"/>
+            <wp:cNvGraphicFramePr>
+              <a:graphicFrameLocks xmlns:a="http://schemas.openxmlformats.org/drawingml/2006/main" noChangeAspect="1"/>
+            </wp:cNvGraphicFramePr>
+            <a:graphic xmlns:a="http://schemas.openxmlformats.org/drawingml/2006/main">
+              <a:graphicData uri="http://schemas.openxmlformats.org/drawingml/2006/picture">
+                <pic:pic xmlns:pic="http://schemas.openxmlformats.org/drawingml/2006/picture">
+                  <pic:nvPicPr>
+                    <pic:cNvPr id="1552921174" name="Picture 1552921174"/>
+                    <pic:cNvPicPr/>
+                  </pic:nvPicPr>
+                  <pic:blipFill>
+                    <a:blip r:embed="rId11" cstate="print">
+                      <a:extLst>
+                        <a:ext uri="{28A0092B-C50C-407E-A947-70E740481C1C}">
+                          <a14:useLocalDpi xmlns:a14="http://schemas.microsoft.com/office/drawing/2010/main" val="0"/>
+                        </a:ext>
+                      </a:extLst>
+                    </a:blip>
+                    <a:stretch>
+                      <a:fillRect/>
+                    </a:stretch>
+                  </pic:blipFill>
+                  <pic:spPr>
+                    <a:xfrm>
+                      <a:off x="0" y="0"/>
+                      <a:ext cx="7302500" cy="2190750"/>
+                    </a:xfrm>
+                    <a:prstGeom prst="rect">
+                      <a:avLst/>
+                    </a:prstGeom>
+                  </pic:spPr>
+                </pic:pic>
+              </a:graphicData>
+            </a:graphic>
+          </wp:inline>
+        </w:drawing>
+      </w:r>
+    </w:p>
+    <w:p>
+      <w:pPr>
+        <w:pStyle w:val="Caption"/>
+        <w:jc w:val="center"/>
+      </w:pPr>
+      <w:bookmarkStart w:id="8" w:name="_Toc231904773"/>
       <w:r>
         <w:t xml:space="preserve">Figura </w:t>
       </w:r>
+      <w:fldSimple w:instr=" SEQ Figura \* ARABIC ">
+        <w:r>
+          <w:rPr>
+            <w:noProof/>
+          </w:rPr>
+          <w:t>2</w:t>
+        </w:r>
+      </w:fldSimple>
+      <w:r>
+        <w:t>: Histogramas de distribución del valor del equipo, PBI y PBI per cápita.</w:t>
+      </w:r>
+      <w:bookmarkEnd w:id="8"/>
+    </w:p>
+    <w:p/>
+    <w:p>
+      <w:pPr>
+        <w:ind w:left="-851"/>
+        <w:jc w:val="center"/>
+      </w:pPr>
       <w:r>
         <w:rPr>
           <w:noProof/>
         </w:rPr>
-        <w:t>3</w:t>
-      </w:r>
-      <w:r>
-        <w:fldChar w:fldCharType="end"/>
-      </w:r>
-      <w:r>
-        <w:t xml:space="preserve">) </w:t>
-      </w:r>
-      <w:r>
-        <w:t xml:space="preserve">y religión </w:t>
-      </w:r>
-      <w:r>
-        <w:t>(</w:t>
+        <w:lastRenderedPageBreak/>
+        <mc:AlternateContent>
+          <mc:Choice Requires="wps">
+            <w:drawing>
+              <wp:anchor distT="0" distB="0" distL="114300" distR="114300" simplePos="0" relativeHeight="251661312" behindDoc="0" locked="0" layoutInCell="1" allowOverlap="1" wp14:anchorId="2A9930C2" wp14:editId="15ACBA51">
+                <wp:simplePos x="0" y="0"/>
+                <wp:positionH relativeFrom="column">
+                  <wp:posOffset>85725</wp:posOffset>
+                </wp:positionH>
+                <wp:positionV relativeFrom="paragraph">
+                  <wp:posOffset>2199005</wp:posOffset>
+                </wp:positionV>
+                <wp:extent cx="5943600" cy="635"/>
+                <wp:effectExtent l="0" t="0" r="0" b="0"/>
+                <wp:wrapSquare wrapText="bothSides"/>
+                <wp:docPr id="261508167" name="Text Box 1"/>
+                <wp:cNvGraphicFramePr/>
+                <a:graphic xmlns:a="http://schemas.openxmlformats.org/drawingml/2006/main">
+                  <a:graphicData uri="http://schemas.microsoft.com/office/word/2010/wordprocessingShape">
+                    <wps:wsp>
+                      <wps:cNvSpPr txBox="1"/>
+                      <wps:spPr>
+                        <a:xfrm>
+                          <a:off x="0" y="0"/>
+                          <a:ext cx="5943600" cy="635"/>
+                        </a:xfrm>
+                        <a:prstGeom prst="rect">
+                          <a:avLst/>
+                        </a:prstGeom>
+                        <a:solidFill>
+                          <a:prstClr val="white"/>
+                        </a:solidFill>
+                        <a:ln>
+                          <a:noFill/>
+                        </a:ln>
+                      </wps:spPr>
+                      <wps:txbx>
+                        <w:txbxContent>
+                          <w:p>
+                            <w:pPr>
+                              <w:pStyle w:val="Caption"/>
+                              <w:jc w:val="center"/>
+                              <w:rPr>
+                                <w:noProof/>
+                                <w:sz w:val="22"/>
+                                <w:szCs w:val="22"/>
+                              </w:rPr>
+                            </w:pPr>
+                            <w:bookmarkStart w:id="9" w:name="_Toc231904774"/>
+                            <w:r>
+                              <w:t xml:space="preserve">Figura </w:t>
+                            </w:r>
+                            <w:fldSimple w:instr=" SEQ Figura \* ARABIC ">
+                              <w:r>
+                                <w:rPr>
+                                  <w:noProof/>
+                                </w:rPr>
+                                <w:t>3</w:t>
+                              </w:r>
+                            </w:fldSimple>
+                            <w:r>
+                              <w:t>: Histograma de distribución de población, densidad y superficie.</w:t>
+                            </w:r>
+                            <w:bookmarkEnd w:id="9"/>
+                          </w:p>
+                        </w:txbxContent>
+                      </wps:txbx>
+                      <wps:bodyPr rot="0" spcFirstLastPara="0" vertOverflow="overflow" horzOverflow="overflow" vert="horz" wrap="square" lIns="0" tIns="0" rIns="0" bIns="0" numCol="1" spcCol="0" rtlCol="0" fromWordArt="0" anchor="t" anchorCtr="0" forceAA="0" compatLnSpc="1">
+                        <a:prstTxWarp prst="textNoShape">
+                          <a:avLst/>
+                        </a:prstTxWarp>
+                        <a:spAutoFit/>
+                      </wps:bodyPr>
+                    </wps:wsp>
+                  </a:graphicData>
+                </a:graphic>
+              </wp:anchor>
+            </w:drawing>
+          </mc:Choice>
+          <mc:Fallback>
+            <w:pict>
+              <v:shapetype w14:anchorId="2A9930C2" id="_x0000_t202" coordsize="21600,21600" o:spt="202" path="m,l,21600r21600,l21600,xe">
+                <v:stroke joinstyle="miter"/>
+                <v:path gradientshapeok="t" o:connecttype="rect"/>
+              </v:shapetype>
+              <v:shape id="Text Box 1" o:spid="_x0000_s1026" type="#_x0000_t202" style="position:absolute;left:0;text-align:left;margin-left:6.75pt;margin-top:173.15pt;width:468pt;height:.05pt;z-index:251661312;visibility:visible;mso-wrap-style:square;mso-wrap-distance-left:9pt;mso-wrap-distance-top:0;mso-wrap-distance-right:9pt;mso-wrap-distance-bottom:0;mso-position-horizontal:absolute;mso-position-horizontal-relative:text;mso-position-vertical:absolute;mso-position-vertical-relative:text;v-text-anchor:top" o:gfxdata="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" stroked="f">
+                <v:textbox style="mso-fit-shape-to-text:t" inset="0,0,0,0">
+                  <w:txbxContent>
+                    <w:p>
+                      <w:pPr>
+                        <w:pStyle w:val="Caption"/>
+                        <w:jc w:val="center"/>
+                        <w:rPr>
+                          <w:noProof/>
+                          <w:sz w:val="22"/>
+                          <w:szCs w:val="22"/>
+                        </w:rPr>
+                      </w:pPr>
+                      <w:bookmarkStart w:id="10" w:name="_Toc231904774"/>
+                      <w:r>
+                        <w:t xml:space="preserve">Figura </w:t>
+                      </w:r>
+                      <w:fldSimple w:instr=" SEQ Figura \* ARABIC ">
+                        <w:r>
+                          <w:rPr>
+                            <w:noProof/>
+                          </w:rPr>
+                          <w:t>3</w:t>
+                        </w:r>
+                      </w:fldSimple>
+                      <w:r>
+                        <w:t>: Histograma de distribución de población, densidad y superficie.</w:t>
+                      </w:r>
+                      <w:bookmarkEnd w:id="10"/>
+                    </w:p>
+                  </w:txbxContent>
+                </v:textbox>
+                <w10:wrap type="square"/>
+              </v:shape>
+            </w:pict>
+          </mc:Fallback>
+        </mc:AlternateContent>
+      </w:r>
+      <w:r>
+        <w:rPr>
+          <w:noProof/>
+        </w:rPr>
+        <w:drawing>
+          <wp:inline distT="0" distB="0" distL="0" distR="0" wp14:anchorId="5C488EA8" wp14:editId="330F9614">
+            <wp:extent cx="7048500" cy="2114550"/>
+            <wp:effectExtent l="0" t="0" r="0" b="0"/>
+            <wp:docPr id="977164438" name="Picture 3"/>
+            <wp:cNvGraphicFramePr>
+              <a:graphicFrameLocks xmlns:a="http://schemas.openxmlformats.org/drawingml/2006/main" noChangeAspect="1"/>
+            </wp:cNvGraphicFramePr>
+            <a:graphic xmlns:a="http://schemas.openxmlformats.org/drawingml/2006/main">
+              <a:graphicData uri="http://schemas.openxmlformats.org/drawingml/2006/picture">
+                <pic:pic xmlns:pic="http://schemas.openxmlformats.org/drawingml/2006/picture">
+                  <pic:nvPicPr>
+                    <pic:cNvPr id="977164438" name="Picture 977164438"/>
+                    <pic:cNvPicPr/>
+                  </pic:nvPicPr>
+                  <pic:blipFill>
+                    <a:blip r:embed="rId12" cstate="print">
+                      <a:extLst>
+                        <a:ext uri="{28A0092B-C50C-407E-A947-70E740481C1C}">
+                          <a14:useLocalDpi xmlns:a14="http://schemas.microsoft.com/office/drawing/2010/main" val="0"/>
+                        </a:ext>
+                      </a:extLst>
+                    </a:blip>
+                    <a:stretch>
+                      <a:fillRect/>
+                    </a:stretch>
+                  </pic:blipFill>
+                  <pic:spPr>
+                    <a:xfrm>
+                      <a:off x="0" y="0"/>
+                      <a:ext cx="7052711" cy="2115813"/>
+                    </a:xfrm>
+                    <a:prstGeom prst="rect">
+                      <a:avLst/>
+                    </a:prstGeom>
+                  </pic:spPr>
+                </pic:pic>
+              </a:graphicData>
+            </a:graphic>
+          </wp:inline>
+        </w:drawing>
+      </w:r>
+    </w:p>
+    <w:p>
+      <w:r>
+        <w:t>L</w:t>
+      </w:r>
+      <w:r>
+        <w:t xml:space="preserve">os </w:t>
+      </w:r>
+      <w:r>
+        <w:t>histogramas presentan una marcada asimetría positiva: la mayoría de los países se concentra en los valores bajos y unos pocos casos forman una larga cola hacia la derecha. Esta concentración es especialmente pronunciada en el PBI, dominado por un único valor extremo. El contraste entre estas distribuciones —muy desiguales en términos económicos</w:t>
+      </w:r>
+      <w:r>
+        <w:t xml:space="preserve"> y demográficos</w:t>
+      </w:r>
+      <w:r>
+        <w:t xml:space="preserve">— y la del puntaje FIFA, mucho más repartida entre las selecciones, sugiere a priori que la riqueza del país no alcanza para ordenar el rendimiento deportivo: si así fuera, </w:t>
+      </w:r>
+      <w:r>
+        <w:t>sería esperable</w:t>
+      </w:r>
+      <w:r>
+        <w:t xml:space="preserve"> ver reflejada en el puntaje la misma concentración extrema que muestran las variables económicas. </w:t>
+      </w:r>
+      <w:r>
+        <w:t xml:space="preserve"> </w:t>
+      </w:r>
+    </w:p>
+    <w:p>
+      <w:r>
+        <w:t xml:space="preserve">Para confirmarlo, se </w:t>
+      </w:r>
+      <w:r>
+        <w:t>generó</w:t>
+      </w:r>
+      <w:r>
+        <w:t xml:space="preserve"> un mapa de calor para buscar correlación entre las variables numéricas (ver </w:t>
       </w:r>
       <w:r>
         <w:fldChar w:fldCharType="begin"/>
       </w:r>
       <w:r>
-        <w:instrText xml:space="preserve"> REF _Ref231391423 \h </w:instrText>
+        <w:instrText xml:space="preserve"> REF _Ref231390466 \h </w:instrText>
       </w:r>
       <w:r>
         <w:fldChar w:fldCharType="separate"/>
@@ -4382,6 +4834,229 @@
         <w:fldChar w:fldCharType="end"/>
       </w:r>
       <w:r>
+        <w:t>).</w:t>
+      </w:r>
+    </w:p>
+    <w:p/>
+    <w:p>
+      <w:pPr>
+        <w:jc w:val="center"/>
+      </w:pPr>
+      <w:r>
+        <w:rPr>
+          <w:noProof/>
+        </w:rPr>
+        <w:drawing>
+          <wp:inline distT="0" distB="0" distL="0" distR="0" wp14:anchorId="20FBE3CD" wp14:editId="22D37320">
+            <wp:extent cx="5057775" cy="3034665"/>
+            <wp:effectExtent l="0" t="0" r="9525" b="0"/>
+            <wp:docPr id="1" name="Picture 1"/>
+            <wp:cNvGraphicFramePr>
+              <a:graphicFrameLocks xmlns:a="http://schemas.openxmlformats.org/drawingml/2006/main" noChangeAspect="1"/>
+            </wp:cNvGraphicFramePr>
+            <a:graphic xmlns:a="http://schemas.openxmlformats.org/drawingml/2006/main">
+              <a:graphicData uri="http://schemas.openxmlformats.org/drawingml/2006/picture">
+                <pic:pic xmlns:pic="http://schemas.openxmlformats.org/drawingml/2006/picture">
+                  <pic:nvPicPr>
+                    <pic:cNvPr id="1" name="Picture 1"/>
+                    <pic:cNvPicPr>
+                      <a:picLocks noChangeAspect="1" noChangeArrowheads="1"/>
+                    </pic:cNvPicPr>
+                  </pic:nvPicPr>
+                  <pic:blipFill>
+                    <a:blip r:embed="rId13">
+                      <a:extLst>
+                        <a:ext uri="{28A0092B-C50C-407E-A947-70E740481C1C}">
+                          <a14:useLocalDpi xmlns:a14="http://schemas.microsoft.com/office/drawing/2010/main" val="0"/>
+                        </a:ext>
+                      </a:extLst>
+                    </a:blip>
+                    <a:stretch>
+                      <a:fillRect/>
+                    </a:stretch>
+                  </pic:blipFill>
+                  <pic:spPr bwMode="auto">
+                    <a:xfrm>
+                      <a:off x="0" y="0"/>
+                      <a:ext cx="5059339" cy="3035603"/>
+                    </a:xfrm>
+                    <a:prstGeom prst="rect">
+                      <a:avLst/>
+                    </a:prstGeom>
+                  </pic:spPr>
+                </pic:pic>
+              </a:graphicData>
+            </a:graphic>
+          </wp:inline>
+        </w:drawing>
+      </w:r>
+    </w:p>
+    <w:p>
+      <w:pPr>
+        <w:pStyle w:val="Caption"/>
+        <w:jc w:val="center"/>
+      </w:pPr>
+      <w:bookmarkStart w:id="10" w:name="_Ref231390466"/>
+      <w:bookmarkStart w:id="11" w:name="_Toc231904775"/>
+      <w:r>
+        <w:t xml:space="preserve">Figura </w:t>
+      </w:r>
+      <w:fldSimple w:instr=" SEQ Figura \* ARABIC ">
+        <w:r>
+          <w:rPr>
+            <w:noProof/>
+          </w:rPr>
+          <w:t>4</w:t>
+        </w:r>
+      </w:fldSimple>
+      <w:bookmarkEnd w:id="10"/>
+      <w:r>
+        <w:t xml:space="preserve">: </w:t>
+      </w:r>
+      <w:r>
+        <w:t>Matriz de correlación entre el puntaje FIFA, el valor del plantel y los indicadores demográficos y económicos del país de origen.</w:t>
+      </w:r>
+      <w:bookmarkEnd w:id="11"/>
+    </w:p>
+    <w:p>
+      <w:r>
+        <w:lastRenderedPageBreak/>
+        <w:t>La matriz de correlación ofrece el primer hallazgo central: el puntaje FIFA se asocia fuertemente con el valor de mercado del plantel (r = 0,76), pero no se vincula con la edad media del plantel ni tampoco con los indicadores económicos y demográficos del país. En otras palabras, la prosperidad general de una nación no anticipa el desempeño de su selección, pero sí lo hace el capital deportivo concentrado en el plantel.</w:t>
+      </w:r>
+    </w:p>
+    <w:p>
+      <w:pPr>
+        <w:rPr>
+          <w:u w:val="single"/>
+        </w:rPr>
+      </w:pPr>
+    </w:p>
+    <w:p>
+      <w:pPr>
+        <w:pStyle w:val="Heading2"/>
+      </w:pPr>
+      <w:bookmarkStart w:id="12" w:name="_Toc231472771"/>
+      <w:r>
+        <w:t xml:space="preserve">Variables </w:t>
+      </w:r>
+      <w:r>
+        <w:t>categóricas</w:t>
+      </w:r>
+      <w:bookmarkEnd w:id="12"/>
+    </w:p>
+    <w:p>
+      <w:pPr>
+        <w:rPr>
+          <w:u w:val="single"/>
+        </w:rPr>
+      </w:pPr>
+      <w:r>
+        <w:t xml:space="preserve">A </w:t>
+      </w:r>
+      <w:proofErr w:type="gramStart"/>
+      <w:r>
+        <w:t>continuación</w:t>
+      </w:r>
+      <w:proofErr w:type="gramEnd"/>
+      <w:r>
+        <w:t xml:space="preserve"> se evaluaron las variables categóricas </w:t>
+      </w:r>
+      <w:r>
+        <w:t>utilizando</w:t>
+      </w:r>
+      <w:r>
+        <w:t xml:space="preserve"> gráficos de </w:t>
+      </w:r>
+      <w:proofErr w:type="spellStart"/>
+      <w:r>
+        <w:t>boxplot</w:t>
+      </w:r>
+      <w:proofErr w:type="spellEnd"/>
+      <w:r>
+        <w:t>: por continente (</w:t>
+      </w:r>
+      <w:r>
+        <w:fldChar w:fldCharType="begin"/>
+      </w:r>
+      <w:r>
+        <w:instrText xml:space="preserve"> REF _Ref231391086 \h </w:instrText>
+      </w:r>
+      <w:r>
+        <w:fldChar w:fldCharType="separate"/>
+      </w:r>
+      <w:r>
+        <w:t xml:space="preserve">Figura </w:t>
+      </w:r>
+      <w:r>
+        <w:rPr>
+          <w:noProof/>
+        </w:rPr>
+        <w:t>5</w:t>
+      </w:r>
+      <w:r>
+        <w:fldChar w:fldCharType="end"/>
+      </w:r>
+      <w:r>
+        <w:t xml:space="preserve">), </w:t>
+      </w:r>
+      <w:r>
+        <w:t>idioma</w:t>
+      </w:r>
+      <w:r>
+        <w:t xml:space="preserve"> (</w:t>
+      </w:r>
+      <w:r>
+        <w:fldChar w:fldCharType="begin"/>
+      </w:r>
+      <w:r>
+        <w:instrText xml:space="preserve"> REF _Ref231391408 \h </w:instrText>
+      </w:r>
+      <w:r>
+        <w:fldChar w:fldCharType="separate"/>
+      </w:r>
+      <w:r>
+        <w:t xml:space="preserve">Figura </w:t>
+      </w:r>
+      <w:r>
+        <w:rPr>
+          <w:noProof/>
+        </w:rPr>
+        <w:t>6</w:t>
+      </w:r>
+      <w:r>
+        <w:fldChar w:fldCharType="end"/>
+      </w:r>
+      <w:r>
+        <w:t xml:space="preserve">) </w:t>
+      </w:r>
+      <w:r>
+        <w:t xml:space="preserve">y religión </w:t>
+      </w:r>
+      <w:r>
+        <w:t>(</w:t>
+      </w:r>
+      <w:r>
+        <w:fldChar w:fldCharType="begin"/>
+      </w:r>
+      <w:r>
+        <w:instrText xml:space="preserve"> REF _Ref231391423 \h </w:instrText>
+      </w:r>
+      <w:r>
+        <w:fldChar w:fldCharType="separate"/>
+      </w:r>
+      <w:r>
+        <w:t xml:space="preserve">Figura </w:t>
+      </w:r>
+      <w:r>
+        <w:rPr>
+          <w:noProof/>
+        </w:rPr>
+        <w:t>7</w:t>
+      </w:r>
+      <w:r>
+        <w:fldChar w:fldCharType="end"/>
+      </w:r>
+      <w:r>
         <w:t xml:space="preserve">). </w:t>
       </w:r>
     </w:p>
@@ -4396,7 +5071,6 @@
         <w:rPr>
           <w:noProof/>
         </w:rPr>
-        <w:lastRenderedPageBreak/>
         <w:drawing>
           <wp:inline distT="0" distB="0" distL="0" distR="0" wp14:anchorId="5716749C" wp14:editId="390F0C66">
             <wp:extent cx="6065476" cy="2260879"/>
@@ -4415,7 +5089,7 @@
                     </pic:cNvPicPr>
                   </pic:nvPicPr>
                   <pic:blipFill>
-                    <a:blip r:embed="rId9"/>
+                    <a:blip r:embed="rId14"/>
                     <a:srcRect/>
                     <a:stretch>
                       <a:fillRect/>
@@ -4442,8 +5116,8 @@
         <w:pStyle w:val="Caption"/>
         <w:jc w:val="center"/>
       </w:pPr>
-      <w:bookmarkStart w:id="10" w:name="_Ref231391086"/>
-      <w:bookmarkStart w:id="11" w:name="_Toc231503935"/>
+      <w:bookmarkStart w:id="13" w:name="_Ref231391086"/>
+      <w:bookmarkStart w:id="14" w:name="_Toc231904776"/>
       <w:r>
         <w:t xml:space="preserve">Figura </w:t>
       </w:r>
@@ -4452,10 +5126,10 @@
           <w:rPr>
             <w:noProof/>
           </w:rPr>
-          <w:t>2</w:t>
+          <w:t>5</w:t>
         </w:r>
       </w:fldSimple>
-      <w:bookmarkEnd w:id="10"/>
+      <w:bookmarkEnd w:id="13"/>
       <w:r>
         <w:t>:</w:t>
       </w:r>
@@ -4465,7 +5139,7 @@
       <w:r>
         <w:t>Distribución del puntaje FIFA por continente de origen de la selección.</w:t>
       </w:r>
-      <w:bookmarkEnd w:id="11"/>
+      <w:bookmarkEnd w:id="14"/>
     </w:p>
     <w:p/>
     <w:p>
@@ -4488,18 +5162,19 @@
         <w:t xml:space="preserve"> base de jugadores que lleguen a niveles competitivos internacionalmente. También es posible que la propia exigencia competitiva entre países vecinos los obligue a elevar el nivel de sus planteles.</w:t>
       </w:r>
     </w:p>
-    <w:p/>
     <w:p>
       <w:pPr>
         <w:keepNext/>
+        <w:jc w:val="center"/>
       </w:pPr>
       <w:r>
         <w:rPr>
           <w:noProof/>
         </w:rPr>
+        <w:lastRenderedPageBreak/>
         <w:drawing>
-          <wp:inline distT="0" distB="0" distL="0" distR="0" wp14:anchorId="119D407A" wp14:editId="58AB950B">
-            <wp:extent cx="5943600" cy="1981200"/>
+          <wp:inline distT="0" distB="0" distL="0" distR="0" wp14:anchorId="119D407A" wp14:editId="7E0F7BDC">
+            <wp:extent cx="3695700" cy="1847850"/>
             <wp:effectExtent l="0" t="0" r="0" b="0"/>
             <wp:docPr id="1761773335" name="Imagen 2"/>
             <wp:cNvGraphicFramePr>
@@ -4509,11 +5184,11 @@
               <a:graphicData uri="http://schemas.openxmlformats.org/drawingml/2006/picture">
                 <pic:pic xmlns:pic="http://schemas.openxmlformats.org/drawingml/2006/picture">
                   <pic:nvPicPr>
-                    <pic:cNvPr id="1761773335" name="Imagen 1761773335"/>
+                    <pic:cNvPr id="1761773335" name="Imagen 2"/>
                     <pic:cNvPicPr/>
                   </pic:nvPicPr>
                   <pic:blipFill>
-                    <a:blip r:embed="rId10" cstate="print">
+                    <a:blip r:embed="rId15" cstate="print">
                       <a:extLst>
                         <a:ext uri="{28A0092B-C50C-407E-A947-70E740481C1C}">
                           <a14:useLocalDpi xmlns:a14="http://schemas.microsoft.com/office/drawing/2010/main" val="0"/>
@@ -4527,7 +5202,7 @@
                   <pic:spPr>
                     <a:xfrm>
                       <a:off x="0" y="0"/>
-                      <a:ext cx="5943600" cy="1981200"/>
+                      <a:ext cx="3699428" cy="1849714"/>
                     </a:xfrm>
                     <a:prstGeom prst="rect">
                       <a:avLst/>
@@ -4545,8 +5220,8 @@
         <w:pStyle w:val="Caption"/>
         <w:jc w:val="center"/>
       </w:pPr>
-      <w:bookmarkStart w:id="12" w:name="_Ref231391408"/>
-      <w:bookmarkStart w:id="13" w:name="_Toc231503936"/>
+      <w:bookmarkStart w:id="15" w:name="_Ref231391408"/>
+      <w:bookmarkStart w:id="16" w:name="_Toc231904777"/>
       <w:r>
         <w:t xml:space="preserve">Figura </w:t>
       </w:r>
@@ -4555,10 +5230,10 @@
           <w:rPr>
             <w:noProof/>
           </w:rPr>
-          <w:t>3</w:t>
+          <w:t>6</w:t>
         </w:r>
       </w:fldSimple>
-      <w:bookmarkEnd w:id="12"/>
+      <w:bookmarkEnd w:id="15"/>
       <w:r>
         <w:t xml:space="preserve">: </w:t>
       </w:r>
@@ -4595,9 +5270,14 @@
       <w:r>
         <w:t>.</w:t>
       </w:r>
-      <w:bookmarkEnd w:id="13"/>
-    </w:p>
-    <w:p>
+      <w:bookmarkEnd w:id="16"/>
+    </w:p>
+    <w:p>
+      <w:pPr>
+        <w:rPr>
+          <w:noProof/>
+        </w:rPr>
+      </w:pPr>
       <w:r>
         <w:t xml:space="preserve">Viendo el </w:t>
       </w:r>
@@ -4622,48 +5302,38 @@
         <w:t>variables</w:t>
       </w:r>
       <w:r>
+        <w:t xml:space="preserve"> están estrechamente </w:t>
+      </w:r>
+      <w:r>
+        <w:t>relacionad</w:t>
+      </w:r>
+      <w:r>
+        <w:t>a</w:t>
+      </w:r>
+      <w:r>
+        <w:t>s</w:t>
+      </w:r>
+      <w:r>
+        <w:t>.</w:t>
+      </w:r>
+      <w:r>
+        <w:t xml:space="preserve"> Estas regularidades apuntan a factores culturales y de tradición futbolística no capturados por las variables económicas.</w:t>
+      </w:r>
+      <w:r>
+        <w:rPr>
+          <w:noProof/>
+        </w:rPr>
         <w:t xml:space="preserve"> </w:t>
       </w:r>
-      <w:r>
-        <w:lastRenderedPageBreak/>
-        <w:t xml:space="preserve">están estrechamente </w:t>
-      </w:r>
-      <w:r>
-        <w:t>relacionad</w:t>
-      </w:r>
-      <w:r>
-        <w:t>a</w:t>
-      </w:r>
-      <w:r>
-        <w:t>s</w:t>
-      </w:r>
-      <w:r>
-        <w:t>.</w:t>
-      </w:r>
-      <w:r>
-        <w:t xml:space="preserve"> Estas regularidades apuntan a factores culturales y de tradición futbolística no capturados por las variables económicas.</w:t>
-      </w:r>
-    </w:p>
-    <w:p>
-      <w:pPr>
-        <w:rPr>
-          <w:u w:val="single"/>
-        </w:rPr>
-      </w:pPr>
-    </w:p>
-    <w:p>
-      <w:pPr>
-        <w:keepNext/>
-        <w:spacing w:before="80" w:after="100"/>
-        <w:jc w:val="center"/>
-      </w:pPr>
+    </w:p>
+    <w:p>
       <w:r>
         <w:rPr>
           <w:noProof/>
         </w:rPr>
         <w:drawing>
-          <wp:inline distT="0" distB="0" distL="0" distR="0" wp14:anchorId="2C112144" wp14:editId="17AA29CF">
-            <wp:extent cx="5970306" cy="2628900"/>
+          <wp:inline distT="0" distB="0" distL="0" distR="0" wp14:anchorId="263042A6" wp14:editId="19C03720">
+            <wp:extent cx="5943600" cy="2617156"/>
             <wp:effectExtent l="0" t="0" r="0" b="0"/>
             <wp:docPr id="330224463" name="Imagen 1"/>
             <wp:cNvGraphicFramePr>
@@ -4677,7 +5347,7 @@
                     <pic:cNvPicPr/>
                   </pic:nvPicPr>
                   <pic:blipFill>
-                    <a:blip r:embed="rId11" cstate="print">
+                    <a:blip r:embed="rId16" cstate="print">
                       <a:extLst>
                         <a:ext uri="{28A0092B-C50C-407E-A947-70E740481C1C}">
                           <a14:useLocalDpi xmlns:a14="http://schemas.microsoft.com/office/drawing/2010/main" val="0"/>
@@ -4691,7 +5361,7 @@
                   <pic:spPr>
                     <a:xfrm>
                       <a:off x="0" y="0"/>
-                      <a:ext cx="5982026" cy="2634061"/>
+                      <a:ext cx="5943600" cy="2617156"/>
                     </a:xfrm>
                     <a:prstGeom prst="rect">
                       <a:avLst/>
@@ -4709,8 +5379,8 @@
         <w:pStyle w:val="Caption"/>
         <w:jc w:val="center"/>
       </w:pPr>
-      <w:bookmarkStart w:id="14" w:name="_Ref231391423"/>
-      <w:bookmarkStart w:id="15" w:name="_Toc231503937"/>
+      <w:bookmarkStart w:id="17" w:name="_Ref231391423"/>
+      <w:bookmarkStart w:id="18" w:name="_Toc231904778"/>
       <w:r>
         <w:t xml:space="preserve">Figura </w:t>
       </w:r>
@@ -4719,10 +5389,10 @@
           <w:rPr>
             <w:noProof/>
           </w:rPr>
-          <w:t>4</w:t>
+          <w:t>7</w:t>
         </w:r>
       </w:fldSimple>
-      <w:bookmarkEnd w:id="14"/>
+      <w:bookmarkEnd w:id="17"/>
       <w:r>
         <w:t>:</w:t>
       </w:r>
@@ -4750,7 +5420,7 @@
       <w:r>
         <w:t>.</w:t>
       </w:r>
-      <w:bookmarkEnd w:id="15"/>
+      <w:bookmarkEnd w:id="18"/>
     </w:p>
     <w:p>
       <w:r>
@@ -4768,7 +5438,11 @@
         <w:t xml:space="preserve"> budistas, hindúes o judíos.</w:t>
       </w:r>
       <w:r>
-        <w:t xml:space="preserve"> Visto que la mayoría de los países son cristianos, no podemos deducir mucho sobre el </w:t>
+        <w:t xml:space="preserve"> Visto que la mayoría de los países son cristianos, no podemos deducir mucho </w:t>
+      </w:r>
+      <w:r>
+        <w:lastRenderedPageBreak/>
+        <w:t xml:space="preserve">sobre el </w:t>
       </w:r>
       <w:proofErr w:type="spellStart"/>
       <w:r>
@@ -4809,11 +5483,11 @@
       <w:pPr>
         <w:pStyle w:val="Heading2"/>
       </w:pPr>
-      <w:bookmarkStart w:id="16" w:name="_Toc231472772"/>
+      <w:bookmarkStart w:id="19" w:name="_Toc231472772"/>
       <w:r>
         <w:t>La inversión en el plantel y su rendimiento</w:t>
       </w:r>
-      <w:bookmarkEnd w:id="16"/>
+      <w:bookmarkEnd w:id="19"/>
     </w:p>
     <w:p>
       <w:r>
@@ -4869,7 +5543,6 @@
         <w:rPr>
           <w:noProof/>
         </w:rPr>
-        <w:lastRenderedPageBreak/>
         <w:drawing>
           <wp:inline distT="0" distB="0" distL="0" distR="0" wp14:anchorId="5B639425" wp14:editId="16372F5A">
             <wp:extent cx="4114800" cy="2524125"/>
@@ -4888,7 +5561,7 @@
                     </pic:cNvPicPr>
                   </pic:nvPicPr>
                   <pic:blipFill>
-                    <a:blip r:embed="rId12"/>
+                    <a:blip r:embed="rId17"/>
                     <a:srcRect/>
                     <a:stretch>
                       <a:fillRect/>
@@ -4915,8 +5588,8 @@
         <w:pStyle w:val="Caption"/>
         <w:jc w:val="center"/>
       </w:pPr>
-      <w:bookmarkStart w:id="17" w:name="_Ref231392902"/>
-      <w:bookmarkStart w:id="18" w:name="_Toc231503938"/>
+      <w:bookmarkStart w:id="20" w:name="_Ref231392902"/>
+      <w:bookmarkStart w:id="21" w:name="_Toc231904779"/>
       <w:r>
         <w:t xml:space="preserve">Figura </w:t>
       </w:r>
@@ -4925,17 +5598,17 @@
           <w:rPr>
             <w:noProof/>
           </w:rPr>
-          <w:t>6</w:t>
+          <w:t>8</w:t>
         </w:r>
       </w:fldSimple>
-      <w:bookmarkEnd w:id="17"/>
+      <w:bookmarkEnd w:id="20"/>
       <w:r>
         <w:t xml:space="preserve">: </w:t>
       </w:r>
       <w:r>
         <w:t>Relación entre el valor del plantel (miles de millones de euros) y el puntaje FIFA, según continente.</w:t>
       </w:r>
-      <w:bookmarkEnd w:id="18"/>
+      <w:bookmarkEnd w:id="21"/>
     </w:p>
     <w:p>
       <w:r>
@@ -5034,7 +5707,6 @@
         <w:t xml:space="preserve"> mayor.</w:t>
       </w:r>
     </w:p>
-    <w:p/>
     <w:tbl>
       <w:tblPr>
         <w:tblStyle w:val="GridTable1Light"/>
@@ -5678,7 +6350,7 @@
         <w:pStyle w:val="Caption"/>
         <w:jc w:val="center"/>
       </w:pPr>
-      <w:bookmarkStart w:id="19" w:name="_Toc231472810"/>
+      <w:bookmarkStart w:id="22" w:name="_Toc231472810"/>
       <w:r>
         <w:t xml:space="preserve">Tabla </w:t>
       </w:r>
@@ -5696,7 +6368,7 @@
       <w:r>
         <w:t>(R²) de los modelos evaluados.</w:t>
       </w:r>
-      <w:bookmarkEnd w:id="19"/>
+      <w:bookmarkEnd w:id="22"/>
     </w:p>
     <w:p>
       <w:pPr>
@@ -5724,7 +6396,7 @@
                     <pic:cNvPicPr/>
                   </pic:nvPicPr>
                   <pic:blipFill>
-                    <a:blip r:embed="rId13">
+                    <a:blip r:embed="rId18">
                       <a:extLst>
                         <a:ext uri="{28A0092B-C50C-407E-A947-70E740481C1C}">
                           <a14:useLocalDpi xmlns:a14="http://schemas.microsoft.com/office/drawing/2010/main" val="0"/>
@@ -5756,7 +6428,7 @@
         <w:pStyle w:val="Caption"/>
         <w:jc w:val="center"/>
       </w:pPr>
-      <w:bookmarkStart w:id="20" w:name="_Toc231503939"/>
+      <w:bookmarkStart w:id="23" w:name="_Toc231904780"/>
       <w:r>
         <w:t xml:space="preserve">Figura </w:t>
       </w:r>
@@ -5765,13 +6437,13 @@
           <w:rPr>
             <w:noProof/>
           </w:rPr>
-          <w:t>7</w:t>
+          <w:t>9</w:t>
         </w:r>
       </w:fldSimple>
       <w:r>
         <w:t>: Ajuste de modelos</w:t>
       </w:r>
-      <w:bookmarkEnd w:id="20"/>
+      <w:bookmarkEnd w:id="23"/>
     </w:p>
     <w:p>
       <w:r>
@@ -6099,7 +6771,7 @@
           <w:noProof/>
         </w:rPr>
         <w:drawing>
-          <wp:inline distT="0" distB="0" distL="0" distR="0" wp14:anchorId="71D9D7D5" wp14:editId="477B1A45">
+          <wp:inline distT="0" distB="0" distL="0" distR="0" wp14:anchorId="71D9D7D5" wp14:editId="0B06AA4E">
             <wp:extent cx="5943600" cy="1919932"/>
             <wp:effectExtent l="0" t="0" r="0" b="4445"/>
             <wp:docPr id="264529016" name="Imagen 2"/>
@@ -6114,7 +6786,7 @@
                     <pic:cNvPicPr/>
                   </pic:nvPicPr>
                   <pic:blipFill>
-                    <a:blip r:embed="rId14" cstate="print">
+                    <a:blip r:embed="rId19" cstate="print">
                       <a:extLst>
                         <a:ext uri="{28A0092B-C50C-407E-A947-70E740481C1C}">
                           <a14:useLocalDpi xmlns:a14="http://schemas.microsoft.com/office/drawing/2010/main" val="0"/>
@@ -6152,9 +6824,9 @@
         <w:pStyle w:val="Caption"/>
         <w:jc w:val="center"/>
       </w:pPr>
-      <w:bookmarkStart w:id="21" w:name="_Ref231466931"/>
-      <w:bookmarkStart w:id="22" w:name="_Ref231466924"/>
-      <w:bookmarkStart w:id="23" w:name="_Toc231503940"/>
+      <w:bookmarkStart w:id="24" w:name="_Ref231466931"/>
+      <w:bookmarkStart w:id="25" w:name="_Ref231466924"/>
+      <w:bookmarkStart w:id="26" w:name="_Toc231904781"/>
       <w:r>
         <w:t xml:space="preserve">Figura </w:t>
       </w:r>
@@ -6163,10 +6835,10 @@
           <w:rPr>
             <w:noProof/>
           </w:rPr>
-          <w:t>8</w:t>
+          <w:t>10</w:t>
         </w:r>
       </w:fldSimple>
-      <w:bookmarkEnd w:id="21"/>
+      <w:bookmarkEnd w:id="24"/>
       <w:r>
         <w:t>: Modelo cuadrático</w:t>
       </w:r>
@@ -6176,8 +6848,8 @@
       <w:r>
         <w:t xml:space="preserve"> función y primera y segunda derivada.</w:t>
       </w:r>
-      <w:bookmarkEnd w:id="22"/>
-      <w:bookmarkEnd w:id="23"/>
+      <w:bookmarkEnd w:id="25"/>
+      <w:bookmarkEnd w:id="26"/>
     </w:p>
     <w:p/>
     <w:p>
@@ -6320,7 +6992,7 @@
         <w:rPr>
           <w:noProof/>
         </w:rPr>
-        <w:t>8</w:t>
+        <w:t>10</w:t>
       </w:r>
       <w:r>
         <w:fldChar w:fldCharType="end"/>
@@ -6334,11 +7006,11 @@
       <w:pPr>
         <w:pStyle w:val="Heading2"/>
       </w:pPr>
-      <w:bookmarkStart w:id="24" w:name="_Toc231472773"/>
+      <w:bookmarkStart w:id="27" w:name="_Toc231472773"/>
       <w:r>
         <w:t>Residuos</w:t>
       </w:r>
-      <w:bookmarkEnd w:id="24"/>
+      <w:bookmarkEnd w:id="27"/>
     </w:p>
     <w:p>
       <w:r>
@@ -6876,7 +7548,7 @@
         <w:pStyle w:val="Caption"/>
         <w:jc w:val="center"/>
       </w:pPr>
-      <w:bookmarkStart w:id="25" w:name="_Toc231472811"/>
+      <w:bookmarkStart w:id="28" w:name="_Toc231472811"/>
       <w:r>
         <w:t xml:space="preserve">Tabla </w:t>
       </w:r>
@@ -6894,7 +7566,7 @@
       <w:r>
         <w:t>Cinco mayores residuos positivos y negativos del modelo cuadrático</w:t>
       </w:r>
-      <w:bookmarkEnd w:id="25"/>
+      <w:bookmarkEnd w:id="28"/>
     </w:p>
     <w:p/>
     <w:p>
@@ -6932,7 +7604,7 @@
                     </pic:cNvPicPr>
                   </pic:nvPicPr>
                   <pic:blipFill>
-                    <a:blip r:embed="rId15"/>
+                    <a:blip r:embed="rId20"/>
                     <a:srcRect/>
                     <a:stretch>
                       <a:fillRect/>
@@ -6959,7 +7631,7 @@
         <w:pStyle w:val="Caption"/>
         <w:jc w:val="center"/>
       </w:pPr>
-      <w:bookmarkStart w:id="26" w:name="_Toc231503941"/>
+      <w:bookmarkStart w:id="29" w:name="_Toc231904782"/>
       <w:r>
         <w:t xml:space="preserve">Figura </w:t>
       </w:r>
@@ -6968,7 +7640,7 @@
           <w:rPr>
             <w:noProof/>
           </w:rPr>
-          <w:t>9</w:t>
+          <w:t>11</w:t>
         </w:r>
       </w:fldSimple>
       <w:r>
@@ -6992,7 +7664,7 @@
       <w:r>
         <w:t>y residuos de los casos más destacados.</w:t>
       </w:r>
-      <w:bookmarkEnd w:id="26"/>
+      <w:bookmarkEnd w:id="29"/>
     </w:p>
     <w:p>
       <w:pPr>
@@ -7066,11 +7738,11 @@
       <w:pPr>
         <w:pStyle w:val="Heading1"/>
       </w:pPr>
-      <w:bookmarkStart w:id="27" w:name="_Toc231472774"/>
+      <w:bookmarkStart w:id="30" w:name="_Toc231472774"/>
       <w:r>
         <w:t>Conclusiones</w:t>
       </w:r>
-      <w:bookmarkEnd w:id="27"/>
+      <w:bookmarkEnd w:id="30"/>
     </w:p>
     <w:p>
       <w:r>
@@ -7102,7 +7774,13 @@
         <w:t>Valor del plantel.</w:t>
       </w:r>
       <w:r>
-        <w:t> Existe una correlación fuerte entre el valor de mercado del plantel y el puntaje FIFA (r ≈ 0,77). Al modelar la relación, el mejor ajuste fue cuadrático y cóncavo hacia abajo, lo que indica rendimientos marginales decrecientes: invertir más en el plantel mejora el puntaje, pero cada euro adicional aporta cada vez menos.</w:t>
+        <w:t> Existe una correlación fuerte entre el valor de mercado del plantel y el puntaje FIFA (r ≈ 0,7</w:t>
+      </w:r>
+      <w:r>
+        <w:t>6</w:t>
+      </w:r>
+      <w:r>
+        <w:t>). Al modelar la relación, el mejor ajuste fue cuadrático y cóncavo hacia abajo, lo que indica rendimientos marginales decrecientes: invertir más en el plantel mejora el puntaje, pero cada euro adicional aporta cada vez menos.</w:t>
       </w:r>
     </w:p>
     <w:p>
@@ -7160,16 +7838,26 @@
     </w:p>
     <w:p>
       <w:pPr>
+        <w:spacing w:line="240" w:lineRule="auto"/>
+        <w:jc w:val="left"/>
+      </w:pPr>
+      <w:r>
+        <w:br w:type="page"/>
+      </w:r>
+    </w:p>
+    <w:p/>
+    <w:p>
+      <w:pPr>
         <w:pStyle w:val="Heading1"/>
       </w:pPr>
-      <w:bookmarkStart w:id="28" w:name="_Toc231472775"/>
+      <w:bookmarkStart w:id="31" w:name="_Toc231472775"/>
       <w:r>
         <w:t xml:space="preserve">Reflexión </w:t>
       </w:r>
       <w:r>
         <w:t>metodológica</w:t>
       </w:r>
-      <w:bookmarkEnd w:id="28"/>
+      <w:bookmarkEnd w:id="31"/>
     </w:p>
     <w:p>
       <w:r>
@@ -7199,7 +7887,6 @@
     </w:p>
     <w:p>
       <w:r>
-        <w:lastRenderedPageBreak/>
         <w:t>El principal aprendizaje metodológico fue la importancia de auditar críticamente las sugerencias automatizadas —especialmente la elección del modelo y la interpretación de sus parámetros— para asegurar que las conclusiones se sostuvieran en la evidencia de los datos y no en la fluidez del texto generado.</w:t>
       </w:r>
       <w:r>
@@ -7245,7 +7932,7 @@
           <w:numId w:val="0"/>
         </w:numPr>
       </w:pPr>
-      <w:bookmarkStart w:id="29" w:name="_Toc231472776"/>
+      <w:bookmarkStart w:id="32" w:name="_Toc231472776"/>
       <w:r>
         <w:lastRenderedPageBreak/>
         <w:t>Apéndice A</w:t>
@@ -7256,7 +7943,7 @@
       <w:r>
         <w:t>Listado completo de variables de la tabla paises.csv</w:t>
       </w:r>
-      <w:bookmarkEnd w:id="29"/>
+      <w:bookmarkEnd w:id="32"/>
     </w:p>
     <w:p>
       <w:r>
@@ -7668,7 +8355,7 @@
           <w:numId w:val="0"/>
         </w:numPr>
       </w:pPr>
-      <w:bookmarkStart w:id="30" w:name="_Toc231472777"/>
+      <w:bookmarkStart w:id="33" w:name="_Toc231472777"/>
       <w:r>
         <w:lastRenderedPageBreak/>
         <w:t>Apéndice B</w:t>
@@ -7682,7 +8369,7 @@
       <w:r>
         <w:t>country_info.csv</w:t>
       </w:r>
-      <w:bookmarkEnd w:id="30"/>
+      <w:bookmarkEnd w:id="33"/>
     </w:p>
     <w:p>
       <w:r>
@@ -7967,8 +8654,8 @@
     </w:p>
     <w:p/>
     <w:sectPr>
-      <w:headerReference w:type="default" r:id="rId16"/>
-      <w:footerReference w:type="default" r:id="rId17"/>
+      <w:headerReference w:type="default" r:id="rId21"/>
+      <w:footerReference w:type="default" r:id="rId22"/>
       <w:pgSz w:w="12240" w:h="15840"/>
       <w:pgMar w:top="1440" w:right="1440" w:bottom="1440" w:left="1440" w:header="708" w:footer="708" w:gutter="0"/>
       <w:cols w:space="720"/>
@@ -10014,7 +10701,6 @@
   <w:style w:type="character" w:default="1" w:styleId="DefaultParagraphFont">
     <w:name w:val="Default Paragraph Font"/>
     <w:uiPriority w:val="1"/>
-    <w:semiHidden/>
     <w:unhideWhenUsed/>
   </w:style>
   <w:style w:type="table" w:default="1" w:styleId="TableNormal">

</xml_diff>